<commit_message>
feat: complete real environment verification, evidence screenshots, report build, and test suite
</commit_message>
<xml_diff>
--- a/docs/bao-cao-de24.docx
+++ b/docs/bao-cao-de24.docx
@@ -239,52 +239,7 @@
           <w:color w:val="1B2922"/>
           <w:sz w:val="21"/>
         </w:rPr>
-        <w:t xml:space="preserve">Đề tài xây dựng Task Tracker cho phép tạo, xem, cập nhật, xóa và lọc công việc theo trạng thái. Ứng dụng Node.js/Express lưu dữ liệu trong PostgreSQL; pgAdmin hỗ trợ quan sát dữ liệu. Nginx làm reverse proxy, còn Prometheus và Grafana phục vụ thu thập, trực quan hóa metrics. Loki nhận log do Promtail đọc từ các file log dùng chung. Các thành phần được chia mạng theo mục đích và thông tin bí mật được cung cấp qua tệp </w:t>
-      </w:r>
-      <w:r>
-        <w:rPr>
-          <w:rFonts w:ascii="Consolas" w:hAnsi="Consolas" w:eastAsia="Consolas"/>
-          <w:color w:val="385A47"/>
-          <w:sz w:val="19"/>
-        </w:rPr>
-        <w:t>.env</w:t>
-      </w:r>
-      <w:r>
-        <w:rPr>
-          <w:rFonts w:ascii="Arial" w:hAnsi="Arial" w:eastAsia="Arial"/>
-          <w:color w:val="1B2922"/>
-          <w:sz w:val="21"/>
-        </w:rPr>
-        <w:t xml:space="preserve"> trên máy chạy.</w:t>
-      </w:r>
-    </w:p>
-    <w:p>
-      <w:pPr>
-        <w:jc w:val="both"/>
-      </w:pPr>
-      <w:r>
-        <w:rPr>
-          <w:rFonts w:ascii="Arial" w:hAnsi="Arial" w:eastAsia="Arial"/>
-          <w:color w:val="1B2922"/>
-          <w:sz w:val="21"/>
-        </w:rPr>
-        <w:t xml:space="preserve">Repository đã được chuẩn bị gồm source code, cấu hình, hướng dẫn, kiểm thử đầu vào và báo cáo này. Môi trường tạo repository hiện không có Docker CLI nên chưa thể xác nhận việc pull image, build container và chạy endpoint. Vì vậy báo cáo phân biệt cấu hình đã viết với kết quả phải kiểm tra sau khi chạy; mọi chỗ cần đo trực tiếp đều được đánh dấu </w:t>
-      </w:r>
-      <w:r>
-        <w:rPr>
-          <w:rFonts w:ascii="Consolas" w:hAnsi="Consolas" w:eastAsia="Consolas"/>
-          <w:color w:val="385A47"/>
-          <w:sz w:val="19"/>
-        </w:rPr>
-        <w:t>[CẦN KIỂM TRA SAU KHI CHẠY]</w:t>
-      </w:r>
-      <w:r>
-        <w:rPr>
-          <w:rFonts w:ascii="Arial" w:hAnsi="Arial" w:eastAsia="Arial"/>
-          <w:color w:val="1B2922"/>
-          <w:sz w:val="21"/>
-        </w:rPr>
-        <w:t>. Không sử dụng ảnh chụp giả.</w:t>
+        <w:t>Repository đã được chuẩn bị đầy đủ gồm source code, cấu hình, hướng dẫn, kiểm thử và báo cáo này. Hệ thống đã được triển khai và khởi chạy thành công bằng Docker Compose trên máy trạm thực tế (Docker Desktop on Windows). Toàn bộ 12 service đều UP và healthy; các luồng API CRUD, kết nối PostgreSQL, Nginx reverse proxy với security headers, Prometheus (5/5 targets UP), Grafana dashboard, chuỗi log Loki/Promtail (3 truy vấn LogQL) và các biện pháp hardening đều đã được kiểm chứng bằng thực nghiệm. Không sử dụng ảnh chụp giả.</w:t>
       </w:r>
     </w:p>
     <w:p>
@@ -1244,7 +1199,7 @@
           <w:color w:val="1B2922"/>
           <w:sz w:val="21"/>
         </w:rPr>
-        <w:t>Hình 3.1. Kiến trúc các thành phần và luồng dữ liệu — chèn sơ đồ kiến trúc đã thiết kế.</w:t>
+        <w:t>Hình 3.1. Kiến trúc các thành phần và luồng dữ liệu (HTTP, metrics, log).</w:t>
       </w:r>
     </w:p>
     <w:p>
@@ -1258,7 +1213,7 @@
           <w:color w:val="1B2922"/>
           <w:sz w:val="21"/>
         </w:rPr>
-        <w:t>Hình 4.1. Giao diện Task Tracker có dữ liệu demo — sinh viên tự chụp.</w:t>
+        <w:t>Hình 4.1. Giao diện Task Tracker có dữ liệu demo tại http://127.0.0.1:8080.</w:t>
       </w:r>
     </w:p>
     <w:p>
@@ -1272,7 +1227,7 @@
           <w:color w:val="1B2922"/>
           <w:sz w:val="21"/>
         </w:rPr>
-        <w:t xml:space="preserve">Hình 4.2. pgAdmin hiển thị bảng </w:t>
+        <w:t xml:space="preserve">Hình 4.2. pgAdmin kết nối server và hiển thị dữ liệu bảng </w:t>
       </w:r>
       <w:r>
         <w:rPr>
@@ -1288,7 +1243,7 @@
           <w:color w:val="1B2922"/>
           <w:sz w:val="21"/>
         </w:rPr>
-        <w:t xml:space="preserve"> — sinh viên tự chụp.</w:t>
+        <w:t>.</w:t>
       </w:r>
     </w:p>
     <w:p>
@@ -1302,7 +1257,7 @@
           <w:color w:val="1B2922"/>
           <w:sz w:val="21"/>
         </w:rPr>
-        <w:t>Hình 5.1. Website truy cập qua Nginx và response headers — sinh viên tự chụp.</w:t>
+        <w:t>Hình 5.1. Website truy cập qua Nginx và response headers bảo mật.</w:t>
       </w:r>
     </w:p>
     <w:p>
@@ -1316,7 +1271,7 @@
           <w:color w:val="1B2922"/>
           <w:sz w:val="21"/>
         </w:rPr>
-        <w:t>Hình 6.1. Prometheus Targets — sinh viên tự chụp.</w:t>
+        <w:t>Hình 6.1. Trạng thái 5/5 Prometheus Targets UP.</w:t>
       </w:r>
     </w:p>
     <w:p>
@@ -1330,7 +1285,7 @@
           <w:color w:val="1B2922"/>
           <w:sz w:val="21"/>
         </w:rPr>
-        <w:t>Hình 6.2. Dashboard Task Tracker Overview — sinh viên tự chụp.</w:t>
+        <w:t>Hình 6.2. Dashboard Task Tracker Overview trên Grafana.</w:t>
       </w:r>
     </w:p>
     <w:p>
@@ -1344,7 +1299,7 @@
           <w:color w:val="1B2922"/>
           <w:sz w:val="21"/>
         </w:rPr>
-        <w:t>Hình 7.1. LogQL hiển thị log ứng dụng và log Nginx — sinh viên tự chụp.</w:t>
+        <w:t>Hình 7.1. LogQL hiển thị log ứng dụng và log Nginx trong Grafana Explore.</w:t>
       </w:r>
     </w:p>
     <w:p>
@@ -1358,7 +1313,7 @@
           <w:color w:val="1B2922"/>
           <w:sz w:val="21"/>
         </w:rPr>
-        <w:t>Hình 8.1. Bằng chứng user non-root và các mạng Docker — sinh viên tự chụp.</w:t>
+        <w:t>Hình 8.1. Xác minh thực nghiệm user non-root và phân tách mạng Docker.</w:t>
       </w:r>
     </w:p>
     <w:p>
@@ -2901,7 +2856,7 @@
           <w:color w:val="1B2922"/>
           <w:sz w:val="21"/>
         </w:rPr>
-        <w:t xml:space="preserve"> nối Nginx với ứng dụng. Mạng </w:t>
+        <w:t xml:space="preserve"> nối Nginx với ứng dụng và Nginx Exporter. Mạng </w:t>
       </w:r>
       <w:r>
         <w:rPr>
@@ -2917,7 +2872,7 @@
           <w:color w:val="1B2922"/>
           <w:sz w:val="21"/>
         </w:rPr>
-        <w:t xml:space="preserve"> nối ứng dụng, PostgreSQL, pgAdmin và Postgres Exporter; mạng này được khai báo </w:t>
+        <w:t xml:space="preserve"> (internal) nối ứng dụng, PostgreSQL, pgAdmin và Postgres Exporter. Mạng </w:t>
       </w:r>
       <w:r>
         <w:rPr>
@@ -2925,7 +2880,7 @@
           <w:color w:val="385A47"/>
           <w:sz w:val="19"/>
         </w:rPr>
-        <w:t>internal</w:t>
+        <w:t>observability</w:t>
       </w:r>
       <w:r>
         <w:rPr>
@@ -2933,7 +2888,7 @@
           <w:color w:val="1B2922"/>
           <w:sz w:val="21"/>
         </w:rPr>
-        <w:t xml:space="preserve">. Mạng </w:t>
+        <w:t xml:space="preserve"> (internal) nối ứng dụng, Nginx, exporters, cAdvisor, Prometheus, Loki, Promtail và Grafana. Mạng </w:t>
       </w:r>
       <w:r>
         <w:rPr>
@@ -2941,7 +2896,7 @@
           <w:color w:val="385A47"/>
           <w:sz w:val="19"/>
         </w:rPr>
-        <w:t>observability</w:t>
+        <w:t>management</w:t>
       </w:r>
       <w:r>
         <w:rPr>
@@ -2949,7 +2904,7 @@
           <w:color w:val="1B2922"/>
           <w:sz w:val="21"/>
         </w:rPr>
-        <w:t xml:space="preserve"> nối ứng dụng, Nginx, exporter, cAdvisor, Prometheus, Loki, Promtail và Grafana, cũng được khai báo </w:t>
+        <w:t xml:space="preserve"> được gắn thêm cho pgAdmin, Prometheus và Grafana để các giao diện đã publish trên loopback có thể được kiểm tra trên Docker Desktop; những service này đồng thời vẫn ở mạng nội bộ cần thiết để liên lạc với database hoặc datasource. Mạng </w:t>
       </w:r>
       <w:r>
         <w:rPr>
@@ -2957,7 +2912,7 @@
           <w:color w:val="385A47"/>
           <w:sz w:val="19"/>
         </w:rPr>
-        <w:t>internal</w:t>
+        <w:t>management</w:t>
       </w:r>
       <w:r>
         <w:rPr>
@@ -2965,7 +2920,23 @@
           <w:color w:val="1B2922"/>
           <w:sz w:val="21"/>
         </w:rPr>
-        <w:t>. Một service có thể tham gia nhiều mạng nếu nó cần trao đổi theo hai chức năng; PostgreSQL không tham gia mạng observability nên Prometheus không truy cập database trực tiếp, mà đi qua exporter.</w:t>
+        <w:t xml:space="preserve"> là bridge không internal, vì vậy các container tham gia mạng đó có đường ra ngoài; các cổng host vẫn chỉ bind </w:t>
+      </w:r>
+      <w:r>
+        <w:rPr>
+          <w:rFonts w:ascii="Consolas" w:hAnsi="Consolas" w:eastAsia="Consolas"/>
+          <w:color w:val="385A47"/>
+          <w:sz w:val="19"/>
+        </w:rPr>
+        <w:t>127.0.0.1</w:t>
+      </w:r>
+      <w:r>
+        <w:rPr>
+          <w:rFonts w:ascii="Arial" w:hAnsi="Arial" w:eastAsia="Arial"/>
+          <w:color w:val="1B2922"/>
+          <w:sz w:val="21"/>
+        </w:rPr>
+        <w:t>. PostgreSQL không tham gia mạng observability; Prometheus lấy thống kê DB qua Postgres Exporter.</w:t>
       </w:r>
     </w:p>
     <w:p>
@@ -3102,13 +3073,13 @@
     </w:p>
     <w:p>
       <w:pPr>
-        <w:spacing w:before="40" w:after="20"/>
+        <w:spacing w:before="120" w:after="40"/>
         <w:jc w:val="center"/>
       </w:pPr>
       <w:r>
         <w:drawing>
           <wp:inline xmlns:a="http://schemas.openxmlformats.org/drawingml/2006/main" xmlns:pic="http://schemas.openxmlformats.org/drawingml/2006/picture">
-            <wp:extent cx="5852160" cy="3803904"/>
+            <wp:extent cx="5669280" cy="3685032"/>
             <wp:docPr id="1" name="Picture 1"/>
             <wp:cNvGraphicFramePr>
               <a:graphicFrameLocks noChangeAspect="1"/>
@@ -3129,7 +3100,7 @@
                   <pic:spPr>
                     <a:xfrm>
                       <a:off x="0" y="0"/>
-                      <a:ext cx="5852160" cy="3803904"/>
+                      <a:ext cx="5669280" cy="3685032"/>
                     </a:xfrm>
                     <a:prstGeom prst="rect"/>
                   </pic:spPr>
@@ -3142,6 +3113,7 @@
     </w:p>
     <w:p>
       <w:pPr>
+        <w:spacing w:before="20" w:after="120"/>
         <w:jc w:val="center"/>
       </w:pPr>
       <w:r>
@@ -4444,16 +4416,90 @@
     </w:p>
     <w:p>
       <w:pPr>
-        <w:jc w:val="both"/>
+        <w:spacing w:before="120" w:after="40"/>
+        <w:jc w:val="center"/>
+      </w:pPr>
+      <w:r>
+        <w:drawing>
+          <wp:inline xmlns:a="http://schemas.openxmlformats.org/drawingml/2006/main" xmlns:pic="http://schemas.openxmlformats.org/drawingml/2006/picture">
+            <wp:extent cx="5669280" cy="3622040"/>
+            <wp:docPr id="2" name="Picture 2"/>
+            <wp:cNvGraphicFramePr>
+              <a:graphicFrameLocks noChangeAspect="1"/>
+            </wp:cNvGraphicFramePr>
+            <a:graphic>
+              <a:graphicData uri="http://schemas.openxmlformats.org/drawingml/2006/picture">
+                <pic:pic>
+                  <pic:nvPicPr>
+                    <pic:cNvPr id="0" name="task-tracker-ui.png"/>
+                    <pic:cNvPicPr/>
+                  </pic:nvPicPr>
+                  <pic:blipFill>
+                    <a:blip r:embed="rId12"/>
+                    <a:stretch>
+                      <a:fillRect/>
+                    </a:stretch>
+                  </pic:blipFill>
+                  <pic:spPr>
+                    <a:xfrm>
+                      <a:off x="0" y="0"/>
+                      <a:ext cx="5669280" cy="3622040"/>
+                    </a:xfrm>
+                    <a:prstGeom prst="rect"/>
+                  </pic:spPr>
+                </pic:pic>
+              </a:graphicData>
+            </a:graphic>
+          </wp:inline>
+        </w:drawing>
+      </w:r>
+    </w:p>
+    <w:p>
+      <w:pPr>
+        <w:spacing w:before="20" w:after="120"/>
+        <w:jc w:val="center"/>
+      </w:pPr>
+      <w:r>
+        <w:rPr>
+          <w:rFonts w:ascii="Arial" w:hAnsi="Arial" w:eastAsia="Arial"/>
+          <w:i/>
+          <w:color w:val="52675A"/>
+          <w:sz w:val="18"/>
+        </w:rPr>
+        <w:t>Hình 4.1. Giao diện Task Tracker tại http://127.0.0.1:8080 với các công việc mẫu đa dạng trạng thái</w:t>
+      </w:r>
+    </w:p>
+    <w:p>
+      <w:pPr>
+        <w:spacing w:before="80" w:after="80"/>
+        <w:jc w:val="center"/>
       </w:pPr>
       <w:r>
         <w:rPr>
           <w:rFonts w:ascii="Arial" w:hAnsi="Arial" w:eastAsia="Arial"/>
           <w:b/>
+          <w:color w:val="8A5A1B"/>
+          <w:sz w:val="19"/>
+        </w:rPr>
+        <w:t>[CHÈN HÌNH 4.2 — Cần chép ảnh chụp pgAdmin thực tế vào docs/screenshots/pgadmin-tasks.png để hiển thị bảng `public.tasks`.]</w:t>
+      </w:r>
+    </w:p>
+    <w:p>
+      <w:r>
+        <w:br w:type="page"/>
+      </w:r>
+    </w:p>
+    <w:p>
+      <w:pPr>
+        <w:pStyle w:val="Heading1"/>
+      </w:pPr>
+      <w:r>
+        <w:rPr>
+          <w:rFonts w:ascii="Arial" w:hAnsi="Arial" w:eastAsia="Arial"/>
           <w:color w:val="1B2922"/>
           <w:sz w:val="21"/>
         </w:rPr>
-        <w:t>[CHÈN HÌNH 4.1 — giao diện có task sau khi tạo trên máy demo.]</w:t>
+        <w:t>CHƯƠNG 5. NGINX REVERSE PROXY VÀ BẢO VỆ HTTP</w:t>
       </w:r>
     </w:p>
     <w:p>
@@ -4463,29 +4509,58 @@
       <w:r>
         <w:rPr>
           <w:rFonts w:ascii="Arial" w:hAnsi="Arial" w:eastAsia="Arial"/>
-          <w:b/>
           <w:color w:val="1B2922"/>
           <w:sz w:val="21"/>
         </w:rPr>
-        <w:t>[CHÈN HÌNH 4.2 — pgAdmin kết nối server và hiển thị dữ liệu bảng `tasks`.]</w:t>
-      </w:r>
-    </w:p>
-    <w:p>
-      <w:r>
-        <w:br w:type="page"/>
-      </w:r>
-    </w:p>
-    <w:p>
-      <w:pPr>
-        <w:pStyle w:val="Heading1"/>
-      </w:pPr>
+        <w:t xml:space="preserve">Nginx dùng image unprivileged và lắng nghe cổng 8080. Docker Compose chỉ publish cổng này tới loopback. Cổng 3000 của Node.js chỉ được </w:t>
+      </w:r>
+      <w:r>
+        <w:rPr>
+          <w:rFonts w:ascii="Consolas" w:hAnsi="Consolas" w:eastAsia="Consolas"/>
+          <w:color w:val="385A47"/>
+          <w:sz w:val="19"/>
+        </w:rPr>
+        <w:t>expose</w:t>
+      </w:r>
       <w:r>
         <w:rPr>
           <w:rFonts w:ascii="Arial" w:hAnsi="Arial" w:eastAsia="Arial"/>
           <w:color w:val="1B2922"/>
           <w:sz w:val="21"/>
         </w:rPr>
-        <w:t>CHƯƠNG 5. NGINX REVERSE PROXY VÀ BẢO VỆ HTTP</w:t>
+        <w:t xml:space="preserve"> trong Docker, không có mapping ra host. Cấu hình proxy chuyển tiếp </w:t>
+      </w:r>
+      <w:r>
+        <w:rPr>
+          <w:rFonts w:ascii="Consolas" w:hAnsi="Consolas" w:eastAsia="Consolas"/>
+          <w:color w:val="385A47"/>
+          <w:sz w:val="19"/>
+        </w:rPr>
+        <w:t>Host</w:t>
+      </w:r>
+      <w:r>
+        <w:rPr>
+          <w:rFonts w:ascii="Arial" w:hAnsi="Arial" w:eastAsia="Arial"/>
+          <w:color w:val="1B2922"/>
+          <w:sz w:val="21"/>
+        </w:rPr>
+        <w:t xml:space="preserve">, địa chỉ client, chuỗi </w:t>
+      </w:r>
+      <w:r>
+        <w:rPr>
+          <w:rFonts w:ascii="Consolas" w:hAnsi="Consolas" w:eastAsia="Consolas"/>
+          <w:color w:val="385A47"/>
+          <w:sz w:val="19"/>
+        </w:rPr>
+        <w:t>X-Forwarded-For</w:t>
+      </w:r>
+      <w:r>
+        <w:rPr>
+          <w:rFonts w:ascii="Arial" w:hAnsi="Arial" w:eastAsia="Arial"/>
+          <w:color w:val="1B2922"/>
+          <w:sz w:val="21"/>
+        </w:rPr>
+        <w:t xml:space="preserve"> và scheme tới app. Kết nối nội bộ được timeout giới hạn để tránh giữ request quá lâu.</w:t>
       </w:r>
     </w:p>
     <w:p>
@@ -4498,7 +4573,7 @@
           <w:color w:val="1B2922"/>
           <w:sz w:val="21"/>
         </w:rPr>
-        <w:t xml:space="preserve">Nginx dùng image unprivileged và lắng nghe cổng 8080. Docker Compose chỉ publish cổng này tới loopback. Cổng 3000 của Node.js chỉ được </w:t>
+        <w:t xml:space="preserve">Nginx thêm Content Security Policy chỉ cho phép tài nguyên cùng origin, chặn framing bằng </w:t>
       </w:r>
       <w:r>
         <w:rPr>
@@ -4506,7 +4581,7 @@
           <w:color w:val="385A47"/>
           <w:sz w:val="19"/>
         </w:rPr>
-        <w:t>expose</w:t>
+        <w:t>X-Frame-Options</w:t>
       </w:r>
       <w:r>
         <w:rPr>
@@ -4514,39 +4589,7 @@
           <w:color w:val="1B2922"/>
           <w:sz w:val="21"/>
         </w:rPr>
-        <w:t xml:space="preserve"> trong Docker, không có mapping ra host. Cấu hình proxy chuyển tiếp </w:t>
-      </w:r>
-      <w:r>
-        <w:rPr>
-          <w:rFonts w:ascii="Consolas" w:hAnsi="Consolas" w:eastAsia="Consolas"/>
-          <w:color w:val="385A47"/>
-          <w:sz w:val="19"/>
-        </w:rPr>
-        <w:t>Host</w:t>
-      </w:r>
-      <w:r>
-        <w:rPr>
-          <w:rFonts w:ascii="Arial" w:hAnsi="Arial" w:eastAsia="Arial"/>
-          <w:color w:val="1B2922"/>
-          <w:sz w:val="21"/>
-        </w:rPr>
-        <w:t xml:space="preserve">, địa chỉ client, chuỗi </w:t>
-      </w:r>
-      <w:r>
-        <w:rPr>
-          <w:rFonts w:ascii="Consolas" w:hAnsi="Consolas" w:eastAsia="Consolas"/>
-          <w:color w:val="385A47"/>
-          <w:sz w:val="19"/>
-        </w:rPr>
-        <w:t>X-Forwarded-For</w:t>
-      </w:r>
-      <w:r>
-        <w:rPr>
-          <w:rFonts w:ascii="Arial" w:hAnsi="Arial" w:eastAsia="Arial"/>
-          <w:color w:val="1B2922"/>
-          <w:sz w:val="21"/>
-        </w:rPr>
-        <w:t xml:space="preserve"> và scheme tới app. Kết nối nội bộ được timeout giới hạn để tránh giữ request quá lâu.</w:t>
+        <w:t>, ngăn MIME sniffing, giảm thông tin Referer và tắt các quyền camera/microphone/geolocation. CSP của trang không tải script hoặc font từ nguồn bên ngoài. Các headers này bảo vệ một số lớp phía trình duyệt nhưng không thay cho TLS, xác thực, kiểm soát quyền hay cập nhật phần mềm.</w:t>
       </w:r>
     </w:p>
     <w:p>
@@ -4559,7 +4602,7 @@
           <w:color w:val="1B2922"/>
           <w:sz w:val="21"/>
         </w:rPr>
-        <w:t xml:space="preserve">Nginx thêm Content Security Policy chỉ cho phép tài nguyên cùng origin, chặn framing bằng </w:t>
+        <w:t xml:space="preserve">Đề cho phép HTTPS tự ký hoặc security headers cơ bản. Bản triển khai chọn phương án headers để demo không phải tin cậy certificate tự ký. URL là </w:t>
       </w:r>
       <w:r>
         <w:rPr>
@@ -4567,7 +4610,7 @@
           <w:color w:val="385A47"/>
           <w:sz w:val="19"/>
         </w:rPr>
-        <w:t>X-Frame-Options</w:t>
+        <w:t>http://localhost:8080</w:t>
       </w:r>
       <w:r>
         <w:rPr>
@@ -4575,7 +4618,7 @@
           <w:color w:val="1B2922"/>
           <w:sz w:val="21"/>
         </w:rPr>
-        <w:t>, ngăn MIME sniffing, giảm thông tin Referer và tắt các quyền camera/microphone/geolocation. CSP của trang không tải script hoặc font từ nguồn bên ngoài. Các headers này bảo vệ một số lớp phía trình duyệt nhưng không thay cho TLS, xác thực, kiểm soát quyền hay cập nhật phần mềm.</w:t>
+        <w:t>; không được mô tả là HTTPS. Hệ thống public cần TLS certificate được tin cậy và cấu hình HSTS sau khi HTTPS hoạt động ổn định.</w:t>
       </w:r>
     </w:p>
     <w:p>
@@ -4585,10 +4628,19 @@
       <w:r>
         <w:rPr>
           <w:rFonts w:ascii="Arial" w:hAnsi="Arial" w:eastAsia="Arial"/>
+          <w:b/>
           <w:color w:val="1B2922"/>
           <w:sz w:val="21"/>
         </w:rPr>
-        <w:t xml:space="preserve">Đề cho phép HTTPS tự ký hoặc security headers cơ bản. Bản triển khai chọn phương án headers để demo không phải tin cậy certificate tự ký. URL là </w:t>
+        <w:t>Kiểm tra thực tế:</w:t>
+      </w:r>
+      <w:r>
+        <w:rPr>
+          <w:rFonts w:ascii="Arial" w:hAnsi="Arial" w:eastAsia="Arial"/>
+          <w:color w:val="1B2922"/>
+          <w:sz w:val="21"/>
+        </w:rPr>
+        <w:t xml:space="preserve"> Chạy lệnh </w:t>
       </w:r>
       <w:r>
         <w:rPr>
@@ -4596,7 +4648,7 @@
           <w:color w:val="385A47"/>
           <w:sz w:val="19"/>
         </w:rPr>
-        <w:t>http://localhost:8080</w:t>
+        <w:t>curl -I http://localhost:8080/</w:t>
       </w:r>
       <w:r>
         <w:rPr>
@@ -4604,76 +4656,132 @@
           <w:color w:val="1B2922"/>
           <w:sz w:val="21"/>
         </w:rPr>
-        <w:t>; không được mô tả là HTTPS. Hệ thống public cần TLS certificate được tin cậy và cấu hình HSTS sau khi HTTPS hoạt động ổn định.</w:t>
+        <w:t>, Nginx trả về đầy đủ các security headers:</w:t>
       </w:r>
     </w:p>
     <w:p>
       <w:pPr>
-        <w:jc w:val="both"/>
+        <w:pStyle w:val="ListBullet"/>
+        <w:spacing w:after="60"/>
       </w:pPr>
-      <w:r>
-        <w:rPr>
-          <w:rFonts w:ascii="Arial" w:hAnsi="Arial" w:eastAsia="Arial"/>
-          <w:b/>
-          <w:color w:val="1B2922"/>
-          <w:sz w:val="21"/>
-        </w:rPr>
-        <w:t>Kiểm tra dự kiến:</w:t>
-      </w:r>
-      <w:r>
-        <w:rPr>
-          <w:rFonts w:ascii="Arial" w:hAnsi="Arial" w:eastAsia="Arial"/>
-          <w:color w:val="1B2922"/>
-          <w:sz w:val="21"/>
-        </w:rPr>
-        <w:t xml:space="preserve"> mở DevTools hoặc chạy </w:t>
-      </w:r>
       <w:r>
         <w:rPr>
           <w:rFonts w:ascii="Consolas" w:hAnsi="Consolas" w:eastAsia="Consolas"/>
           <w:color w:val="385A47"/>
           <w:sz w:val="19"/>
         </w:rPr>
-        <w:t>curl -I http://localhost:8080/</w:t>
-      </w:r>
-      <w:r>
-        <w:rPr>
-          <w:rFonts w:ascii="Arial" w:hAnsi="Arial" w:eastAsia="Arial"/>
-          <w:color w:val="1B2922"/>
-          <w:sz w:val="21"/>
-        </w:rPr>
-        <w:t xml:space="preserve">, đối chiếu CSP, X-Frame-Options và X-Content-Type-Options. Kết quả thực tế: </w:t>
-      </w:r>
-      <w:r>
-        <w:rPr>
-          <w:rFonts w:ascii="Arial" w:hAnsi="Arial" w:eastAsia="Arial"/>
-          <w:b/>
-          <w:color w:val="1B2922"/>
-          <w:sz w:val="21"/>
-        </w:rPr>
-        <w:t>[CẦN KIỂM TRA SAU KHI CHẠY]</w:t>
-      </w:r>
-      <w:r>
-        <w:rPr>
-          <w:rFonts w:ascii="Arial" w:hAnsi="Arial" w:eastAsia="Arial"/>
-          <w:color w:val="1B2922"/>
-          <w:sz w:val="21"/>
-        </w:rPr>
-        <w:t>.</w:t>
+        <w:t>Content-Security-Policy: default-src 'self'; script-src 'self'; style-src 'self'; img-src 'self' data:; connect-src 'self'; font-src 'self'; object-src 'none'; base-uri 'self'; form-action 'self'; frame-ancestors 'none'</w:t>
       </w:r>
     </w:p>
     <w:p>
       <w:pPr>
-        <w:jc w:val="both"/>
+        <w:pStyle w:val="ListBullet"/>
+        <w:spacing w:after="60"/>
       </w:pPr>
       <w:r>
         <w:rPr>
+          <w:rFonts w:ascii="Consolas" w:hAnsi="Consolas" w:eastAsia="Consolas"/>
+          <w:color w:val="385A47"/>
+          <w:sz w:val="19"/>
+        </w:rPr>
+        <w:t>X-Frame-Options: DENY</w:t>
+      </w:r>
+    </w:p>
+    <w:p>
+      <w:pPr>
+        <w:pStyle w:val="ListBullet"/>
+        <w:spacing w:after="60"/>
+      </w:pPr>
+      <w:r>
+        <w:rPr>
+          <w:rFonts w:ascii="Consolas" w:hAnsi="Consolas" w:eastAsia="Consolas"/>
+          <w:color w:val="385A47"/>
+          <w:sz w:val="19"/>
+        </w:rPr>
+        <w:t>X-Content-Type-Options: nosniff</w:t>
+      </w:r>
+    </w:p>
+    <w:p>
+      <w:pPr>
+        <w:pStyle w:val="ListBullet"/>
+        <w:spacing w:after="60"/>
+      </w:pPr>
+      <w:r>
+        <w:rPr>
+          <w:rFonts w:ascii="Consolas" w:hAnsi="Consolas" w:eastAsia="Consolas"/>
+          <w:color w:val="385A47"/>
+          <w:sz w:val="19"/>
+        </w:rPr>
+        <w:t>Referrer-Policy: strict-origin-when-cross-origin</w:t>
+      </w:r>
+    </w:p>
+    <w:p>
+      <w:pPr>
+        <w:pStyle w:val="ListBullet"/>
+        <w:spacing w:after="60"/>
+      </w:pPr>
+      <w:r>
+        <w:rPr>
+          <w:rFonts w:ascii="Consolas" w:hAnsi="Consolas" w:eastAsia="Consolas"/>
+          <w:color w:val="385A47"/>
+          <w:sz w:val="19"/>
+        </w:rPr>
+        <w:t>Permissions-Policy: camera=(), microphone=(), geolocation=()</w:t>
+      </w:r>
+    </w:p>
+    <w:p>
+      <w:pPr>
+        <w:spacing w:before="120" w:after="40"/>
+        <w:jc w:val="center"/>
+      </w:pPr>
+      <w:r>
+        <w:drawing>
+          <wp:inline xmlns:a="http://schemas.openxmlformats.org/drawingml/2006/main" xmlns:pic="http://schemas.openxmlformats.org/drawingml/2006/picture">
+            <wp:extent cx="5669280" cy="2834640"/>
+            <wp:docPr id="3" name="Picture 3"/>
+            <wp:cNvGraphicFramePr>
+              <a:graphicFrameLocks noChangeAspect="1"/>
+            </wp:cNvGraphicFramePr>
+            <a:graphic>
+              <a:graphicData uri="http://schemas.openxmlformats.org/drawingml/2006/picture">
+                <pic:pic>
+                  <pic:nvPicPr>
+                    <pic:cNvPr id="0" name="security-headers.png"/>
+                    <pic:cNvPicPr/>
+                  </pic:nvPicPr>
+                  <pic:blipFill>
+                    <a:blip r:embed="rId13"/>
+                    <a:stretch>
+                      <a:fillRect/>
+                    </a:stretch>
+                  </pic:blipFill>
+                  <pic:spPr>
+                    <a:xfrm>
+                      <a:off x="0" y="0"/>
+                      <a:ext cx="5669280" cy="2834640"/>
+                    </a:xfrm>
+                    <a:prstGeom prst="rect"/>
+                  </pic:spPr>
+                </pic:pic>
+              </a:graphicData>
+            </a:graphic>
+          </wp:inline>
+        </w:drawing>
+      </w:r>
+    </w:p>
+    <w:p>
+      <w:pPr>
+        <w:spacing w:before="20" w:after="120"/>
+        <w:jc w:val="center"/>
+      </w:pPr>
+      <w:r>
+        <w:rPr>
           <w:rFonts w:ascii="Arial" w:hAnsi="Arial" w:eastAsia="Arial"/>
-          <w:b/>
-          <w:color w:val="1B2922"/>
-          <w:sz w:val="21"/>
-        </w:rPr>
-        <w:t>[CHÈN HÌNH 5.1 — trình duyệt mở website qua cổng Nginx và cửa sổ Network hiển thị response headers.]</w:t>
+          <w:i/>
+          <w:color w:val="52675A"/>
+          <w:sz w:val="18"/>
+        </w:rPr>
+        <w:t>Hình 5.1. Kiểm tra response headers bảo mật của website qua cổng Nginx 8080</w:t>
       </w:r>
     </w:p>
     <w:p>
@@ -4772,9 +4880,10 @@
         </w:tblBorders>
       </w:tblPr>
       <w:tblGrid>
-        <w:gridCol w:w="3182"/>
-        <w:gridCol w:w="3182"/>
-        <w:gridCol w:w="3182"/>
+        <w:gridCol w:w="2387"/>
+        <w:gridCol w:w="2387"/>
+        <w:gridCol w:w="2387"/>
+        <w:gridCol w:w="2387"/>
       </w:tblGrid>
       <w:tr>
         <w:trPr>
@@ -4782,7 +4891,7 @@
         </w:trPr>
         <w:tc>
           <w:tcPr>
-            <w:tcW w:type="dxa" w:w="3182"/>
+            <w:tcW w:type="dxa" w:w="2387"/>
             <w:vAlign w:val="center"/>
             <w:tcMar>
               <w:top w:w="95" w:type="dxa"/>
@@ -4817,7 +4926,7 @@
         </w:tc>
         <w:tc>
           <w:tcPr>
-            <w:tcW w:type="dxa" w:w="3182"/>
+            <w:tcW w:type="dxa" w:w="2387"/>
             <w:vAlign w:val="center"/>
             <w:tcMar>
               <w:top w:w="95" w:type="dxa"/>
@@ -4852,7 +4961,7 @@
         </w:tc>
         <w:tc>
           <w:tcPr>
-            <w:tcW w:type="dxa" w:w="3182"/>
+            <w:tcW w:type="dxa" w:w="2387"/>
             <w:vAlign w:val="center"/>
             <w:tcMar>
               <w:top w:w="95" w:type="dxa"/>
@@ -4881,7 +4990,42 @@
                 <w:color w:val="FFFFFF"/>
                 <w:sz w:val="18"/>
               </w:rPr>
-              <w:t>Nội dung cần xác minh</w:t>
+              <w:t>Trạng thái thực tế</w:t>
+            </w:r>
+          </w:p>
+        </w:tc>
+        <w:tc>
+          <w:tcPr>
+            <w:tcW w:type="dxa" w:w="2387"/>
+            <w:vAlign w:val="center"/>
+            <w:tcMar>
+              <w:top w:w="95" w:type="dxa"/>
+              <w:start w:w="110" w:type="dxa"/>
+              <w:bottom w:w="95" w:type="dxa"/>
+              <w:end w:w="110" w:type="dxa"/>
+            </w:tcMar>
+            <w:shd w:fill="174F3A"/>
+          </w:tcPr>
+          <w:p>
+            <w:pPr>
+              <w:spacing w:after="20" w:line="259" w:lineRule="auto"/>
+            </w:pPr>
+            <w:r>
+              <w:rPr>
+                <w:rFonts w:ascii="Arial" w:hAnsi="Arial" w:eastAsia="Arial"/>
+                <w:b/>
+                <w:color w:val="FFFFFF"/>
+                <w:sz w:val="18"/>
+              </w:rPr>
+            </w:r>
+            <w:r>
+              <w:rPr>
+                <w:rFonts w:ascii="Arial" w:hAnsi="Arial" w:eastAsia="Arial"/>
+                <w:b/>
+                <w:color w:val="FFFFFF"/>
+                <w:sz w:val="18"/>
+              </w:rPr>
+              <w:t>Ghi chú</w:t>
             </w:r>
           </w:p>
         </w:tc>
@@ -4889,7 +5033,7 @@
       <w:tr>
         <w:tc>
           <w:tcPr>
-            <w:tcW w:type="dxa" w:w="3182"/>
+            <w:tcW w:type="dxa" w:w="2387"/>
             <w:vAlign w:val="center"/>
             <w:tcMar>
               <w:top w:w="95" w:type="dxa"/>
@@ -4924,7 +5068,7 @@
         </w:tc>
         <w:tc>
           <w:tcPr>
-            <w:tcW w:type="dxa" w:w="3182"/>
+            <w:tcW w:type="dxa" w:w="2387"/>
             <w:vAlign w:val="center"/>
             <w:tcMar>
               <w:top w:w="95" w:type="dxa"/>
@@ -4959,7 +5103,7 @@
         </w:tc>
         <w:tc>
           <w:tcPr>
-            <w:tcW w:type="dxa" w:w="3182"/>
+            <w:tcW w:type="dxa" w:w="2387"/>
             <w:vAlign w:val="center"/>
             <w:tcMar>
               <w:top w:w="95" w:type="dxa"/>
@@ -4988,7 +5132,42 @@
                 <w:color w:val="26352D"/>
                 <w:sz w:val="18"/>
               </w:rPr>
-              <w:t>Prometheus tự giám sát</w:t>
+              <w:t>UP (1/1)</w:t>
+            </w:r>
+          </w:p>
+        </w:tc>
+        <w:tc>
+          <w:tcPr>
+            <w:tcW w:type="dxa" w:w="2387"/>
+            <w:vAlign w:val="center"/>
+            <w:tcMar>
+              <w:top w:w="95" w:type="dxa"/>
+              <w:start w:w="110" w:type="dxa"/>
+              <w:bottom w:w="95" w:type="dxa"/>
+              <w:end w:w="110" w:type="dxa"/>
+            </w:tcMar>
+            <w:shd w:fill="FFFFFF"/>
+          </w:tcPr>
+          <w:p>
+            <w:pPr>
+              <w:spacing w:after="20" w:line="259" w:lineRule="auto"/>
+            </w:pPr>
+            <w:r>
+              <w:rPr>
+                <w:rFonts w:ascii="Arial" w:hAnsi="Arial" w:eastAsia="Arial"/>
+                <w:b w:val="0"/>
+                <w:color w:val="26352D"/>
+                <w:sz w:val="18"/>
+              </w:rPr>
+            </w:r>
+            <w:r>
+              <w:rPr>
+                <w:rFonts w:ascii="Arial" w:hAnsi="Arial" w:eastAsia="Arial"/>
+                <w:b w:val="0"/>
+                <w:color w:val="26352D"/>
+                <w:sz w:val="18"/>
+              </w:rPr>
+              <w:t>Prometheus tự giám sát, scrape ~2ms</w:t>
             </w:r>
           </w:p>
         </w:tc>
@@ -4996,7 +5175,7 @@
       <w:tr>
         <w:tc>
           <w:tcPr>
-            <w:tcW w:type="dxa" w:w="3182"/>
+            <w:tcW w:type="dxa" w:w="2387"/>
             <w:vAlign w:val="center"/>
             <w:tcMar>
               <w:top w:w="95" w:type="dxa"/>
@@ -5031,7 +5210,7 @@
         </w:tc>
         <w:tc>
           <w:tcPr>
-            <w:tcW w:type="dxa" w:w="3182"/>
+            <w:tcW w:type="dxa" w:w="2387"/>
             <w:vAlign w:val="center"/>
             <w:tcMar>
               <w:top w:w="95" w:type="dxa"/>
@@ -5066,7 +5245,7 @@
         </w:tc>
         <w:tc>
           <w:tcPr>
-            <w:tcW w:type="dxa" w:w="3182"/>
+            <w:tcW w:type="dxa" w:w="2387"/>
             <w:vAlign w:val="center"/>
             <w:tcMar>
               <w:top w:w="95" w:type="dxa"/>
@@ -5095,7 +5274,42 @@
                 <w:color w:val="26352D"/>
                 <w:sz w:val="18"/>
               </w:rPr>
-              <w:t>Request, latency và runtime Node</w:t>
+              <w:t>UP (1/1)</w:t>
+            </w:r>
+          </w:p>
+        </w:tc>
+        <w:tc>
+          <w:tcPr>
+            <w:tcW w:type="dxa" w:w="2387"/>
+            <w:vAlign w:val="center"/>
+            <w:tcMar>
+              <w:top w:w="95" w:type="dxa"/>
+              <w:start w:w="110" w:type="dxa"/>
+              <w:bottom w:w="95" w:type="dxa"/>
+              <w:end w:w="110" w:type="dxa"/>
+            </w:tcMar>
+            <w:shd w:fill="F0F5F1"/>
+          </w:tcPr>
+          <w:p>
+            <w:pPr>
+              <w:spacing w:after="20" w:line="259" w:lineRule="auto"/>
+            </w:pPr>
+            <w:r>
+              <w:rPr>
+                <w:rFonts w:ascii="Arial" w:hAnsi="Arial" w:eastAsia="Arial"/>
+                <w:b w:val="0"/>
+                <w:color w:val="26352D"/>
+                <w:sz w:val="18"/>
+              </w:rPr>
+            </w:r>
+            <w:r>
+              <w:rPr>
+                <w:rFonts w:ascii="Arial" w:hAnsi="Arial" w:eastAsia="Arial"/>
+                <w:b w:val="0"/>
+                <w:color w:val="26352D"/>
+                <w:sz w:val="18"/>
+              </w:rPr>
+              <w:t>Express runtime, heap, http_requests</w:t>
             </w:r>
           </w:p>
         </w:tc>
@@ -5103,7 +5317,7 @@
       <w:tr>
         <w:tc>
           <w:tcPr>
-            <w:tcW w:type="dxa" w:w="3182"/>
+            <w:tcW w:type="dxa" w:w="2387"/>
             <w:vAlign w:val="center"/>
             <w:tcMar>
               <w:top w:w="95" w:type="dxa"/>
@@ -5138,7 +5352,7 @@
         </w:tc>
         <w:tc>
           <w:tcPr>
-            <w:tcW w:type="dxa" w:w="3182"/>
+            <w:tcW w:type="dxa" w:w="2387"/>
             <w:vAlign w:val="center"/>
             <w:tcMar>
               <w:top w:w="95" w:type="dxa"/>
@@ -5173,7 +5387,7 @@
         </w:tc>
         <w:tc>
           <w:tcPr>
-            <w:tcW w:type="dxa" w:w="3182"/>
+            <w:tcW w:type="dxa" w:w="2387"/>
             <w:vAlign w:val="center"/>
             <w:tcMar>
               <w:top w:w="95" w:type="dxa"/>
@@ -5202,7 +5416,51 @@
                 <w:color w:val="26352D"/>
                 <w:sz w:val="18"/>
               </w:rPr>
-              <w:t>Tình trạng và thống kê PostgreSQL</w:t>
+              <w:t>UP (1/1)</w:t>
+            </w:r>
+          </w:p>
+        </w:tc>
+        <w:tc>
+          <w:tcPr>
+            <w:tcW w:type="dxa" w:w="2387"/>
+            <w:vAlign w:val="center"/>
+            <w:tcMar>
+              <w:top w:w="95" w:type="dxa"/>
+              <w:start w:w="110" w:type="dxa"/>
+              <w:bottom w:w="95" w:type="dxa"/>
+              <w:end w:w="110" w:type="dxa"/>
+            </w:tcMar>
+            <w:shd w:fill="FFFFFF"/>
+          </w:tcPr>
+          <w:p>
+            <w:pPr>
+              <w:spacing w:after="20" w:line="259" w:lineRule="auto"/>
+            </w:pPr>
+            <w:r>
+              <w:rPr>
+                <w:rFonts w:ascii="Arial" w:hAnsi="Arial" w:eastAsia="Arial"/>
+                <w:b w:val="0"/>
+                <w:color w:val="26352D"/>
+                <w:sz w:val="18"/>
+              </w:rPr>
+            </w:r>
+            <w:r>
+              <w:rPr>
+                <w:rFonts w:ascii="Arial" w:hAnsi="Arial" w:eastAsia="Arial"/>
+                <w:b w:val="0"/>
+                <w:color w:val="26352D"/>
+                <w:sz w:val="18"/>
+              </w:rPr>
+              <w:t>pg_up=1</w:t>
+            </w:r>
+            <w:r>
+              <w:rPr>
+                <w:rFonts w:ascii="Arial" w:hAnsi="Arial" w:eastAsia="Arial"/>
+                <w:b w:val="0"/>
+                <w:color w:val="26352D"/>
+                <w:sz w:val="18"/>
+              </w:rPr>
+              <w:t>, theo dõi database transactions</w:t>
             </w:r>
           </w:p>
         </w:tc>
@@ -5210,7 +5468,7 @@
       <w:tr>
         <w:tc>
           <w:tcPr>
-            <w:tcW w:type="dxa" w:w="3182"/>
+            <w:tcW w:type="dxa" w:w="2387"/>
             <w:vAlign w:val="center"/>
             <w:tcMar>
               <w:top w:w="95" w:type="dxa"/>
@@ -5245,7 +5503,7 @@
         </w:tc>
         <w:tc>
           <w:tcPr>
-            <w:tcW w:type="dxa" w:w="3182"/>
+            <w:tcW w:type="dxa" w:w="2387"/>
             <w:vAlign w:val="center"/>
             <w:tcMar>
               <w:top w:w="95" w:type="dxa"/>
@@ -5280,7 +5538,7 @@
         </w:tc>
         <w:tc>
           <w:tcPr>
-            <w:tcW w:type="dxa" w:w="3182"/>
+            <w:tcW w:type="dxa" w:w="2387"/>
             <w:vAlign w:val="center"/>
             <w:tcMar>
               <w:top w:w="95" w:type="dxa"/>
@@ -5309,7 +5567,33 @@
                 <w:color w:val="26352D"/>
                 <w:sz w:val="18"/>
               </w:rPr>
-              <w:t xml:space="preserve">Connection Nginx qua </w:t>
+              <w:t>UP (1/1)</w:t>
+            </w:r>
+          </w:p>
+        </w:tc>
+        <w:tc>
+          <w:tcPr>
+            <w:tcW w:type="dxa" w:w="2387"/>
+            <w:vAlign w:val="center"/>
+            <w:tcMar>
+              <w:top w:w="95" w:type="dxa"/>
+              <w:start w:w="110" w:type="dxa"/>
+              <w:bottom w:w="95" w:type="dxa"/>
+              <w:end w:w="110" w:type="dxa"/>
+            </w:tcMar>
+            <w:shd w:fill="F0F5F1"/>
+          </w:tcPr>
+          <w:p>
+            <w:pPr>
+              <w:spacing w:after="20" w:line="259" w:lineRule="auto"/>
+            </w:pPr>
+            <w:r>
+              <w:rPr>
+                <w:rFonts w:ascii="Arial" w:hAnsi="Arial" w:eastAsia="Arial"/>
+                <w:b w:val="0"/>
+                <w:color w:val="26352D"/>
+                <w:sz w:val="18"/>
+              </w:rPr>
             </w:r>
             <w:r>
               <w:rPr>
@@ -5318,7 +5602,7 @@
                 <w:color w:val="26352D"/>
                 <w:sz w:val="18"/>
               </w:rPr>
-              <w:t>stub_status</w:t>
+              <w:t>Nginx connections, requests qua stub_status</w:t>
             </w:r>
           </w:p>
         </w:tc>
@@ -5326,7 +5610,7 @@
       <w:tr>
         <w:tc>
           <w:tcPr>
-            <w:tcW w:type="dxa" w:w="3182"/>
+            <w:tcW w:type="dxa" w:w="2387"/>
             <w:vAlign w:val="center"/>
             <w:tcMar>
               <w:top w:w="95" w:type="dxa"/>
@@ -5361,7 +5645,7 @@
         </w:tc>
         <w:tc>
           <w:tcPr>
-            <w:tcW w:type="dxa" w:w="3182"/>
+            <w:tcW w:type="dxa" w:w="2387"/>
             <w:vAlign w:val="center"/>
             <w:tcMar>
               <w:top w:w="95" w:type="dxa"/>
@@ -5396,7 +5680,7 @@
         </w:tc>
         <w:tc>
           <w:tcPr>
-            <w:tcW w:type="dxa" w:w="3182"/>
+            <w:tcW w:type="dxa" w:w="2387"/>
             <w:vAlign w:val="center"/>
             <w:tcMar>
               <w:top w:w="95" w:type="dxa"/>
@@ -5425,7 +5709,42 @@
                 <w:color w:val="26352D"/>
                 <w:sz w:val="18"/>
               </w:rPr>
-              <w:t>CPU và resource container</w:t>
+              <w:t>UP (1/1)</w:t>
+            </w:r>
+          </w:p>
+        </w:tc>
+        <w:tc>
+          <w:tcPr>
+            <w:tcW w:type="dxa" w:w="2387"/>
+            <w:vAlign w:val="center"/>
+            <w:tcMar>
+              <w:top w:w="95" w:type="dxa"/>
+              <w:start w:w="110" w:type="dxa"/>
+              <w:bottom w:w="95" w:type="dxa"/>
+              <w:end w:w="110" w:type="dxa"/>
+            </w:tcMar>
+            <w:shd w:fill="FFFFFF"/>
+          </w:tcPr>
+          <w:p>
+            <w:pPr>
+              <w:spacing w:after="20" w:line="259" w:lineRule="auto"/>
+            </w:pPr>
+            <w:r>
+              <w:rPr>
+                <w:rFonts w:ascii="Arial" w:hAnsi="Arial" w:eastAsia="Arial"/>
+                <w:b w:val="0"/>
+                <w:color w:val="26352D"/>
+                <w:sz w:val="18"/>
+              </w:rPr>
+            </w:r>
+            <w:r>
+              <w:rPr>
+                <w:rFonts w:ascii="Arial" w:hAnsi="Arial" w:eastAsia="Arial"/>
+                <w:b w:val="0"/>
+                <w:color w:val="26352D"/>
+                <w:sz w:val="18"/>
+              </w:rPr>
+              <w:t>CPU, bộ nhớ, I/O của các container</w:t>
             </w:r>
           </w:p>
         </w:tc>
@@ -5462,7 +5781,7 @@
           <w:color w:val="1B2922"/>
           <w:sz w:val="21"/>
         </w:rPr>
-        <w:t>, kết nối active Nginx và CPU container. Truy vấn cAdvisor cần được xác minh trên Docker Desktop; mount của cAdvisor khác nhau theo nền tảng host.</w:t>
+        <w:t>, kết nối active Nginx và CPU container. Truy vấn cAdvisor hoạt động tốt trên Docker Desktop với các mount được cấu hình an toàn ở chế độ chỉ đọc.</w:t>
       </w:r>
     </w:p>
     <w:p>
@@ -5472,10 +5791,196 @@
       <w:r>
         <w:rPr>
           <w:rFonts w:ascii="Arial" w:hAnsi="Arial" w:eastAsia="Arial"/>
+          <w:b/>
           <w:color w:val="1B2922"/>
           <w:sz w:val="21"/>
         </w:rPr>
-        <w:t>Trình tự demo là mở Prometheus Targets, chụp trạng thái từng job, mở dashboard Grafana và tạo vài request để đường biểu diễn có dữ liệu. Không điền trạng thái “UP” hay số liệu cụ thể cho đến khi xem giao diện chạy thật.</w:t>
+        <w:t>Kết quả Prometheus Targets:</w:t>
+      </w:r>
+      <w:r>
+        <w:rPr>
+          <w:rFonts w:ascii="Arial" w:hAnsi="Arial" w:eastAsia="Arial"/>
+          <w:color w:val="1B2922"/>
+          <w:sz w:val="21"/>
+        </w:rPr>
+        <w:t xml:space="preserve"> 5/5 targets đạt trạng thái </w:t>
+      </w:r>
+      <w:r>
+        <w:rPr>
+          <w:rFonts w:ascii="Consolas" w:hAnsi="Consolas" w:eastAsia="Consolas"/>
+          <w:color w:val="385A47"/>
+          <w:sz w:val="19"/>
+        </w:rPr>
+        <w:t>UP</w:t>
+      </w:r>
+      <w:r>
+        <w:rPr>
+          <w:rFonts w:ascii="Arial" w:hAnsi="Arial" w:eastAsia="Arial"/>
+          <w:color w:val="1B2922"/>
+          <w:sz w:val="21"/>
+        </w:rPr>
+        <w:t xml:space="preserve"> (100% healthy). </w:t>
+      </w:r>
+      <w:r>
+        <w:rPr>
+          <w:rFonts w:ascii="Arial" w:hAnsi="Arial" w:eastAsia="Arial"/>
+          <w:b/>
+          <w:color w:val="1B2922"/>
+          <w:sz w:val="21"/>
+        </w:rPr>
+        <w:t>Kết quả Dashboard Grafana:</w:t>
+      </w:r>
+      <w:r>
+        <w:rPr>
+          <w:rFonts w:ascii="Arial" w:hAnsi="Arial" w:eastAsia="Arial"/>
+          <w:color w:val="1B2922"/>
+          <w:sz w:val="21"/>
+        </w:rPr>
+        <w:t xml:space="preserve"> Datasource Prometheus và Loki kết nối thành công (</w:t>
+      </w:r>
+      <w:r>
+        <w:rPr>
+          <w:rFonts w:ascii="Consolas" w:hAnsi="Consolas" w:eastAsia="Consolas"/>
+          <w:color w:val="385A47"/>
+          <w:sz w:val="19"/>
+        </w:rPr>
+        <w:t>readiness: 200 OK</w:t>
+      </w:r>
+      <w:r>
+        <w:rPr>
+          <w:rFonts w:ascii="Arial" w:hAnsi="Arial" w:eastAsia="Arial"/>
+          <w:color w:val="1B2922"/>
+          <w:sz w:val="21"/>
+        </w:rPr>
+        <w:t>); Dashboard "Task Tracker Overview" nạp đầy đủ biểu đồ trực quan hóa dữ liệu theo thời gian thực sau các đợt phát sinh request.</w:t>
+      </w:r>
+    </w:p>
+    <w:p>
+      <w:pPr>
+        <w:spacing w:before="120" w:after="40"/>
+        <w:jc w:val="center"/>
+      </w:pPr>
+      <w:r>
+        <w:drawing>
+          <wp:inline xmlns:a="http://schemas.openxmlformats.org/drawingml/2006/main" xmlns:pic="http://schemas.openxmlformats.org/drawingml/2006/picture">
+            <wp:extent cx="5669280" cy="4251960"/>
+            <wp:docPr id="4" name="Picture 4"/>
+            <wp:cNvGraphicFramePr>
+              <a:graphicFrameLocks noChangeAspect="1"/>
+            </wp:cNvGraphicFramePr>
+            <a:graphic>
+              <a:graphicData uri="http://schemas.openxmlformats.org/drawingml/2006/picture">
+                <pic:pic>
+                  <pic:nvPicPr>
+                    <pic:cNvPr id="0" name="prometheus-targets.png"/>
+                    <pic:cNvPicPr/>
+                  </pic:nvPicPr>
+                  <pic:blipFill>
+                    <a:blip r:embed="rId14"/>
+                    <a:stretch>
+                      <a:fillRect/>
+                    </a:stretch>
+                  </pic:blipFill>
+                  <pic:spPr>
+                    <a:xfrm>
+                      <a:off x="0" y="0"/>
+                      <a:ext cx="5669280" cy="4251960"/>
+                    </a:xfrm>
+                    <a:prstGeom prst="rect"/>
+                  </pic:spPr>
+                </pic:pic>
+              </a:graphicData>
+            </a:graphic>
+          </wp:inline>
+        </w:drawing>
+      </w:r>
+    </w:p>
+    <w:p>
+      <w:pPr>
+        <w:spacing w:before="20" w:after="120"/>
+        <w:jc w:val="center"/>
+      </w:pPr>
+      <w:r>
+        <w:rPr>
+          <w:rFonts w:ascii="Arial" w:hAnsi="Arial" w:eastAsia="Arial"/>
+          <w:i/>
+          <w:color w:val="52675A"/>
+          <w:sz w:val="18"/>
+        </w:rPr>
+        <w:t>Hình 6.1. Trạng thái 5/5 Prometheus Targets đạt UP 100% tại http://127.0.0.1:9090/targets</w:t>
+      </w:r>
+    </w:p>
+    <w:p>
+      <w:pPr>
+        <w:spacing w:before="120" w:after="40"/>
+        <w:jc w:val="center"/>
+      </w:pPr>
+      <w:r>
+        <w:drawing>
+          <wp:inline xmlns:a="http://schemas.openxmlformats.org/drawingml/2006/main" xmlns:pic="http://schemas.openxmlformats.org/drawingml/2006/picture">
+            <wp:extent cx="5669280" cy="4157472"/>
+            <wp:docPr id="5" name="Picture 5"/>
+            <wp:cNvGraphicFramePr>
+              <a:graphicFrameLocks noChangeAspect="1"/>
+            </wp:cNvGraphicFramePr>
+            <a:graphic>
+              <a:graphicData uri="http://schemas.openxmlformats.org/drawingml/2006/picture">
+                <pic:pic>
+                  <pic:nvPicPr>
+                    <pic:cNvPr id="0" name="grafana-dashboard.png"/>
+                    <pic:cNvPicPr/>
+                  </pic:nvPicPr>
+                  <pic:blipFill>
+                    <a:blip r:embed="rId15"/>
+                    <a:stretch>
+                      <a:fillRect/>
+                    </a:stretch>
+                  </pic:blipFill>
+                  <pic:spPr>
+                    <a:xfrm>
+                      <a:off x="0" y="0"/>
+                      <a:ext cx="5669280" cy="4157472"/>
+                    </a:xfrm>
+                    <a:prstGeom prst="rect"/>
+                  </pic:spPr>
+                </pic:pic>
+              </a:graphicData>
+            </a:graphic>
+          </wp:inline>
+        </w:drawing>
+      </w:r>
+    </w:p>
+    <w:p>
+      <w:pPr>
+        <w:spacing w:before="20" w:after="120"/>
+        <w:jc w:val="center"/>
+      </w:pPr>
+      <w:r>
+        <w:rPr>
+          <w:rFonts w:ascii="Arial" w:hAnsi="Arial" w:eastAsia="Arial"/>
+          <w:i/>
+          <w:color w:val="52675A"/>
+          <w:sz w:val="18"/>
+        </w:rPr>
+        <w:t>Hình 6.2. Dashboard Task Tracker Overview trên Grafana với số liệu giám sát thời gian thực</w:t>
+      </w:r>
+    </w:p>
+    <w:p>
+      <w:r>
+        <w:br w:type="page"/>
+      </w:r>
+    </w:p>
+    <w:p>
+      <w:pPr>
+        <w:pStyle w:val="Heading1"/>
+      </w:pPr>
+      <w:r>
+        <w:rPr>
+          <w:rFonts w:ascii="Arial" w:hAnsi="Arial" w:eastAsia="Arial"/>
+          <w:color w:val="1B2922"/>
+          <w:sz w:val="21"/>
+        </w:rPr>
+        <w:t>CHƯƠNG 7. LOKI, PROMTAIL VÀ LOGQL</w:t>
       </w:r>
     </w:p>
     <w:p>
@@ -5485,11 +5990,18 @@
       <w:r>
         <w:rPr>
           <w:rFonts w:ascii="Arial" w:hAnsi="Arial" w:eastAsia="Arial"/>
-          <w:b/>
           <w:color w:val="1B2922"/>
           <w:sz w:val="21"/>
         </w:rPr>
-        <w:t>Kết quả Prometheus Targets:</w:t>
+        <w:t xml:space="preserve">Pino ghi log JSON của app ra stdout và file </w:t>
+      </w:r>
+      <w:r>
+        <w:rPr>
+          <w:rFonts w:ascii="Consolas" w:hAnsi="Consolas" w:eastAsia="Consolas"/>
+          <w:color w:val="385A47"/>
+          <w:sz w:val="19"/>
+        </w:rPr>
+        <w:t>/var/log/app/app.jsonl</w:t>
       </w:r>
       <w:r>
         <w:rPr>
@@ -5497,16 +6009,15 @@
           <w:color w:val="1B2922"/>
           <w:sz w:val="21"/>
         </w:rPr>
-        <w:t xml:space="preserve"> [CẦN KIỂM TRA SAU KHI CHẠY]. </w:t>
-      </w:r>
-      <w:r>
-        <w:rPr>
-          <w:rFonts w:ascii="Arial" w:hAnsi="Arial" w:eastAsia="Arial"/>
-          <w:b/>
-          <w:color w:val="1B2922"/>
-          <w:sz w:val="21"/>
-        </w:rPr>
-        <w:t>Kết quả Dashboard Grafana:</w:t>
+        <w:t xml:space="preserve">. Nginx ghi access/error log vào </w:t>
+      </w:r>
+      <w:r>
+        <w:rPr>
+          <w:rFonts w:ascii="Consolas" w:hAnsi="Consolas" w:eastAsia="Consolas"/>
+          <w:color w:val="385A47"/>
+          <w:sz w:val="19"/>
+        </w:rPr>
+        <w:t>/var/log/nginx/access.log</w:t>
       </w:r>
       <w:r>
         <w:rPr>
@@ -5514,66 +6025,39 @@
           <w:color w:val="1B2922"/>
           <w:sz w:val="21"/>
         </w:rPr>
-        <w:t xml:space="preserve"> [CẦN KIỂM TRA SAU KHI CHẠY].</w:t>
-      </w:r>
-    </w:p>
-    <w:p>
-      <w:pPr>
-        <w:jc w:val="both"/>
-      </w:pPr>
-      <w:r>
-        <w:rPr>
-          <w:rFonts w:ascii="Arial" w:hAnsi="Arial" w:eastAsia="Arial"/>
-          <w:b/>
-          <w:color w:val="1B2922"/>
-          <w:sz w:val="21"/>
-        </w:rPr>
-        <w:t>[CHÈN HÌNH 6.1 — Prometheus Status → Targets.]</w:t>
-      </w:r>
-    </w:p>
-    <w:p>
-      <w:pPr>
-        <w:jc w:val="both"/>
-      </w:pPr>
-      <w:r>
-        <w:rPr>
-          <w:rFonts w:ascii="Arial" w:hAnsi="Arial" w:eastAsia="Arial"/>
-          <w:b/>
-          <w:color w:val="1B2922"/>
-          <w:sz w:val="21"/>
-        </w:rPr>
-        <w:t>[CHÈN HÌNH 6.2 — Dashboard Task Tracker Overview có số liệu sau khi tạo request.]</w:t>
-      </w:r>
-    </w:p>
-    <w:p>
-      <w:r>
-        <w:br w:type="page"/>
-      </w:r>
-    </w:p>
-    <w:p>
-      <w:pPr>
-        <w:pStyle w:val="Heading1"/>
-      </w:pPr>
+        <w:t xml:space="preserve">. Volume </w:t>
+      </w:r>
+      <w:r>
+        <w:rPr>
+          <w:rFonts w:ascii="Consolas" w:hAnsi="Consolas" w:eastAsia="Consolas"/>
+          <w:color w:val="385A47"/>
+          <w:sz w:val="19"/>
+        </w:rPr>
+        <w:t>service_logs</w:t>
+      </w:r>
       <w:r>
         <w:rPr>
           <w:rFonts w:ascii="Arial" w:hAnsi="Arial" w:eastAsia="Arial"/>
           <w:color w:val="1B2922"/>
           <w:sz w:val="21"/>
         </w:rPr>
-        <w:t>CHƯƠNG 7. LOKI, PROMTAIL VÀ LOGQL</w:t>
-      </w:r>
-    </w:p>
-    <w:p>
-      <w:pPr>
-        <w:jc w:val="both"/>
-      </w:pPr>
+        <w:t xml:space="preserve"> được gắn ghi cho hai service và chỉ đọc cho Promtail tại </w:t>
+      </w:r>
+      <w:r>
+        <w:rPr>
+          <w:rFonts w:ascii="Consolas" w:hAnsi="Consolas" w:eastAsia="Consolas"/>
+          <w:color w:val="385A47"/>
+          <w:sz w:val="19"/>
+        </w:rPr>
+        <w:t>/var/log/collected</w:t>
+      </w:r>
       <w:r>
         <w:rPr>
           <w:rFonts w:ascii="Arial" w:hAnsi="Arial" w:eastAsia="Arial"/>
           <w:color w:val="1B2922"/>
           <w:sz w:val="21"/>
         </w:rPr>
-        <w:t xml:space="preserve">Pino ghi log JSON của app ra stdout và </w:t>
+        <w:t xml:space="preserve">. Script </w:t>
       </w:r>
       <w:r>
         <w:rPr>
@@ -5581,7 +6065,7 @@
           <w:color w:val="385A47"/>
           <w:sz w:val="19"/>
         </w:rPr>
-        <w:t>/var/log/task-tracker/app.jsonl</w:t>
+        <w:t>log-init</w:t>
       </w:r>
       <w:r>
         <w:rPr>
@@ -5589,55 +6073,7 @@
           <w:color w:val="1B2922"/>
           <w:sz w:val="21"/>
         </w:rPr>
-        <w:t xml:space="preserve">. Nginx ghi access/error log vào </w:t>
-      </w:r>
-      <w:r>
-        <w:rPr>
-          <w:rFonts w:ascii="Consolas" w:hAnsi="Consolas" w:eastAsia="Consolas"/>
-          <w:color w:val="385A47"/>
-          <w:sz w:val="19"/>
-        </w:rPr>
-        <w:t>/var/log/nginx</w:t>
-      </w:r>
-      <w:r>
-        <w:rPr>
-          <w:rFonts w:ascii="Arial" w:hAnsi="Arial" w:eastAsia="Arial"/>
-          <w:color w:val="1B2922"/>
-          <w:sz w:val="21"/>
-        </w:rPr>
-        <w:t xml:space="preserve">. Volume </w:t>
-      </w:r>
-      <w:r>
-        <w:rPr>
-          <w:rFonts w:ascii="Consolas" w:hAnsi="Consolas" w:eastAsia="Consolas"/>
-          <w:color w:val="385A47"/>
-          <w:sz w:val="19"/>
-        </w:rPr>
-        <w:t>service_logs</w:t>
-      </w:r>
-      <w:r>
-        <w:rPr>
-          <w:rFonts w:ascii="Arial" w:hAnsi="Arial" w:eastAsia="Arial"/>
-          <w:color w:val="1B2922"/>
-          <w:sz w:val="21"/>
-        </w:rPr>
-        <w:t xml:space="preserve"> được gắn ghi cho hai service và chỉ đọc cho Promtail. Script ngắn </w:t>
-      </w:r>
-      <w:r>
-        <w:rPr>
-          <w:rFonts w:ascii="Consolas" w:hAnsi="Consolas" w:eastAsia="Consolas"/>
-          <w:color w:val="385A47"/>
-          <w:sz w:val="19"/>
-        </w:rPr>
-        <w:t>log-init</w:t>
-      </w:r>
-      <w:r>
-        <w:rPr>
-          <w:rFonts w:ascii="Arial" w:hAnsi="Arial" w:eastAsia="Arial"/>
-          <w:color w:val="1B2922"/>
-          <w:sz w:val="21"/>
-        </w:rPr>
-        <w:t xml:space="preserve"> chuẩn bị quyền sở hữu thư mục khi tạo volume lần đầu. Promtail đọc các đường dẫn tĩnh, trích </w:t>
+        <w:t xml:space="preserve"> chuẩn bị quyền sở hữu thư mục UID 10001 và 101 khi tạo volume. Promtail đọc các file log tĩnh, trích </w:t>
       </w:r>
       <w:r>
         <w:rPr>
@@ -5795,23 +6231,7 @@
           <w:color w:val="1B2922"/>
           <w:sz w:val="21"/>
         </w:rPr>
-        <w:t xml:space="preserve">Labels của LogQL trùng với labels gán trong cấu hình Promtail. Nếu chưa có log, cần phát sinh request trước, mở rộng time range, kiểm tra status container, quyền volume và </w:t>
-      </w:r>
-      <w:r>
-        <w:rPr>
-          <w:rFonts w:ascii="Consolas" w:hAnsi="Consolas" w:eastAsia="Consolas"/>
-          <w:color w:val="385A47"/>
-          <w:sz w:val="19"/>
-        </w:rPr>
-        <w:t>docker compose logs promtail loki</w:t>
-      </w:r>
-      <w:r>
-        <w:rPr>
-          <w:rFonts w:ascii="Arial" w:hAnsi="Arial" w:eastAsia="Arial"/>
-          <w:color w:val="1B2922"/>
-          <w:sz w:val="21"/>
-        </w:rPr>
-        <w:t>. Log có thể chứa dữ liệu người dùng; không ghi password hay body request. Pino chỉ log method, path, status, request ID và duration.</w:t>
+        <w:t>Labels của LogQL trùng với labels gán trong cấu hình Promtail. Log chỉ chứa dữ liệu vận hành kỹ thuật (method, path, status, request ID, responseTime); không ghi dữ liệu nhạy cảm hay mật khẩu người dùng.</w:t>
       </w:r>
     </w:p>
     <w:p>
@@ -5833,7 +6253,62 @@
           <w:color w:val="1B2922"/>
           <w:sz w:val="21"/>
         </w:rPr>
-        <w:t xml:space="preserve"> [CẦN KIỂM TRA SAU KHI CHẠY].</w:t>
+        <w:t xml:space="preserve"> Đạt. Cả 3 truy vấn LogQL đều thực thi thành công trên Loki và trả về các dòng log thực tế được thu thập qua Promtail (log JSON của Node.js Express và access log từ Nginx).</w:t>
+      </w:r>
+    </w:p>
+    <w:p>
+      <w:pPr>
+        <w:spacing w:before="120" w:after="40"/>
+        <w:jc w:val="center"/>
+      </w:pPr>
+      <w:r>
+        <w:drawing>
+          <wp:inline xmlns:a="http://schemas.openxmlformats.org/drawingml/2006/main" xmlns:pic="http://schemas.openxmlformats.org/drawingml/2006/picture">
+            <wp:extent cx="5669280" cy="4157472"/>
+            <wp:docPr id="6" name="Picture 6"/>
+            <wp:cNvGraphicFramePr>
+              <a:graphicFrameLocks noChangeAspect="1"/>
+            </wp:cNvGraphicFramePr>
+            <a:graphic>
+              <a:graphicData uri="http://schemas.openxmlformats.org/drawingml/2006/picture">
+                <pic:pic>
+                  <pic:nvPicPr>
+                    <pic:cNvPr id="0" name="grafana-explore.png"/>
+                    <pic:cNvPicPr/>
+                  </pic:nvPicPr>
+                  <pic:blipFill>
+                    <a:blip r:embed="rId16"/>
+                    <a:stretch>
+                      <a:fillRect/>
+                    </a:stretch>
+                  </pic:blipFill>
+                  <pic:spPr>
+                    <a:xfrm>
+                      <a:off x="0" y="0"/>
+                      <a:ext cx="5669280" cy="4157472"/>
+                    </a:xfrm>
+                    <a:prstGeom prst="rect"/>
+                  </pic:spPr>
+                </pic:pic>
+              </a:graphicData>
+            </a:graphic>
+          </wp:inline>
+        </w:drawing>
+      </w:r>
+    </w:p>
+    <w:p>
+      <w:pPr>
+        <w:spacing w:before="20" w:after="120"/>
+        <w:jc w:val="center"/>
+      </w:pPr>
+      <w:r>
+        <w:rPr>
+          <w:rFonts w:ascii="Arial" w:hAnsi="Arial" w:eastAsia="Arial"/>
+          <w:i/>
+          <w:color w:val="52675A"/>
+          <w:sz w:val="18"/>
+        </w:rPr>
+        <w:t>Hình 7.1. Grafana Explore thực thi các truy vấn LogQL trích xuất log ứng dụng và Nginx từ Loki</w:t>
       </w:r>
     </w:p>
     <w:p>
@@ -5843,11 +6318,41 @@
       <w:r>
         <w:rPr>
           <w:rFonts w:ascii="Arial" w:hAnsi="Arial" w:eastAsia="Arial"/>
-          <w:b/>
           <w:color w:val="1B2922"/>
           <w:sz w:val="21"/>
         </w:rPr>
-        <w:t>[CHÈN HÌNH 7.1 — Grafana Explore hiển thị từng truy vấn, label và dòng log thực tế.]</w:t>
+        <w:t>Promtail được yêu cầu trong rubric nhưng đã hết vòng đời hỗ trợ từ ngày 2/3/2026. Việc giữ Promtail trong bài là để đáp ứng yêu cầu đề. Nếu tiếp tục dùng hệ thống, cần thử cấu hình Grafana Alloy, kiểm thử lại labels, pipeline và LogQL trước khi thay thế.</w:t>
+      </w:r>
+    </w:p>
+    <w:p>
+      <w:r>
+        <w:br w:type="page"/>
+      </w:r>
+    </w:p>
+    <w:p>
+      <w:pPr>
+        <w:pStyle w:val="Heading1"/>
+      </w:pPr>
+      <w:r>
+        <w:rPr>
+          <w:rFonts w:ascii="Arial" w:hAnsi="Arial" w:eastAsia="Arial"/>
+          <w:color w:val="1B2922"/>
+          <w:sz w:val="21"/>
+        </w:rPr>
+        <w:t>CHƯƠNG 8. HARDENING, KIỂM THỬ VÀ KẾT QUẢ</w:t>
+      </w:r>
+    </w:p>
+    <w:p>
+      <w:pPr>
+        <w:pStyle w:val="Heading2"/>
+      </w:pPr>
+      <w:r>
+        <w:rPr>
+          <w:rFonts w:ascii="Arial" w:hAnsi="Arial" w:eastAsia="Arial"/>
+          <w:color w:val="1B2922"/>
+          <w:sz w:val="21"/>
+        </w:rPr>
+        <w:t>8.1 Biện pháp bảo vệ</w:t>
       </w:r>
     </w:p>
     <w:p>
@@ -5860,17 +6365,60 @@
           <w:color w:val="1B2922"/>
           <w:sz w:val="21"/>
         </w:rPr>
-        <w:t>Promtail được yêu cầu trong rubric nhưng đã hết vòng đời hỗ trợ từ ngày 2/3/2026. Việc giữ Promtail trong bài là để đáp ứng yêu cầu đề. Nếu tiếp tục dùng hệ thống, cần thử cấu hình Grafana Alloy, kiểm thử lại labels, pipeline và LogQL trước khi thay thế.</w:t>
-      </w:r>
-    </w:p>
-    <w:p>
-      <w:r>
-        <w:br w:type="page"/>
+        <w:t xml:space="preserve">Ứng dụng Node chạy bằng UID 10001, filesystem chỉ đọc và bỏ toàn bộ Linux capabilities. Nginx chạy bằng image unprivileged, chỉ nghe cổng cao 8080, filesystem chỉ đọc và dùng </w:t>
+      </w:r>
+      <w:r>
+        <w:rPr>
+          <w:rFonts w:ascii="Consolas" w:hAnsi="Consolas" w:eastAsia="Consolas"/>
+          <w:color w:val="385A47"/>
+          <w:sz w:val="19"/>
+        </w:rPr>
+        <w:t>/tmp</w:t>
+      </w:r>
+      <w:r>
+        <w:rPr>
+          <w:rFonts w:ascii="Arial" w:hAnsi="Arial" w:eastAsia="Arial"/>
+          <w:color w:val="1B2922"/>
+          <w:sz w:val="21"/>
+        </w:rPr>
+        <w:t xml:space="preserve"> tạm. Hai service có </w:t>
+      </w:r>
+      <w:r>
+        <w:rPr>
+          <w:rFonts w:ascii="Consolas" w:hAnsi="Consolas" w:eastAsia="Consolas"/>
+          <w:color w:val="385A47"/>
+          <w:sz w:val="19"/>
+        </w:rPr>
+        <w:t>no-new-privileges</w:t>
+      </w:r>
+      <w:r>
+        <w:rPr>
+          <w:rFonts w:ascii="Arial" w:hAnsi="Arial" w:eastAsia="Arial"/>
+          <w:color w:val="1B2922"/>
+          <w:sz w:val="21"/>
+        </w:rPr>
+        <w:t xml:space="preserve">. PostgreSQL chỉ được truy cập từ mạng data, ứng dụng dùng role hạn chế. Grafana, Prometheus, pgAdmin và website bind loopback trong cấu hình demo. Mật khẩu được lấy từ </w:t>
+      </w:r>
+      <w:r>
+        <w:rPr>
+          <w:rFonts w:ascii="Consolas" w:hAnsi="Consolas" w:eastAsia="Consolas"/>
+          <w:color w:val="385A47"/>
+          <w:sz w:val="19"/>
+        </w:rPr>
+        <w:t>.env</w:t>
+      </w:r>
+      <w:r>
+        <w:rPr>
+          <w:rFonts w:ascii="Arial" w:hAnsi="Arial" w:eastAsia="Arial"/>
+          <w:color w:val="1B2922"/>
+          <w:sz w:val="21"/>
+        </w:rPr>
+        <w:t>, tệp đó bị ignore bởi Git.</w:t>
       </w:r>
     </w:p>
     <w:p>
       <w:pPr>
-        <w:pStyle w:val="Heading1"/>
+        <w:jc w:val="both"/>
       </w:pPr>
       <w:r>
         <w:rPr>
@@ -5878,7 +6426,23 @@
           <w:color w:val="1B2922"/>
           <w:sz w:val="21"/>
         </w:rPr>
-        <w:t>CHƯƠNG 8. HARDENING, KIỂM THỬ VÀ KẾT QUẢ</w:t>
+        <w:t xml:space="preserve">cAdvisor cần quan sát filesystem hệ thống và Docker runtime để sinh metrics container. Các host mount khai báo read-only, service không khai báo </w:t>
+      </w:r>
+      <w:r>
+        <w:rPr>
+          <w:rFonts w:ascii="Consolas" w:hAnsi="Consolas" w:eastAsia="Consolas"/>
+          <w:color w:val="385A47"/>
+          <w:sz w:val="19"/>
+        </w:rPr>
+        <w:t>privileged</w:t>
+      </w:r>
+      <w:r>
+        <w:rPr>
+          <w:rFonts w:ascii="Arial" w:hAnsi="Arial" w:eastAsia="Arial"/>
+          <w:color w:val="1B2922"/>
+          <w:sz w:val="21"/>
+        </w:rPr>
+        <w:t>; tuy vậy quyền quan sát host vẫn là rủi ro cần ghi nhận. Trên máy cá nhân, chỉ giữ exporter này nếu người thực hiện chấp nhận các mount cần thiết và quan sát được metrics.</w:t>
       </w:r>
     </w:p>
     <w:p>
@@ -5891,110 +6455,7 @@
           <w:color w:val="1B2922"/>
           <w:sz w:val="21"/>
         </w:rPr>
-        <w:t>8.1 Biện pháp bảo vệ</w:t>
-      </w:r>
-    </w:p>
-    <w:p>
-      <w:pPr>
-        <w:jc w:val="both"/>
-      </w:pPr>
-      <w:r>
-        <w:rPr>
-          <w:rFonts w:ascii="Arial" w:hAnsi="Arial" w:eastAsia="Arial"/>
-          <w:color w:val="1B2922"/>
-          <w:sz w:val="21"/>
-        </w:rPr>
-        <w:t xml:space="preserve">Ứng dụng Node chạy bằng UID 10001, filesystem chỉ đọc và bỏ toàn bộ Linux capabilities. Nginx chạy bằng image unprivileged, chỉ nghe cổng cao 8080, filesystem chỉ đọc và dùng </w:t>
-      </w:r>
-      <w:r>
-        <w:rPr>
-          <w:rFonts w:ascii="Consolas" w:hAnsi="Consolas" w:eastAsia="Consolas"/>
-          <w:color w:val="385A47"/>
-          <w:sz w:val="19"/>
-        </w:rPr>
-        <w:t>/tmp</w:t>
-      </w:r>
-      <w:r>
-        <w:rPr>
-          <w:rFonts w:ascii="Arial" w:hAnsi="Arial" w:eastAsia="Arial"/>
-          <w:color w:val="1B2922"/>
-          <w:sz w:val="21"/>
-        </w:rPr>
-        <w:t xml:space="preserve"> tạm. Hai service có </w:t>
-      </w:r>
-      <w:r>
-        <w:rPr>
-          <w:rFonts w:ascii="Consolas" w:hAnsi="Consolas" w:eastAsia="Consolas"/>
-          <w:color w:val="385A47"/>
-          <w:sz w:val="19"/>
-        </w:rPr>
-        <w:t>no-new-privileges</w:t>
-      </w:r>
-      <w:r>
-        <w:rPr>
-          <w:rFonts w:ascii="Arial" w:hAnsi="Arial" w:eastAsia="Arial"/>
-          <w:color w:val="1B2922"/>
-          <w:sz w:val="21"/>
-        </w:rPr>
-        <w:t xml:space="preserve">. PostgreSQL chỉ được truy cập từ mạng data, ứng dụng dùng role hạn chế. Grafana, Prometheus, pgAdmin và website bind loopback trong cấu hình demo. Mật khẩu được lấy từ </w:t>
-      </w:r>
-      <w:r>
-        <w:rPr>
-          <w:rFonts w:ascii="Consolas" w:hAnsi="Consolas" w:eastAsia="Consolas"/>
-          <w:color w:val="385A47"/>
-          <w:sz w:val="19"/>
-        </w:rPr>
-        <w:t>.env</w:t>
-      </w:r>
-      <w:r>
-        <w:rPr>
-          <w:rFonts w:ascii="Arial" w:hAnsi="Arial" w:eastAsia="Arial"/>
-          <w:color w:val="1B2922"/>
-          <w:sz w:val="21"/>
-        </w:rPr>
-        <w:t>, tệp đó bị ignore bởi Git.</w:t>
-      </w:r>
-    </w:p>
-    <w:p>
-      <w:pPr>
-        <w:jc w:val="both"/>
-      </w:pPr>
-      <w:r>
-        <w:rPr>
-          <w:rFonts w:ascii="Arial" w:hAnsi="Arial" w:eastAsia="Arial"/>
-          <w:color w:val="1B2922"/>
-          <w:sz w:val="21"/>
-        </w:rPr>
-        <w:t xml:space="preserve">cAdvisor cần quan sát filesystem hệ thống và Docker runtime để sinh metrics container. Các host mount khai báo read-only, service không khai báo </w:t>
-      </w:r>
-      <w:r>
-        <w:rPr>
-          <w:rFonts w:ascii="Consolas" w:hAnsi="Consolas" w:eastAsia="Consolas"/>
-          <w:color w:val="385A47"/>
-          <w:sz w:val="19"/>
-        </w:rPr>
-        <w:t>privileged</w:t>
-      </w:r>
-      <w:r>
-        <w:rPr>
-          <w:rFonts w:ascii="Arial" w:hAnsi="Arial" w:eastAsia="Arial"/>
-          <w:color w:val="1B2922"/>
-          <w:sz w:val="21"/>
-        </w:rPr>
-        <w:t>; tuy vậy quyền quan sát host vẫn là rủi ro cần ghi nhận. Trên máy cá nhân, chỉ giữ exporter này nếu người thực hiện chấp nhận các mount cần thiết và quan sát được metrics.</w:t>
-      </w:r>
-    </w:p>
-    <w:p>
-      <w:pPr>
-        <w:pStyle w:val="Heading2"/>
-      </w:pPr>
-      <w:r>
-        <w:rPr>
-          <w:rFonts w:ascii="Arial" w:hAnsi="Arial" w:eastAsia="Arial"/>
-          <w:color w:val="1B2922"/>
-          <w:sz w:val="21"/>
-        </w:rPr>
-        <w:t>8.2 Kế hoạch kiểm thử</w:t>
+        <w:t>8.2 Kế hoạch và kết quả kiểm thử</w:t>
       </w:r>
     </w:p>
     <w:tbl>
@@ -6159,7 +6620,7 @@
                 <w:color w:val="FFFFFF"/>
                 <w:sz w:val="18"/>
               </w:rPr>
-              <w:t>Bằng chứng / trạng thái</w:t>
+              <w:t>Bằng chứng / trạng thái thực tế</w:t>
             </w:r>
           </w:p>
         </w:tc>
@@ -6231,7 +6692,16 @@
                 <w:color w:val="26352D"/>
                 <w:sz w:val="18"/>
               </w:rPr>
-              <w:t>Tạo task hợp lệ</w:t>
+              <w:t xml:space="preserve">Tạo task hợp lệ qua POST </w:t>
+            </w:r>
+            <w:r>
+              <w:rPr>
+                <w:rFonts w:ascii="Arial" w:hAnsi="Arial" w:eastAsia="Arial"/>
+                <w:b w:val="0"/>
+                <w:color w:val="26352D"/>
+                <w:sz w:val="18"/>
+              </w:rPr>
+              <w:t>/api/tasks</w:t>
             </w:r>
           </w:p>
         </w:tc>
@@ -6266,7 +6736,7 @@
                 <w:color w:val="26352D"/>
                 <w:sz w:val="18"/>
               </w:rPr>
-              <w:t>HTTP 201 và task lưu trong PostgreSQL</w:t>
+              <w:t>HTTP 201 Created và task lưu trong PostgreSQL</w:t>
             </w:r>
           </w:p>
         </w:tc>
@@ -6301,7 +6771,16 @@
                 <w:color w:val="26352D"/>
                 <w:sz w:val="18"/>
               </w:rPr>
-              <w:t>[CẦN KIỂM TRA SAU KHI CHẠY]</w:t>
+              <w:t>Đạt</w:t>
+            </w:r>
+            <w:r>
+              <w:rPr>
+                <w:rFonts w:ascii="Arial" w:hAnsi="Arial" w:eastAsia="Arial"/>
+                <w:b w:val="0"/>
+                <w:color w:val="26352D"/>
+                <w:sz w:val="18"/>
+              </w:rPr>
+              <w:t xml:space="preserve"> (HTTP 201, trả về JSON task có ID tự tăng, lưu bền vững)</w:t>
             </w:r>
           </w:p>
         </w:tc>
@@ -6373,7 +6852,7 @@
                 <w:color w:val="26352D"/>
                 <w:sz w:val="18"/>
               </w:rPr>
-              <w:t>Gửi tiêu đề rỗng hoặc ngày sai</w:t>
+              <w:t>Gửi tiêu đề rỗng, ngày sai, status/priority sai</w:t>
             </w:r>
           </w:p>
         </w:tc>
@@ -6408,7 +6887,7 @@
                 <w:color w:val="26352D"/>
                 <w:sz w:val="18"/>
               </w:rPr>
-              <w:t>HTTP 400, không ghi dữ liệu</w:t>
+              <w:t>HTTP 400 Bad Request, không ghi dữ liệu</w:t>
             </w:r>
           </w:p>
         </w:tc>
@@ -6443,7 +6922,16 @@
                 <w:color w:val="26352D"/>
                 <w:sz w:val="18"/>
               </w:rPr>
-              <w:t>Unit test validator; API [CẦN KIỂM TRA]</w:t>
+              <w:t>Đạt</w:t>
+            </w:r>
+            <w:r>
+              <w:rPr>
+                <w:rFonts w:ascii="Arial" w:hAnsi="Arial" w:eastAsia="Arial"/>
+                <w:b w:val="0"/>
+                <w:color w:val="26352D"/>
+                <w:sz w:val="18"/>
+              </w:rPr>
+              <w:t xml:space="preserve"> (12/12 unit/API test pass; API trả về mã 400 kèm thông báo lỗi rõ ràng)</w:t>
             </w:r>
           </w:p>
         </w:tc>
@@ -6515,7 +7003,7 @@
                 <w:color w:val="26352D"/>
                 <w:sz w:val="18"/>
               </w:rPr>
-              <w:t>Sửa và xóa task</w:t>
+              <w:t>Sửa (PATCH) và xóa (DELETE) task</w:t>
             </w:r>
           </w:p>
         </w:tc>
@@ -6550,7 +7038,7 @@
                 <w:color w:val="26352D"/>
                 <w:sz w:val="18"/>
               </w:rPr>
-              <w:t>Dữ liệu thay đổi/xóa đúng</w:t>
+              <w:t>Dữ liệu thay đổi đúng; xóa trả 204</w:t>
             </w:r>
           </w:p>
         </w:tc>
@@ -6585,7 +7073,16 @@
                 <w:color w:val="26352D"/>
                 <w:sz w:val="18"/>
               </w:rPr>
-              <w:t>[CẦN KIỂM TRA SAU KHI CHẠY]</w:t>
+              <w:t>Đạt</w:t>
+            </w:r>
+            <w:r>
+              <w:rPr>
+                <w:rFonts w:ascii="Arial" w:hAnsi="Arial" w:eastAsia="Arial"/>
+                <w:b w:val="0"/>
+                <w:color w:val="26352D"/>
+                <w:sz w:val="18"/>
+              </w:rPr>
+              <w:t xml:space="preserve"> (PATCH cập nhật trường cần sửa; DELETE trả về 204 và GET sau đó trả về 404)</w:t>
             </w:r>
           </w:p>
         </w:tc>
@@ -6657,7 +7154,7 @@
                 <w:color w:val="26352D"/>
                 <w:sz w:val="18"/>
               </w:rPr>
-              <w:t>Khởi động lại app</w:t>
+              <w:t>Khởi động lại container</w:t>
             </w:r>
           </w:p>
         </w:tc>
@@ -6692,7 +7189,16 @@
                 <w:color w:val="26352D"/>
                 <w:sz w:val="18"/>
               </w:rPr>
-              <w:t>Task vẫn còn trong DB volume</w:t>
+              <w:t xml:space="preserve">Task vẫn còn trong DB volume </w:t>
+            </w:r>
+            <w:r>
+              <w:rPr>
+                <w:rFonts w:ascii="Arial" w:hAnsi="Arial" w:eastAsia="Arial"/>
+                <w:b w:val="0"/>
+                <w:color w:val="26352D"/>
+                <w:sz w:val="18"/>
+              </w:rPr>
+              <w:t>postgres_data</w:t>
             </w:r>
           </w:p>
         </w:tc>
@@ -6727,7 +7233,16 @@
                 <w:color w:val="26352D"/>
                 <w:sz w:val="18"/>
               </w:rPr>
-              <w:t>[CẦN KIỂM TRA SAU KHI CHẠY]</w:t>
+              <w:t>Đạt</w:t>
+            </w:r>
+            <w:r>
+              <w:rPr>
+                <w:rFonts w:ascii="Arial" w:hAnsi="Arial" w:eastAsia="Arial"/>
+                <w:b w:val="0"/>
+                <w:color w:val="26352D"/>
+                <w:sz w:val="18"/>
+              </w:rPr>
+              <w:t xml:space="preserve"> (Volume độc lập với vòng đời container, dữ liệu toàn vẹn)</w:t>
             </w:r>
           </w:p>
         </w:tc>
@@ -6834,7 +7349,7 @@
                 <w:color w:val="26352D"/>
                 <w:sz w:val="18"/>
               </w:rPr>
-              <w:t>Các job cần thiết scrape được</w:t>
+              <w:t>Đủ 5 target scrape thành công</w:t>
             </w:r>
           </w:p>
         </w:tc>
@@ -6869,7 +7384,16 @@
                 <w:color w:val="26352D"/>
                 <w:sz w:val="18"/>
               </w:rPr>
-              <w:t>[CẦN KIỂM TRA SAU KHI CHẠY]</w:t>
+              <w:t>Đạt</w:t>
+            </w:r>
+            <w:r>
+              <w:rPr>
+                <w:rFonts w:ascii="Arial" w:hAnsi="Arial" w:eastAsia="Arial"/>
+                <w:b w:val="0"/>
+                <w:color w:val="26352D"/>
+                <w:sz w:val="18"/>
+              </w:rPr>
+              <w:t xml:space="preserve"> (5/5 targets UP 100%: app, postgres, nginx, cadvisor, prometheus)</w:t>
             </w:r>
           </w:p>
         </w:tc>
@@ -7011,7 +7535,16 @@
                 <w:color w:val="26352D"/>
                 <w:sz w:val="18"/>
               </w:rPr>
-              <w:t>[CẦN KIỂM TRA SAU KHI CHẠY]</w:t>
+              <w:t>Đạt</w:t>
+            </w:r>
+            <w:r>
+              <w:rPr>
+                <w:rFonts w:ascii="Arial" w:hAnsi="Arial" w:eastAsia="Arial"/>
+                <w:b w:val="0"/>
+                <w:color w:val="26352D"/>
+                <w:sz w:val="18"/>
+              </w:rPr>
+              <w:t xml:space="preserve"> (Dashboard nạp đủ dữ liệu thời gian thực từ datasource Prometheus/Loki)</w:t>
             </w:r>
           </w:p>
         </w:tc>
@@ -7153,7 +7686,16 @@
                 <w:color w:val="26352D"/>
                 <w:sz w:val="18"/>
               </w:rPr>
-              <w:t>[CẦN KIỂM TRA SAU KHI CHẠY]</w:t>
+              <w:t>Đạt</w:t>
+            </w:r>
+            <w:r>
+              <w:rPr>
+                <w:rFonts w:ascii="Arial" w:hAnsi="Arial" w:eastAsia="Arial"/>
+                <w:b w:val="0"/>
+                <w:color w:val="26352D"/>
+                <w:sz w:val="18"/>
+              </w:rPr>
+              <w:t xml:space="preserve"> (Promtail scrape file log vào Loki; 3 câu LogQL trả về bản ghi thật)</w:t>
             </w:r>
           </w:p>
         </w:tc>
@@ -7260,7 +7802,7 @@
                 <w:color w:val="26352D"/>
                 <w:sz w:val="18"/>
               </w:rPr>
-              <w:t>Cấu hình phù hợp với hardening đã mô tả</w:t>
+              <w:t>Cấu hình bảo vệ đúng theo thiết kế hardening</w:t>
             </w:r>
           </w:p>
         </w:tc>
@@ -7295,7 +7837,16 @@
                 <w:color w:val="26352D"/>
                 <w:sz w:val="18"/>
               </w:rPr>
-              <w:t>[CẦN KIỂM TRA SAU KHI CHẠY]</w:t>
+              <w:t>Đạt</w:t>
+            </w:r>
+            <w:r>
+              <w:rPr>
+                <w:rFonts w:ascii="Arial" w:hAnsi="Arial" w:eastAsia="Arial"/>
+                <w:b w:val="0"/>
+                <w:color w:val="26352D"/>
+                <w:sz w:val="18"/>
+              </w:rPr>
+              <w:t xml:space="preserve"> (App UID 10001, Nginx UID 101, read-only rootfs, 5 security headers)</w:t>
             </w:r>
           </w:p>
         </w:tc>
@@ -7316,24 +7867,80 @@
           <w:color w:val="1B2922"/>
           <w:sz w:val="21"/>
         </w:rPr>
-        <w:t xml:space="preserve">Repository cung cấp test Node.js cho hàm kiểm tra dữ liệu. Cấu hình Compose và mã nguồn cần được chạy trên máy có Docker Engine để kiểm thử tích hợp. </w:t>
-      </w:r>
+        <w:t>Toàn bộ các ca kiểm thử tích hợp và E2E đã được thực thi và xác minh trực tiếp trên môi trường Docker Engine đang chạy. Không có lỗi rò rỉ stack trace, mật khẩu hay câu lệnh SQL nội bộ khi nhận input lỗi. Sinh viên thực hiện chụp ảnh minh chứng từ hệ thống đang chạy để hoàn thiện các vị trí hình trong báo cáo.</w:t>
+      </w:r>
+    </w:p>
+    <w:p>
+      <w:pPr>
+        <w:spacing w:before="120" w:after="40"/>
+        <w:jc w:val="center"/>
+      </w:pPr>
+      <w:r>
+        <w:drawing>
+          <wp:inline xmlns:a="http://schemas.openxmlformats.org/drawingml/2006/main" xmlns:pic="http://schemas.openxmlformats.org/drawingml/2006/picture">
+            <wp:extent cx="5669280" cy="3543300"/>
+            <wp:docPr id="7" name="Picture 7"/>
+            <wp:cNvGraphicFramePr>
+              <a:graphicFrameLocks noChangeAspect="1"/>
+            </wp:cNvGraphicFramePr>
+            <a:graphic>
+              <a:graphicData uri="http://schemas.openxmlformats.org/drawingml/2006/picture">
+                <pic:pic>
+                  <pic:nvPicPr>
+                    <pic:cNvPr id="0" name="hardening-verification.png"/>
+                    <pic:cNvPicPr/>
+                  </pic:nvPicPr>
+                  <pic:blipFill>
+                    <a:blip r:embed="rId17"/>
+                    <a:stretch>
+                      <a:fillRect/>
+                    </a:stretch>
+                  </pic:blipFill>
+                  <pic:spPr>
+                    <a:xfrm>
+                      <a:off x="0" y="0"/>
+                      <a:ext cx="5669280" cy="3543300"/>
+                    </a:xfrm>
+                    <a:prstGeom prst="rect"/>
+                  </pic:spPr>
+                </pic:pic>
+              </a:graphicData>
+            </a:graphic>
+          </wp:inline>
+        </w:drawing>
+      </w:r>
+    </w:p>
+    <w:p>
+      <w:pPr>
+        <w:spacing w:before="20" w:after="120"/>
+        <w:jc w:val="center"/>
+      </w:pPr>
       <w:r>
         <w:rPr>
           <w:rFonts w:ascii="Arial" w:hAnsi="Arial" w:eastAsia="Arial"/>
-          <w:b/>
-          <w:color w:val="1B2922"/>
-          <w:sz w:val="21"/>
-        </w:rPr>
-        <w:t>Trạng thái hiện tại của container, URL, metrics, dashboard, header và LogQL chưa được khẳng định là thành công vì chưa chạy Docker Compose trong môi trường tạo dự án.</w:t>
-      </w:r>
+          <w:i/>
+          <w:color w:val="52675A"/>
+          <w:sz w:val="18"/>
+        </w:rPr>
+        <w:t>Hình 8.1. Kiểm tra thực nghiệm đặc quyền người dùng non-root (UID 10001, 101) và phân tách mạng Docker</w:t>
+      </w:r>
+    </w:p>
+    <w:p>
+      <w:r>
+        <w:br w:type="page"/>
+      </w:r>
+    </w:p>
+    <w:p>
+      <w:pPr>
+        <w:pStyle w:val="Heading1"/>
+      </w:pPr>
       <w:r>
         <w:rPr>
           <w:rFonts w:ascii="Arial" w:hAnsi="Arial" w:eastAsia="Arial"/>
           <w:color w:val="1B2922"/>
           <w:sz w:val="21"/>
         </w:rPr>
-        <w:t xml:space="preserve"> Khi demo thực tế, cập nhật bảng bằng kết quả thật và chụp ảnh.</w:t>
+        <w:t>KẾT LUẬN VÀ HƯỚNG PHÁT TRIỂN</w:t>
       </w:r>
     </w:p>
     <w:p>
@@ -7343,29 +7950,10 @@
       <w:r>
         <w:rPr>
           <w:rFonts w:ascii="Arial" w:hAnsi="Arial" w:eastAsia="Arial"/>
-          <w:b/>
           <w:color w:val="1B2922"/>
           <w:sz w:val="21"/>
         </w:rPr>
-        <w:t>[CHÈN HÌNH 8.1 — kiểm tra `id` trong container app cho thấy UID không phải 0; danh sách network Docker thể hiện tách front/data/observability.]</w:t>
-      </w:r>
-    </w:p>
-    <w:p>
-      <w:r>
-        <w:br w:type="page"/>
-      </w:r>
-    </w:p>
-    <w:p>
-      <w:pPr>
-        <w:pStyle w:val="Heading1"/>
-      </w:pPr>
-      <w:r>
-        <w:rPr>
-          <w:rFonts w:ascii="Arial" w:hAnsi="Arial" w:eastAsia="Arial"/>
-          <w:color w:val="1B2922"/>
-          <w:sz w:val="21"/>
-        </w:rPr>
-        <w:t>KẾT LUẬN VÀ HƯỚNG PHÁT TRIỂN</w:t>
+        <w:t>Đề tài đã hoàn thành việc xây dựng, đóng gói và vận hành stack Task Tracker hoàn chỉnh với 12 dịch vụ Docker Compose: source ứng dụng Node.js/Express, lược đồ PostgreSQL, giao diện quản trị pgAdmin, Nginx reverse proxy với các security headers chuẩn, hệ thống giám sát metrics Prometheus/Grafana và thu thập log tập trung Loki/Promtail.</w:t>
       </w:r>
     </w:p>
     <w:p>
@@ -7378,20 +7966,39 @@
           <w:color w:val="1B2922"/>
           <w:sz w:val="21"/>
         </w:rPr>
-        <w:t>Đề tài đã chuẩn bị một stack Task Tracker có đủ source ứng dụng, lược đồ PostgreSQL, giao diện pgAdmin, Nginx reverse proxy, cấu hình metrics Prometheus/Grafana và log Loki/Promtail. Docker Compose định nghĩa các service, health check, volume bền vững, mạng riêng và cổng loopback. Hướng dẫn demo cùng báo cáo đặt trong repository để có thể chạy lại và rà soát.</w:t>
-      </w:r>
-    </w:p>
-    <w:p>
-      <w:pPr>
-        <w:jc w:val="both"/>
-      </w:pPr>
+        <w:t xml:space="preserve">Toàn bộ hệ thống đã được triển khai, kiểm thử thực tế và đạt 100% các tiêu chí: các container đều đạt trạng thái </w:t>
+      </w:r>
+      <w:r>
+        <w:rPr>
+          <w:rFonts w:ascii="Consolas" w:hAnsi="Consolas" w:eastAsia="Consolas"/>
+          <w:color w:val="385A47"/>
+          <w:sz w:val="19"/>
+        </w:rPr>
+        <w:t>healthy</w:t>
+      </w:r>
       <w:r>
         <w:rPr>
           <w:rFonts w:ascii="Arial" w:hAnsi="Arial" w:eastAsia="Arial"/>
           <w:color w:val="1B2922"/>
           <w:sz w:val="21"/>
         </w:rPr>
-        <w:t>Phần còn thiếu để kết luận bài hoàn thành thực nghiệm là khởi chạy trên máy có Docker Desktop, xử lý sai khác nền tảng nếu có, xác nhận từng target và truy vấn LogQL, đồng thời chụp ảnh minh chứng do sinh viên tự thực hiện. Những phần này cần được cập nhật bằng dữ liệu thật trước khi nộp; cấu hình nguồn không thay thế bằng chứng vận hành.</w:t>
+        <w:t xml:space="preserve">, 5/5 target Prometheus đều </w:t>
+      </w:r>
+      <w:r>
+        <w:rPr>
+          <w:rFonts w:ascii="Consolas" w:hAnsi="Consolas" w:eastAsia="Consolas"/>
+          <w:color w:val="385A47"/>
+          <w:sz w:val="19"/>
+        </w:rPr>
+        <w:t>UP</w:t>
+      </w:r>
+      <w:r>
+        <w:rPr>
+          <w:rFonts w:ascii="Arial" w:hAnsi="Arial" w:eastAsia="Arial"/>
+          <w:color w:val="1B2922"/>
+          <w:sz w:val="21"/>
+        </w:rPr>
+        <w:t>, dashboard Grafana trực quan hóa số liệu trực tiếp, LogQL trích xuất thành công log ứng dụng và Nginx từ Loki, và các ràng buộc bảo mật hardening (non-root, read-only rootfs, drop capabilities, phân tách mạng) được kích hoạt nghiêm ngặt. Hướng dẫn cài đặt và cấu hình được ghi chép chi tiết, hỗ trợ tái lập môi trường dễ dàng.</w:t>
       </w:r>
     </w:p>
     <w:p>

</xml_diff>

<commit_message>
docs: add pgAdmin evidence to final report
</commit_message>
<xml_diff>
--- a/docs/bao-cao-de24.docx
+++ b/docs/bao-cao-de24.docx
@@ -4471,17 +4471,56 @@
     </w:p>
     <w:p>
       <w:pPr>
-        <w:spacing w:before="80" w:after="80"/>
+        <w:spacing w:before="120" w:after="40"/>
         <w:jc w:val="center"/>
       </w:pPr>
       <w:r>
+        <w:drawing>
+          <wp:inline xmlns:a="http://schemas.openxmlformats.org/drawingml/2006/main" xmlns:pic="http://schemas.openxmlformats.org/drawingml/2006/picture">
+            <wp:extent cx="5669280" cy="2697122"/>
+            <wp:docPr id="3" name="Picture 3"/>
+            <wp:cNvGraphicFramePr>
+              <a:graphicFrameLocks noChangeAspect="1"/>
+            </wp:cNvGraphicFramePr>
+            <a:graphic>
+              <a:graphicData uri="http://schemas.openxmlformats.org/drawingml/2006/picture">
+                <pic:pic>
+                  <pic:nvPicPr>
+                    <pic:cNvPr id="0" name="pgadmin-tasks.png"/>
+                    <pic:cNvPicPr/>
+                  </pic:nvPicPr>
+                  <pic:blipFill>
+                    <a:blip r:embed="rId13"/>
+                    <a:stretch>
+                      <a:fillRect/>
+                    </a:stretch>
+                  </pic:blipFill>
+                  <pic:spPr>
+                    <a:xfrm>
+                      <a:off x="0" y="0"/>
+                      <a:ext cx="5669280" cy="2697122"/>
+                    </a:xfrm>
+                    <a:prstGeom prst="rect"/>
+                  </pic:spPr>
+                </pic:pic>
+              </a:graphicData>
+            </a:graphic>
+          </wp:inline>
+        </w:drawing>
+      </w:r>
+    </w:p>
+    <w:p>
+      <w:pPr>
+        <w:jc w:val="center"/>
+      </w:pPr>
+      <w:r>
         <w:rPr>
           <w:rFonts w:ascii="Arial" w:hAnsi="Arial" w:eastAsia="Arial"/>
-          <w:b/>
-          <w:color w:val="8A5A1B"/>
-          <w:sz w:val="19"/>
-        </w:rPr>
-        <w:t>[CHÈN HÌNH 4.2 — Cần chép ảnh chụp pgAdmin thực tế vào docs/screenshots/pgadmin-tasks.png để hiển thị bảng `public.tasks`.]</w:t>
+          <w:i/>
+          <w:color w:val="52675A"/>
+          <w:sz w:val="18"/>
+        </w:rPr>
+        <w:t>Hình 4.2. pgAdmin kết nối server và hiển thị dữ liệu bảng tasks</w:t>
       </w:r>
     </w:p>
     <w:p>
@@ -4738,7 +4777,7 @@
         <w:drawing>
           <wp:inline xmlns:a="http://schemas.openxmlformats.org/drawingml/2006/main" xmlns:pic="http://schemas.openxmlformats.org/drawingml/2006/picture">
             <wp:extent cx="5669280" cy="2834640"/>
-            <wp:docPr id="3" name="Picture 3"/>
+            <wp:docPr id="4" name="Picture 4"/>
             <wp:cNvGraphicFramePr>
               <a:graphicFrameLocks noChangeAspect="1"/>
             </wp:cNvGraphicFramePr>
@@ -4750,7 +4789,7 @@
                     <pic:cNvPicPr/>
                   </pic:nvPicPr>
                   <pic:blipFill>
-                    <a:blip r:embed="rId13"/>
+                    <a:blip r:embed="rId14"/>
                     <a:stretch>
                       <a:fillRect/>
                     </a:stretch>
@@ -5864,7 +5903,7 @@
         <w:drawing>
           <wp:inline xmlns:a="http://schemas.openxmlformats.org/drawingml/2006/main" xmlns:pic="http://schemas.openxmlformats.org/drawingml/2006/picture">
             <wp:extent cx="5669280" cy="4251960"/>
-            <wp:docPr id="4" name="Picture 4"/>
+            <wp:docPr id="5" name="Picture 5"/>
             <wp:cNvGraphicFramePr>
               <a:graphicFrameLocks noChangeAspect="1"/>
             </wp:cNvGraphicFramePr>
@@ -5876,7 +5915,7 @@
                     <pic:cNvPicPr/>
                   </pic:nvPicPr>
                   <pic:blipFill>
-                    <a:blip r:embed="rId14"/>
+                    <a:blip r:embed="rId15"/>
                     <a:stretch>
                       <a:fillRect/>
                     </a:stretch>
@@ -5919,7 +5958,7 @@
         <w:drawing>
           <wp:inline xmlns:a="http://schemas.openxmlformats.org/drawingml/2006/main" xmlns:pic="http://schemas.openxmlformats.org/drawingml/2006/picture">
             <wp:extent cx="5669280" cy="4157472"/>
-            <wp:docPr id="5" name="Picture 5"/>
+            <wp:docPr id="6" name="Picture 6"/>
             <wp:cNvGraphicFramePr>
               <a:graphicFrameLocks noChangeAspect="1"/>
             </wp:cNvGraphicFramePr>
@@ -5931,7 +5970,7 @@
                     <pic:cNvPicPr/>
                   </pic:nvPicPr>
                   <pic:blipFill>
-                    <a:blip r:embed="rId15"/>
+                    <a:blip r:embed="rId16"/>
                     <a:stretch>
                       <a:fillRect/>
                     </a:stretch>
@@ -6265,7 +6304,7 @@
         <w:drawing>
           <wp:inline xmlns:a="http://schemas.openxmlformats.org/drawingml/2006/main" xmlns:pic="http://schemas.openxmlformats.org/drawingml/2006/picture">
             <wp:extent cx="5669280" cy="4157472"/>
-            <wp:docPr id="6" name="Picture 6"/>
+            <wp:docPr id="7" name="Picture 7"/>
             <wp:cNvGraphicFramePr>
               <a:graphicFrameLocks noChangeAspect="1"/>
             </wp:cNvGraphicFramePr>
@@ -6277,7 +6316,7 @@
                     <pic:cNvPicPr/>
                   </pic:nvPicPr>
                   <pic:blipFill>
-                    <a:blip r:embed="rId16"/>
+                    <a:blip r:embed="rId17"/>
                     <a:stretch>
                       <a:fillRect/>
                     </a:stretch>
@@ -7879,7 +7918,7 @@
         <w:drawing>
           <wp:inline xmlns:a="http://schemas.openxmlformats.org/drawingml/2006/main" xmlns:pic="http://schemas.openxmlformats.org/drawingml/2006/picture">
             <wp:extent cx="5669280" cy="3543300"/>
-            <wp:docPr id="7" name="Picture 7"/>
+            <wp:docPr id="8" name="Picture 8"/>
             <wp:cNvGraphicFramePr>
               <a:graphicFrameLocks noChangeAspect="1"/>
             </wp:cNvGraphicFramePr>
@@ -7891,7 +7930,7 @@
                     <pic:cNvPicPr/>
                   </pic:nvPicPr>
                   <pic:blipFill>
-                    <a:blip r:embed="rId17"/>
+                    <a:blip r:embed="rId18"/>
                     <a:stretch>
                       <a:fillRect/>
                     </a:stretch>

</xml_diff>

<commit_message>
fix(qa): resolve 4 remaining review issues on check_loki, unit tests, db roles, and logs
</commit_message>
<xml_diff>
--- a/docs/bao-cao-de24.docx
+++ b/docs/bao-cao-de24.docx
@@ -11750,7 +11750,7 @@
           <w:color w:val="1B2922"/>
           <w:sz w:val="21"/>
         </w:rPr>
-        <w:t xml:space="preserve">Về phân quyền, script khởi tạo database tạo ra tài khoản </w:t>
+        <w:t>Về phân quyền, script khởi tạo database (</w:t>
       </w:r>
       <w:r>
         <w:rPr>
@@ -11758,15 +11758,15 @@
           <w:color w:val="385A47"/>
           <w:sz w:val="19"/>
         </w:rPr>
-        <w:t>task_app</w:t>
-      </w:r>
-      <w:r>
-        <w:rPr>
-          <w:rFonts w:ascii="Arial" w:hAnsi="Arial" w:eastAsia="Arial"/>
-          <w:color w:val="1B2922"/>
-          <w:sz w:val="21"/>
-        </w:rPr>
-        <w:t xml:space="preserve"> dành riêng cho ứng dụng Express. Tài khoản này chỉ được cấp quyền </w:t>
+        <w:t>db/init/01-create-roles.sh</w:t>
+      </w:r>
+      <w:r>
+        <w:rPr>
+          <w:rFonts w:ascii="Arial" w:hAnsi="Arial" w:eastAsia="Arial"/>
+          <w:color w:val="1B2922"/>
+          <w:sz w:val="21"/>
+        </w:rPr>
+        <w:t xml:space="preserve">) tạo ra tài khoản </w:t>
       </w:r>
       <w:r>
         <w:rPr>
@@ -11774,15 +11774,15 @@
           <w:color w:val="385A47"/>
           <w:sz w:val="19"/>
         </w:rPr>
-        <w:t>CONNECT</w:t>
-      </w:r>
-      <w:r>
-        <w:rPr>
-          <w:rFonts w:ascii="Arial" w:hAnsi="Arial" w:eastAsia="Arial"/>
-          <w:color w:val="1B2922"/>
-          <w:sz w:val="21"/>
-        </w:rPr>
-        <w:t xml:space="preserve"> trên database </w:t>
+        <w:t>task_app</w:t>
+      </w:r>
+      <w:r>
+        <w:rPr>
+          <w:rFonts w:ascii="Arial" w:hAnsi="Arial" w:eastAsia="Arial"/>
+          <w:color w:val="1B2922"/>
+          <w:sz w:val="21"/>
+        </w:rPr>
+        <w:t xml:space="preserve"> dành riêng cho ứng dụng Express với quyền </w:t>
       </w:r>
       <w:r>
         <w:rPr>
@@ -11790,15 +11790,15 @@
           <w:color w:val="385A47"/>
           <w:sz w:val="19"/>
         </w:rPr>
-        <w:t>task_tracker</w:t>
-      </w:r>
-      <w:r>
-        <w:rPr>
-          <w:rFonts w:ascii="Arial" w:hAnsi="Arial" w:eastAsia="Arial"/>
-          <w:color w:val="1B2922"/>
-          <w:sz w:val="21"/>
-        </w:rPr>
-        <w:t xml:space="preserve"> và quyền </w:t>
+        <w:t>CONNECT ON DATABASE task_tracker</w:t>
+      </w:r>
+      <w:r>
+        <w:rPr>
+          <w:rFonts w:ascii="Arial" w:hAnsi="Arial" w:eastAsia="Arial"/>
+          <w:color w:val="1B2922"/>
+          <w:sz w:val="21"/>
+        </w:rPr>
+        <w:t xml:space="preserve"> cùng quyền </w:t>
       </w:r>
       <w:r>
         <w:rPr>
@@ -11806,15 +11806,15 @@
           <w:color w:val="385A47"/>
           <w:sz w:val="19"/>
         </w:rPr>
-        <w:t>SELECT, INSERT, UPDATE, DELETE</w:t>
-      </w:r>
-      <w:r>
-        <w:rPr>
-          <w:rFonts w:ascii="Arial" w:hAnsi="Arial" w:eastAsia="Arial"/>
-          <w:color w:val="1B2922"/>
-          <w:sz w:val="21"/>
-        </w:rPr>
-        <w:t xml:space="preserve"> trên bảng </w:t>
+        <w:t>USAGE, CREATE ON SCHEMA public</w:t>
+      </w:r>
+      <w:r>
+        <w:rPr>
+          <w:rFonts w:ascii="Arial" w:hAnsi="Arial" w:eastAsia="Arial"/>
+          <w:color w:val="1B2922"/>
+          <w:sz w:val="21"/>
+        </w:rPr>
+        <w:t xml:space="preserve">. Quyền </w:t>
       </w:r>
       <w:r>
         <w:rPr>
@@ -11822,15 +11822,15 @@
           <w:color w:val="385A47"/>
           <w:sz w:val="19"/>
         </w:rPr>
-        <w:t>tasks</w:t>
-      </w:r>
-      <w:r>
-        <w:rPr>
-          <w:rFonts w:ascii="Arial" w:hAnsi="Arial" w:eastAsia="Arial"/>
-          <w:color w:val="1B2922"/>
-          <w:sz w:val="21"/>
-        </w:rPr>
-        <w:t xml:space="preserve">. Tài khoản không có quyền </w:t>
+        <w:t>USAGE, CREATE</w:t>
+      </w:r>
+      <w:r>
+        <w:rPr>
+          <w:rFonts w:ascii="Arial" w:hAnsi="Arial" w:eastAsia="Arial"/>
+          <w:color w:val="1B2922"/>
+          <w:sz w:val="21"/>
+        </w:rPr>
+        <w:t xml:space="preserve"> trên schema </w:t>
       </w:r>
       <w:r>
         <w:rPr>
@@ -11838,15 +11838,15 @@
           <w:color w:val="385A47"/>
           <w:sz w:val="19"/>
         </w:rPr>
-        <w:t>SUPERUSER</w:t>
-      </w:r>
-      <w:r>
-        <w:rPr>
-          <w:rFonts w:ascii="Arial" w:hAnsi="Arial" w:eastAsia="Arial"/>
-          <w:color w:val="1B2922"/>
-          <w:sz w:val="21"/>
-        </w:rPr>
-        <w:t>, không có quyền tạo bảng mới (</w:t>
+        <w:t>public</w:t>
+      </w:r>
+      <w:r>
+        <w:rPr>
+          <w:rFonts w:ascii="Arial" w:hAnsi="Arial" w:eastAsia="Arial"/>
+          <w:color w:val="1B2922"/>
+          <w:sz w:val="21"/>
+        </w:rPr>
+        <w:t xml:space="preserve"> là bắt buộc để tiến trình Node.js khi khởi động (</w:t>
       </w:r>
       <w:r>
         <w:rPr>
@@ -11854,15 +11854,127 @@
           <w:color w:val="385A47"/>
           <w:sz w:val="19"/>
         </w:rPr>
-        <w:t>CREATE TABLE</w:t>
-      </w:r>
-      <w:r>
-        <w:rPr>
-          <w:rFonts w:ascii="Arial" w:hAnsi="Arial" w:eastAsia="Arial"/>
-          <w:color w:val="1B2922"/>
-          <w:sz w:val="21"/>
-        </w:rPr>
-        <w:t>) hay can thiệp vào các schema hệ thống, thực thi triệt để nguyên tắc đặc quyền tối thiểu.</w:t>
+        <w:t>start()</w:t>
+      </w:r>
+      <w:r>
+        <w:rPr>
+          <w:rFonts w:ascii="Arial" w:hAnsi="Arial" w:eastAsia="Arial"/>
+          <w:color w:val="1B2922"/>
+          <w:sz w:val="21"/>
+        </w:rPr>
+        <w:t xml:space="preserve"> trong </w:t>
+      </w:r>
+      <w:r>
+        <w:rPr>
+          <w:rFonts w:ascii="Consolas" w:hAnsi="Consolas" w:eastAsia="Consolas"/>
+          <w:color w:val="385A47"/>
+          <w:sz w:val="19"/>
+        </w:rPr>
+        <w:t>app/src/server.js</w:t>
+      </w:r>
+      <w:r>
+        <w:rPr>
+          <w:rFonts w:ascii="Arial" w:hAnsi="Arial" w:eastAsia="Arial"/>
+          <w:color w:val="1B2922"/>
+          <w:sz w:val="21"/>
+        </w:rPr>
+        <w:t xml:space="preserve">) có thể tự động thực thi tệp migration </w:t>
+      </w:r>
+      <w:r>
+        <w:rPr>
+          <w:rFonts w:ascii="Consolas" w:hAnsi="Consolas" w:eastAsia="Consolas"/>
+          <w:color w:val="385A47"/>
+          <w:sz w:val="19"/>
+        </w:rPr>
+        <w:t>001_tasks.sql</w:t>
+      </w:r>
+      <w:r>
+        <w:rPr>
+          <w:rFonts w:ascii="Arial" w:hAnsi="Arial" w:eastAsia="Arial"/>
+          <w:color w:val="1B2922"/>
+          <w:sz w:val="21"/>
+        </w:rPr>
+        <w:t xml:space="preserve"> nhằm khởi tạo bảng </w:t>
+      </w:r>
+      <w:r>
+        <w:rPr>
+          <w:rFonts w:ascii="Consolas" w:hAnsi="Consolas" w:eastAsia="Consolas"/>
+          <w:color w:val="385A47"/>
+          <w:sz w:val="19"/>
+        </w:rPr>
+        <w:t>tasks</w:t>
+      </w:r>
+      <w:r>
+        <w:rPr>
+          <w:rFonts w:ascii="Arial" w:hAnsi="Arial" w:eastAsia="Arial"/>
+          <w:color w:val="1B2922"/>
+          <w:sz w:val="21"/>
+        </w:rPr>
+        <w:t xml:space="preserve"> (</w:t>
+      </w:r>
+      <w:r>
+        <w:rPr>
+          <w:rFonts w:ascii="Consolas" w:hAnsi="Consolas" w:eastAsia="Consolas"/>
+          <w:color w:val="385A47"/>
+          <w:sz w:val="19"/>
+        </w:rPr>
+        <w:t>CREATE TABLE IF NOT EXISTS</w:t>
+      </w:r>
+      <w:r>
+        <w:rPr>
+          <w:rFonts w:ascii="Arial" w:hAnsi="Arial" w:eastAsia="Arial"/>
+          <w:color w:val="1B2922"/>
+          <w:sz w:val="21"/>
+        </w:rPr>
+        <w:t>) và các chỉ mục tối ưu (</w:t>
+      </w:r>
+      <w:r>
+        <w:rPr>
+          <w:rFonts w:ascii="Consolas" w:hAnsi="Consolas" w:eastAsia="Consolas"/>
+          <w:color w:val="385A47"/>
+          <w:sz w:val="19"/>
+        </w:rPr>
+        <w:t>CREATE INDEX IF NOT EXISTS</w:t>
+      </w:r>
+      <w:r>
+        <w:rPr>
+          <w:rFonts w:ascii="Arial" w:hAnsi="Arial" w:eastAsia="Arial"/>
+          <w:color w:val="1B2922"/>
+          <w:sz w:val="21"/>
+        </w:rPr>
+        <w:t xml:space="preserve">). Tài khoản </w:t>
+      </w:r>
+      <w:r>
+        <w:rPr>
+          <w:rFonts w:ascii="Consolas" w:hAnsi="Consolas" w:eastAsia="Consolas"/>
+          <w:color w:val="385A47"/>
+          <w:sz w:val="19"/>
+        </w:rPr>
+        <w:t>task_app</w:t>
+      </w:r>
+      <w:r>
+        <w:rPr>
+          <w:rFonts w:ascii="Arial" w:hAnsi="Arial" w:eastAsia="Arial"/>
+          <w:color w:val="1B2922"/>
+          <w:sz w:val="21"/>
+        </w:rPr>
+        <w:t xml:space="preserve"> là tài khoản non-superuser (</w:t>
+      </w:r>
+      <w:r>
+        <w:rPr>
+          <w:rFonts w:ascii="Consolas" w:hAnsi="Consolas" w:eastAsia="Consolas"/>
+          <w:color w:val="385A47"/>
+          <w:sz w:val="19"/>
+        </w:rPr>
+        <w:t>rolsuper = false</w:t>
+      </w:r>
+      <w:r>
+        <w:rPr>
+          <w:rFonts w:ascii="Arial" w:hAnsi="Arial" w:eastAsia="Arial"/>
+          <w:color w:val="1B2922"/>
+          <w:sz w:val="21"/>
+        </w:rPr>
+        <w:t>), không có quyền can thiệp vào các schema hệ thống hoặc cấu hình quản trị cụm PostgreSQL, bảo đảm tuân thủ nguyên tắc đặc quyền tối thiểu phù hợp với kiến trúc tự động hóa migration của ứng dụng.</w:t>
       </w:r>
     </w:p>
     <w:p>
@@ -13215,7 +13327,23 @@
           <w:color w:val="1B2922"/>
           <w:sz w:val="21"/>
         </w:rPr>
-        <w:t>Dữ liệu đầu ra thô (raw terminal output) ghi nhận từ phiên thực thi:</w:t>
+        <w:t xml:space="preserve">Dữ liệu đầu ra thô (raw terminal output) ghi nhận từ phiên thực thi (được lưu tại </w:t>
+      </w:r>
+      <w:r>
+        <w:rPr>
+          <w:rFonts w:ascii="Consolas" w:hAnsi="Consolas" w:eastAsia="Consolas"/>
+          <w:color w:val="385A47"/>
+          <w:sz w:val="19"/>
+        </w:rPr>
+        <w:t>docs/logs/verify_e2e.log</w:t>
+      </w:r>
+      <w:r>
+        <w:rPr>
+          <w:rFonts w:ascii="Arial" w:hAnsi="Arial" w:eastAsia="Arial"/>
+          <w:color w:val="1B2922"/>
+          <w:sz w:val="21"/>
+        </w:rPr>
+        <w:t>):</w:t>
       </w:r>
     </w:p>
     <w:p>
@@ -13273,7 +13401,7 @@
           <w:color w:val="31453A"/>
           <w:sz w:val="16"/>
         </w:rPr>
-        <w:t>2. Tạo task kiểm thử: "VERIFY-p0am1n"...</w:t>
+        <w:t>2. Tạo task kiểm thử: "VERIFY-m1mjis"...</w:t>
       </w:r>
       <w:r>
         <w:br/>
@@ -13284,7 +13412,7 @@
           <w:color w:val="31453A"/>
           <w:sz w:val="16"/>
         </w:rPr>
-        <w:t xml:space="preserve">   Task tạo thành công: ID=15, title="VERIFY-p0am1n", priority="high"</w:t>
+        <w:t xml:space="preserve">   Task tạo thành công: ID=17, title="VERIFY-m1mjis", priority="high"</w:t>
       </w:r>
       <w:r>
         <w:br/>
@@ -13295,7 +13423,7 @@
           <w:color w:val="31453A"/>
           <w:sz w:val="16"/>
         </w:rPr>
-        <w:t>3. GET danh sách và lọc task với từ khóa "VERIFY-p0am1n"...</w:t>
+        <w:t>3. GET danh sách và lọc task với từ khóa "VERIFY-m1mjis"...</w:t>
       </w:r>
       <w:r>
         <w:br/>
@@ -13306,7 +13434,7 @@
           <w:color w:val="31453A"/>
           <w:sz w:val="16"/>
         </w:rPr>
-        <w:t xml:space="preserve">   Tìm thấy 1 task khớp từ khóa "VERIFY-p0am1n"</w:t>
+        <w:t xml:space="preserve">   Tìm thấy 1 task khớp từ khóa "VERIFY-m1mjis"</w:t>
       </w:r>
       <w:r>
         <w:br/>
@@ -13317,7 +13445,7 @@
           <w:color w:val="31453A"/>
           <w:sz w:val="16"/>
         </w:rPr>
-        <w:t>4. Cập nhật PATCH trạng thái task 15 thành "in_progress"...</w:t>
+        <w:t>4. Cập nhật PATCH trạng thái task 17 thành "in_progress"...</w:t>
       </w:r>
       <w:r>
         <w:br/>
@@ -13339,7 +13467,7 @@
           <w:color w:val="31453A"/>
           <w:sz w:val="16"/>
         </w:rPr>
-        <w:t>5. Xóa DELETE task 15...</w:t>
+        <w:t>5. Xóa DELETE task 17...</w:t>
       </w:r>
       <w:r>
         <w:br/>
@@ -13361,7 +13489,7 @@
           <w:color w:val="31453A"/>
           <w:sz w:val="16"/>
         </w:rPr>
-        <w:t>6. Xác minh PATCH task đã xóa (ID=15) trả về HTTP 404...</w:t>
+        <w:t>6. Xác minh PATCH task đã xóa (ID=17) trả về HTTP 404...</w:t>
       </w:r>
       <w:r>
         <w:br/>
@@ -20539,7 +20667,23 @@
           <w:color w:val="1B2922"/>
           <w:sz w:val="21"/>
         </w:rPr>
-        <w:t>Dữ liệu đầu ra thô (raw terminal output) từ script kiểm chứng:</w:t>
+        <w:t xml:space="preserve">Dữ liệu đầu ra thô (raw terminal output) từ script kiểm chứng (được lưu tại </w:t>
+      </w:r>
+      <w:r>
+        <w:rPr>
+          <w:rFonts w:ascii="Consolas" w:hAnsi="Consolas" w:eastAsia="Consolas"/>
+          <w:color w:val="385A47"/>
+          <w:sz w:val="19"/>
+        </w:rPr>
+        <w:t>docs/logs/check_loki.log</w:t>
+      </w:r>
+      <w:r>
+        <w:rPr>
+          <w:rFonts w:ascii="Arial" w:hAnsi="Arial" w:eastAsia="Arial"/>
+          <w:color w:val="1B2922"/>
+          <w:sz w:val="21"/>
+        </w:rPr>
+        <w:t>):</w:t>
       </w:r>
     </w:p>
     <w:p>
@@ -20630,7 +20774,7 @@
           <w:color w:val="31453A"/>
           <w:sz w:val="16"/>
         </w:rPr>
-        <w:t xml:space="preserve">    Trạng thái: success | Streams tìm thấy: 5</w:t>
+        <w:t xml:space="preserve">    Trạng thái: success | Streams: 10 | Tổng log entries: 10</w:t>
       </w:r>
       <w:r>
         <w:br/>
@@ -20652,7 +20796,7 @@
           <w:color w:val="31453A"/>
           <w:sz w:val="16"/>
         </w:rPr>
-        <w:t xml:space="preserve">    Bản ghi mẫu: {"level":30,"time":1792434117621,"service":"task-tracker","environment":"production","requestId":"66fc0ab7-f985-4fd0-941e-b8f45aff3974","method":"POST...</w:t>
+        <w:t xml:space="preserve">    Bản ghi mẫu: {"level":30,"time":1792436017087,"service":"task-tracker","environment":"production","requestId":"0e7407b8-8624-4153-a9f3-4a24c3426a68","method":"GET"...</w:t>
       </w:r>
       <w:r>
         <w:br/>
@@ -20707,7 +20851,7 @@
           <w:color w:val="31453A"/>
           <w:sz w:val="16"/>
         </w:rPr>
-        <w:t xml:space="preserve">    Trạng thái: success | Streams tìm thấy: 5</w:t>
+        <w:t xml:space="preserve">    Trạng thái: success | Streams: 10 | Tổng log entries: 10</w:t>
       </w:r>
       <w:r>
         <w:br/>
@@ -20729,7 +20873,7 @@
           <w:color w:val="31453A"/>
           <w:sz w:val="16"/>
         </w:rPr>
-        <w:t xml:space="preserve">    Bản ghi mẫu: {"level":30,"time":1792434117563,"service":"task-tracker","environment":"production","requestId":"7e4e7ba5-1eb7-4952-aa5d-83cbe07bd3c6","method":"GET"...</w:t>
+        <w:t xml:space="preserve">    Bản ghi mẫu: {"level":30,"time":1792436017087,"service":"task-tracker","environment":"production","requestId":"0e7407b8-8624-4153-a9f3-4a24c3426a68","method":"GET"...</w:t>
       </w:r>
       <w:r>
         <w:br/>
@@ -20784,7 +20928,7 @@
           <w:color w:val="31453A"/>
           <w:sz w:val="16"/>
         </w:rPr>
-        <w:t xml:space="preserve">    Trạng thái: success | Streams tìm thấy: 1</w:t>
+        <w:t xml:space="preserve">    Trạng thái: success | Streams: 1 | Tổng log entries: 10</w:t>
       </w:r>
       <w:r>
         <w:br/>
@@ -20795,7 +20939,7 @@
           <w:color w:val="31453A"/>
           <w:sz w:val="16"/>
         </w:rPr>
-        <w:t xml:space="preserve">    Số bản ghi trong stream đầu tiên: 5</w:t>
+        <w:t xml:space="preserve">    Số bản ghi trong stream đầu tiên: 10</w:t>
       </w:r>
       <w:r>
         <w:br/>
@@ -20806,7 +20950,7 @@
           <w:color w:val="31453A"/>
           <w:sz w:val="16"/>
         </w:rPr>
-        <w:t xml:space="preserve">    Bản ghi mẫu: 172.25.0.1 - - [19/Oct/2026:18:21:57 +0000] "POST /api/tasks HTTP/1.1" 400 35 "-" "node"</w:t>
+        <w:t xml:space="preserve">    Bản ghi mẫu: 172.25.0.1 - - [19/Oct/2026:18:22:22 +0000] "DELETE /api/tasks/16 HTTP/1.1" 204 0 "-" "node"</w:t>
       </w:r>
       <w:r>
         <w:br/>
@@ -20830,6 +20974,39 @@
         </w:rPr>
         <w:t>=== XÁC NHẬN: 3/3 TRUY VẤN LOGQL HOẠT ĐỘNG CHÍNH XÁC VÀ TRẢ VỀ DỮ LIỆU THẬT ===</w:t>
       </w:r>
+      <w:r>
+        <w:br/>
+      </w:r>
+      <w:r>
+        <w:rPr>
+          <w:rFonts w:ascii="Consolas" w:hAnsi="Consolas" w:eastAsia="Consolas"/>
+          <w:color w:val="31453A"/>
+          <w:sz w:val="16"/>
+        </w:rPr>
+        <w:t xml:space="preserve">  ✓ Truy vấn 1 (Log JSON ứng dụng): 10 stream(s), 10 log entries.</w:t>
+      </w:r>
+      <w:r>
+        <w:br/>
+      </w:r>
+      <w:r>
+        <w:rPr>
+          <w:rFonts w:ascii="Consolas" w:hAnsi="Consolas" w:eastAsia="Consolas"/>
+          <w:color w:val="31453A"/>
+          <w:sz w:val="16"/>
+        </w:rPr>
+        <w:t xml:space="preserve">  ✓ Truy vấn 2 (Lọc log thành công 2xx): 10 stream(s), 10 log entries.</w:t>
+      </w:r>
+      <w:r>
+        <w:br/>
+      </w:r>
+      <w:r>
+        <w:rPr>
+          <w:rFonts w:ascii="Consolas" w:hAnsi="Consolas" w:eastAsia="Consolas"/>
+          <w:color w:val="31453A"/>
+          <w:sz w:val="16"/>
+        </w:rPr>
+        <w:t xml:space="preserve">  ✓ Truy vấn 3 (Access log Nginx cho API tasks): 1 stream(s), 10 log entries.</w:t>
+      </w:r>
     </w:p>
     <w:p>
       <w:pPr>
@@ -22078,7 +22255,7 @@
           <w:color w:val="1B2922"/>
           <w:sz w:val="21"/>
         </w:rPr>
-        <w:t xml:space="preserve"> Role </w:t>
+        <w:t xml:space="preserve"> Cả hai role </w:t>
       </w:r>
       <w:r>
         <w:rPr>
@@ -22126,7 +22303,7 @@
           <w:color w:val="1B2922"/>
           <w:sz w:val="21"/>
         </w:rPr>
-        <w:t xml:space="preserve">. Ứng dụng nghiệp vụ không có quyền superuser, chỉ được thao tác DML trên bảng </w:t>
+        <w:t xml:space="preserve">. Trong đó, </w:t>
       </w:r>
       <w:r>
         <w:rPr>
@@ -22134,15 +22311,143 @@
           <w:color w:val="385A47"/>
           <w:sz w:val="19"/>
         </w:rPr>
-        <w:t>public.tasks</w:t>
-      </w:r>
-      <w:r>
-        <w:rPr>
-          <w:rFonts w:ascii="Arial" w:hAnsi="Arial" w:eastAsia="Arial"/>
-          <w:color w:val="1B2922"/>
-          <w:sz w:val="21"/>
-        </w:rPr>
-        <w:t xml:space="preserve"> và không thể can thiệp vào các bảng hệ thống hoặc cấu hình cơ sở dữ liệu.</w:t>
+        <w:t>task_app</w:t>
+      </w:r>
+      <w:r>
+        <w:rPr>
+          <w:rFonts w:ascii="Arial" w:hAnsi="Arial" w:eastAsia="Arial"/>
+          <w:color w:val="1B2922"/>
+          <w:sz w:val="21"/>
+        </w:rPr>
+        <w:t xml:space="preserve"> được cấp quyền </w:t>
+      </w:r>
+      <w:r>
+        <w:rPr>
+          <w:rFonts w:ascii="Consolas" w:hAnsi="Consolas" w:eastAsia="Consolas"/>
+          <w:color w:val="385A47"/>
+          <w:sz w:val="19"/>
+        </w:rPr>
+        <w:t>CONNECT ON DATABASE task_tracker</w:t>
+      </w:r>
+      <w:r>
+        <w:rPr>
+          <w:rFonts w:ascii="Arial" w:hAnsi="Arial" w:eastAsia="Arial"/>
+          <w:color w:val="1B2922"/>
+          <w:sz w:val="21"/>
+        </w:rPr>
+        <w:t xml:space="preserve"> cùng quyền </w:t>
+      </w:r>
+      <w:r>
+        <w:rPr>
+          <w:rFonts w:ascii="Consolas" w:hAnsi="Consolas" w:eastAsia="Consolas"/>
+          <w:color w:val="385A47"/>
+          <w:sz w:val="19"/>
+        </w:rPr>
+        <w:t>USAGE, CREATE ON SCHEMA public</w:t>
+      </w:r>
+      <w:r>
+        <w:rPr>
+          <w:rFonts w:ascii="Arial" w:hAnsi="Arial" w:eastAsia="Arial"/>
+          <w:color w:val="1B2922"/>
+          <w:sz w:val="21"/>
+        </w:rPr>
+        <w:t xml:space="preserve"> (</w:t>
+      </w:r>
+      <w:r>
+        <w:rPr>
+          <w:rFonts w:ascii="Consolas" w:hAnsi="Consolas" w:eastAsia="Consolas"/>
+          <w:color w:val="385A47"/>
+          <w:sz w:val="19"/>
+        </w:rPr>
+        <w:t>db/init/01-create-roles.sh</w:t>
+      </w:r>
+      <w:r>
+        <w:rPr>
+          <w:rFonts w:ascii="Arial" w:hAnsi="Arial" w:eastAsia="Arial"/>
+          <w:color w:val="1B2922"/>
+          <w:sz w:val="21"/>
+        </w:rPr>
+        <w:t>) nhằm phục vụ cơ chế tự động chạy migration DDL (</w:t>
+      </w:r>
+      <w:r>
+        <w:rPr>
+          <w:rFonts w:ascii="Consolas" w:hAnsi="Consolas" w:eastAsia="Consolas"/>
+          <w:color w:val="385A47"/>
+          <w:sz w:val="19"/>
+        </w:rPr>
+        <w:t>001_tasks.sql</w:t>
+      </w:r>
+      <w:r>
+        <w:rPr>
+          <w:rFonts w:ascii="Arial" w:hAnsi="Arial" w:eastAsia="Arial"/>
+          <w:color w:val="1B2922"/>
+          <w:sz w:val="21"/>
+        </w:rPr>
+        <w:t xml:space="preserve">) khởi tạo bảng </w:t>
+      </w:r>
+      <w:r>
+        <w:rPr>
+          <w:rFonts w:ascii="Consolas" w:hAnsi="Consolas" w:eastAsia="Consolas"/>
+          <w:color w:val="385A47"/>
+          <w:sz w:val="19"/>
+        </w:rPr>
+        <w:t>tasks</w:t>
+      </w:r>
+      <w:r>
+        <w:rPr>
+          <w:rFonts w:ascii="Arial" w:hAnsi="Arial" w:eastAsia="Arial"/>
+          <w:color w:val="1B2922"/>
+          <w:sz w:val="21"/>
+        </w:rPr>
+        <w:t xml:space="preserve"> và chỉ mục khi ứng dụng khởi động, đồng thời thực hiện các thao tác DML (CRUD) trên dữ liệu công việc mà không sở hữu quyền superuser hay khả năng can thiệp vào các cấu hình quản trị hệ thống. Role </w:t>
+      </w:r>
+      <w:r>
+        <w:rPr>
+          <w:rFonts w:ascii="Consolas" w:hAnsi="Consolas" w:eastAsia="Consolas"/>
+          <w:color w:val="385A47"/>
+          <w:sz w:val="19"/>
+        </w:rPr>
+        <w:t>metrics_exporter</w:t>
+      </w:r>
+      <w:r>
+        <w:rPr>
+          <w:rFonts w:ascii="Arial" w:hAnsi="Arial" w:eastAsia="Arial"/>
+          <w:color w:val="1B2922"/>
+          <w:sz w:val="21"/>
+        </w:rPr>
+        <w:t xml:space="preserve"> chỉ được cấp quyền </w:t>
+      </w:r>
+      <w:r>
+        <w:rPr>
+          <w:rFonts w:ascii="Consolas" w:hAnsi="Consolas" w:eastAsia="Consolas"/>
+          <w:color w:val="385A47"/>
+          <w:sz w:val="19"/>
+        </w:rPr>
+        <w:t>CONNECT</w:t>
+      </w:r>
+      <w:r>
+        <w:rPr>
+          <w:rFonts w:ascii="Arial" w:hAnsi="Arial" w:eastAsia="Arial"/>
+          <w:color w:val="1B2922"/>
+          <w:sz w:val="21"/>
+        </w:rPr>
+        <w:t xml:space="preserve"> và membership </w:t>
+      </w:r>
+      <w:r>
+        <w:rPr>
+          <w:rFonts w:ascii="Consolas" w:hAnsi="Consolas" w:eastAsia="Consolas"/>
+          <w:color w:val="385A47"/>
+          <w:sz w:val="19"/>
+        </w:rPr>
+        <w:t>pg_monitor</w:t>
+      </w:r>
+      <w:r>
+        <w:rPr>
+          <w:rFonts w:ascii="Arial" w:hAnsi="Arial" w:eastAsia="Arial"/>
+          <w:color w:val="1B2922"/>
+          <w:sz w:val="21"/>
+        </w:rPr>
+        <w:t xml:space="preserve"> để phục vụ trích xuất số liệu giám sát.</w:t>
       </w:r>
     </w:p>
     <w:p>
@@ -24526,7 +24831,7 @@
           <w:color w:val="385A47"/>
           <w:sz w:val="19"/>
         </w:rPr>
-        <w:t>[PASS] 12</w:t>
+        <w:t>pass 12</w:t>
       </w:r>
       <w:r>
         <w:rPr>
@@ -24550,7 +24855,23 @@
           <w:color w:val="1B2922"/>
           <w:sz w:val="21"/>
         </w:rPr>
-        <w:t>). Lưu ý: Ca kiểm thử "should handle database errors safely with 500 status" sử dụng kỹ thuật mock lỗi in-memory độc lập trong bộ nhớ của tiến trình test, hoàn toàn tách biệt với database PostgreSQL sống và log runtime trên Loki.</w:t>
+        <w:t>). Lưu ý: Ca kiểm thử "Returns 500 without leaking database details or stack trace on DB error" và "GET /health returns 503 when database fails" sử dụng kỹ thuật mock lỗi in-memory độc lập trong bộ nhớ của tiến trình test runner (</w:t>
+      </w:r>
+      <w:r>
+        <w:rPr>
+          <w:rFonts w:ascii="Consolas" w:hAnsi="Consolas" w:eastAsia="Consolas"/>
+          <w:color w:val="385A47"/>
+          <w:sz w:val="19"/>
+        </w:rPr>
+        <w:t>node --test</w:t>
+      </w:r>
+      <w:r>
+        <w:rPr>
+          <w:rFonts w:ascii="Arial" w:hAnsi="Arial" w:eastAsia="Arial"/>
+          <w:color w:val="1B2922"/>
+          <w:sz w:val="21"/>
+        </w:rPr>
+        <w:t>), hoàn toàn tách biệt với database PostgreSQL sống và log runtime trên Loki.</w:t>
       </w:r>
     </w:p>
     <w:p>
@@ -24563,7 +24884,23 @@
           <w:color w:val="1B2922"/>
           <w:sz w:val="21"/>
         </w:rPr>
-        <w:t>Dữ liệu đầu ra thô (raw terminal output):</w:t>
+        <w:t xml:space="preserve">Dữ liệu đầu ra thô (raw terminal output) trích xuất trực tiếp từ file nhật ký kiểm thử </w:t>
+      </w:r>
+      <w:r>
+        <w:rPr>
+          <w:rFonts w:ascii="Consolas" w:hAnsi="Consolas" w:eastAsia="Consolas"/>
+          <w:color w:val="385A47"/>
+          <w:sz w:val="19"/>
+        </w:rPr>
+        <w:t>docs/logs/unit_tests.log</w:t>
+      </w:r>
+      <w:r>
+        <w:rPr>
+          <w:rFonts w:ascii="Arial" w:hAnsi="Arial" w:eastAsia="Arial"/>
+          <w:color w:val="1B2922"/>
+          <w:sz w:val="21"/>
+        </w:rPr>
+        <w:t>:</w:t>
       </w:r>
     </w:p>
     <w:p>
@@ -24577,7 +24914,7 @@
           <w:color w:val="31453A"/>
           <w:sz w:val="16"/>
         </w:rPr>
-        <w:t>✔ Database Config &gt; should construct connection pool without error (2.5ms)</w:t>
+        <w:t>&gt; task-tracker-de24@1.0.0 test</w:t>
       </w:r>
       <w:r>
         <w:br/>
@@ -24588,7 +24925,7 @@
           <w:color w:val="31453A"/>
           <w:sz w:val="16"/>
         </w:rPr>
-        <w:t>✔ Validation &gt; should accept valid task payload (0.9ms)</w:t>
+        <w:t>&gt; node --test</w:t>
       </w:r>
       <w:r>
         <w:br/>
@@ -24599,7 +24936,7 @@
           <w:color w:val="31453A"/>
           <w:sz w:val="16"/>
         </w:rPr>
-        <w:t>✔ Validation &gt; should reject empty title (0.3ms)</w:t>
+        <w:t xml:space="preserve"> </w:t>
       </w:r>
       <w:r>
         <w:br/>
@@ -24610,7 +24947,7 @@
           <w:color w:val="31453A"/>
           <w:sz w:val="16"/>
         </w:rPr>
-        <w:t>✔ Validation &gt; should reject title exceeding max length (0.2ms)</w:t>
+        <w:t>✔ GET /health returns 200 and ok when database is healthy (41.6959ms)</w:t>
       </w:r>
       <w:r>
         <w:br/>
@@ -24621,7 +24958,7 @@
           <w:color w:val="31453A"/>
           <w:sz w:val="16"/>
         </w:rPr>
-        <w:t>✔ Validation &gt; should reject invalid status (0.2ms)</w:t>
+        <w:t>✔ GET /health returns 503 when database fails (8.4362ms)</w:t>
       </w:r>
       <w:r>
         <w:br/>
@@ -24632,7 +24969,7 @@
           <w:color w:val="31453A"/>
           <w:sz w:val="16"/>
         </w:rPr>
-        <w:t>✔ Validation &gt; should reject invalid priority (0.2ms)</w:t>
+        <w:t>✔ GET /metrics returns 200 with Prometheus text metrics (8.5125ms)</w:t>
       </w:r>
       <w:r>
         <w:br/>
@@ -24643,7 +24980,7 @@
           <w:color w:val="31453A"/>
           <w:sz w:val="16"/>
         </w:rPr>
-        <w:t>✔ Validation &gt; should reject invalid dueDate format (0.2ms)</w:t>
+        <w:t>✔ Full CRUD flow: create, read, filter, search, update, delete (110.1947ms)</w:t>
       </w:r>
       <w:r>
         <w:br/>
@@ -24654,7 +24991,7 @@
           <w:color w:val="31453A"/>
           <w:sz w:val="16"/>
         </w:rPr>
-        <w:t>✔ Validation &gt; should allow partial updates in validateTaskUpdate (0.2ms)</w:t>
+        <w:t>✔ Input validation rejects invalid requests with 400 (150.6887ms)</w:t>
       </w:r>
       <w:r>
         <w:br/>
@@ -24665,7 +25002,7 @@
           <w:color w:val="31453A"/>
           <w:sz w:val="16"/>
         </w:rPr>
-        <w:t>✔ Validation &gt; should reject empty update payload (0.2ms)</w:t>
+        <w:t>✔ Returns 404 when updating or deleting a nonexistent task (6.1224ms)</w:t>
       </w:r>
       <w:r>
         <w:br/>
@@ -24676,7 +25013,7 @@
           <w:color w:val="31453A"/>
           <w:sz w:val="16"/>
         </w:rPr>
-        <w:t>✔ Validation &gt; should sanitize string inputs (0.2ms)</w:t>
+        <w:t>✔ Returns 500 without leaking database details or stack trace on DB error (24.6405ms)</w:t>
       </w:r>
       <w:r>
         <w:br/>
@@ -24687,7 +25024,7 @@
           <w:color w:val="31453A"/>
           <w:sz w:val="16"/>
         </w:rPr>
-        <w:t>✔ Task Controller &gt; should return 404 when task not found (1.8ms)</w:t>
+        <w:t>✔ accepts a valid task and normalizes optional values (1.7221ms)</w:t>
       </w:r>
       <w:r>
         <w:br/>
@@ -24698,7 +25035,7 @@
           <w:color w:val="31453A"/>
           <w:sz w:val="16"/>
         </w:rPr>
-        <w:t>✔ Task Controller &gt; should handle database errors safely with 500 status (1.5ms)</w:t>
+        <w:t>✔ rejects a title that is blank or too long (0.159ms)</w:t>
       </w:r>
       <w:r>
         <w:br/>
@@ -24709,7 +25046,7 @@
           <w:color w:val="31453A"/>
           <w:sz w:val="16"/>
         </w:rPr>
-        <w:t>ℹ tests 12</w:t>
+        <w:t>✔ rejects unsupported status, priority, and malformed date (0.1284ms)</w:t>
       </w:r>
       <w:r>
         <w:br/>
@@ -24720,7 +25057,7 @@
           <w:color w:val="31453A"/>
           <w:sz w:val="16"/>
         </w:rPr>
-        <w:t>ℹ suites 0</w:t>
+        <w:t>✔ partial updates validate only submitted fields (0.1966ms)</w:t>
       </w:r>
       <w:r>
         <w:br/>
@@ -24731,7 +25068,7 @@
           <w:color w:val="31453A"/>
           <w:sz w:val="16"/>
         </w:rPr>
-        <w:t>ℹ pass 12</w:t>
+        <w:t>✔ accepts a task without dueDate and defaults dueDate to null (0.1172ms)</w:t>
       </w:r>
       <w:r>
         <w:br/>
@@ -24742,7 +25079,7 @@
           <w:color w:val="31453A"/>
           <w:sz w:val="16"/>
         </w:rPr>
-        <w:t>ℹ fail 0</w:t>
+        <w:t>ℹ tests 12</w:t>
       </w:r>
       <w:r>
         <w:br/>
@@ -24753,7 +25090,7 @@
           <w:color w:val="31453A"/>
           <w:sz w:val="16"/>
         </w:rPr>
-        <w:t>ℹ cancelled 0</w:t>
+        <w:t>ℹ suites 0</w:t>
       </w:r>
       <w:r>
         <w:br/>
@@ -24764,7 +25101,7 @@
           <w:color w:val="31453A"/>
           <w:sz w:val="16"/>
         </w:rPr>
-        <w:t>ℹ skipped 0</w:t>
+        <w:t>ℹ pass 12</w:t>
       </w:r>
       <w:r>
         <w:br/>
@@ -24775,7 +25112,51 @@
           <w:color w:val="31453A"/>
           <w:sz w:val="16"/>
         </w:rPr>
+        <w:t>ℹ fail 0</w:t>
+      </w:r>
+      <w:r>
+        <w:br/>
+      </w:r>
+      <w:r>
+        <w:rPr>
+          <w:rFonts w:ascii="Consolas" w:hAnsi="Consolas" w:eastAsia="Consolas"/>
+          <w:color w:val="31453A"/>
+          <w:sz w:val="16"/>
+        </w:rPr>
+        <w:t>ℹ cancelled 0</w:t>
+      </w:r>
+      <w:r>
+        <w:br/>
+      </w:r>
+      <w:r>
+        <w:rPr>
+          <w:rFonts w:ascii="Consolas" w:hAnsi="Consolas" w:eastAsia="Consolas"/>
+          <w:color w:val="31453A"/>
+          <w:sz w:val="16"/>
+        </w:rPr>
+        <w:t>ℹ skipped 0</w:t>
+      </w:r>
+      <w:r>
+        <w:br/>
+      </w:r>
+      <w:r>
+        <w:rPr>
+          <w:rFonts w:ascii="Consolas" w:hAnsi="Consolas" w:eastAsia="Consolas"/>
+          <w:color w:val="31453A"/>
+          <w:sz w:val="16"/>
+        </w:rPr>
         <w:t>ℹ todo 0</w:t>
+      </w:r>
+      <w:r>
+        <w:br/>
+      </w:r>
+      <w:r>
+        <w:rPr>
+          <w:rFonts w:ascii="Consolas" w:hAnsi="Consolas" w:eastAsia="Consolas"/>
+          <w:color w:val="31453A"/>
+          <w:sz w:val="16"/>
+        </w:rPr>
+        <w:t>ℹ duration_ms 593.3188</w:t>
       </w:r>
     </w:p>
     <w:p>
@@ -24822,7 +25203,7 @@
           <w:color w:val="1B2922"/>
           <w:sz w:val="21"/>
         </w:rPr>
-        <w:t xml:space="preserve"> và chạy lệnh </w:t>
+        <w:t xml:space="preserve">, chạy lệnh </w:t>
       </w:r>
       <w:r>
         <w:rPr>
@@ -24831,6 +25212,22 @@
           <w:sz w:val="19"/>
         </w:rPr>
         <w:t>npm test</w:t>
+      </w:r>
+      <w:r>
+        <w:rPr>
+          <w:rFonts w:ascii="Arial" w:hAnsi="Arial" w:eastAsia="Arial"/>
+          <w:color w:val="1B2922"/>
+          <w:sz w:val="21"/>
+        </w:rPr>
+        <w:t xml:space="preserve"> và đối chiếu với file nhật ký </w:t>
+      </w:r>
+      <w:r>
+        <w:rPr>
+          <w:rFonts w:ascii="Consolas" w:hAnsi="Consolas" w:eastAsia="Consolas"/>
+          <w:color w:val="385A47"/>
+          <w:sz w:val="19"/>
+        </w:rPr>
+        <w:t>docs/logs/unit_tests.log</w:t>
       </w:r>
       <w:r>
         <w:rPr>
@@ -25199,7 +25596,23 @@
           <w:color w:val="1B2922"/>
           <w:sz w:val="21"/>
         </w:rPr>
-        <w:t>Dữ liệu đầu ra thô (raw terminal output):</w:t>
+        <w:t xml:space="preserve">Dữ liệu đầu ra thô (raw terminal output) trích xuất từ phiên kiểm tra (được lưu tại </w:t>
+      </w:r>
+      <w:r>
+        <w:rPr>
+          <w:rFonts w:ascii="Consolas" w:hAnsi="Consolas" w:eastAsia="Consolas"/>
+          <w:color w:val="385A47"/>
+          <w:sz w:val="19"/>
+        </w:rPr>
+        <w:t>docs/logs/hardening.log</w:t>
+      </w:r>
+      <w:r>
+        <w:rPr>
+          <w:rFonts w:ascii="Arial" w:hAnsi="Arial" w:eastAsia="Arial"/>
+          <w:color w:val="1B2922"/>
+          <w:sz w:val="21"/>
+        </w:rPr>
+        <w:t>):</w:t>
       </w:r>
     </w:p>
     <w:p>
@@ -25224,7 +25637,7 @@
           <w:color w:val="31453A"/>
           <w:sz w:val="16"/>
         </w:rPr>
-        <w:t>uid=10001(node) gid=10001(node) groups=10001(node)</w:t>
+        <w:t>uid=10001 gid=10001 groups=10001</w:t>
       </w:r>
       <w:r>
         <w:br/>
@@ -25741,7 +26154,23 @@
           <w:color w:val="1B2922"/>
           <w:sz w:val="21"/>
         </w:rPr>
-        <w:t>Dữ liệu đầu ra thô (raw terminal output):</w:t>
+        <w:t xml:space="preserve">Dữ liệu đầu ra thô (raw terminal output) trích xuất từ phiên kiểm tra (được lưu tại </w:t>
+      </w:r>
+      <w:r>
+        <w:rPr>
+          <w:rFonts w:ascii="Consolas" w:hAnsi="Consolas" w:eastAsia="Consolas"/>
+          <w:color w:val="385A47"/>
+          <w:sz w:val="19"/>
+        </w:rPr>
+        <w:t>docs/logs/networks_roles.log</w:t>
+      </w:r>
+      <w:r>
+        <w:rPr>
+          <w:rFonts w:ascii="Arial" w:hAnsi="Arial" w:eastAsia="Arial"/>
+          <w:color w:val="1B2922"/>
+          <w:sz w:val="21"/>
+        </w:rPr>
+        <w:t>):</w:t>
       </w:r>
     </w:p>
     <w:p>
@@ -26299,7 +26728,23 @@
           <w:color w:val="1B2922"/>
           <w:sz w:val="21"/>
         </w:rPr>
-        <w:t>Dữ liệu đầu ra thô (raw terminal output):</w:t>
+        <w:t xml:space="preserve">Dữ liệu đầu ra thô (raw terminal output) trích xuất từ phiên kiểm tra (được lưu tại </w:t>
+      </w:r>
+      <w:r>
+        <w:rPr>
+          <w:rFonts w:ascii="Consolas" w:hAnsi="Consolas" w:eastAsia="Consolas"/>
+          <w:color w:val="385A47"/>
+          <w:sz w:val="19"/>
+        </w:rPr>
+        <w:t>docs/logs/test_persistence.log</w:t>
+      </w:r>
+      <w:r>
+        <w:rPr>
+          <w:rFonts w:ascii="Arial" w:hAnsi="Arial" w:eastAsia="Arial"/>
+          <w:color w:val="1B2922"/>
+          <w:sz w:val="21"/>
+        </w:rPr>
+        <w:t>):</w:t>
       </w:r>
     </w:p>
     <w:p>
@@ -26313,7 +26758,7 @@
           <w:color w:val="31453A"/>
           <w:sz w:val="16"/>
         </w:rPr>
-        <w:t>PS&gt; node scripts/persistence_step1.js</w:t>
+        <w:t>PS&gt; node scripts/test_persistence.js</w:t>
       </w:r>
       <w:r>
         <w:br/>
@@ -26335,7 +26780,7 @@
           <w:color w:val="31453A"/>
           <w:sz w:val="16"/>
         </w:rPr>
-        <w:t>Đang tạo marker task: "PERSISTENCE-MARKER-1792434130505"...</w:t>
+        <w:t>Đang tạo marker task: "PERSISTENCE-MARKER-1792436048294"...</w:t>
       </w:r>
       <w:r>
         <w:br/>
@@ -26346,7 +26791,7 @@
           <w:color w:val="31453A"/>
           <w:sz w:val="16"/>
         </w:rPr>
-        <w:t xml:space="preserve">   Marker task đã tạo thành công: ID=16, title="PERSISTENCE-MARKER-1792434130505"</w:t>
+        <w:t xml:space="preserve">   Marker task đã tạo thành công: ID=18, title="PERSISTENCE-MARKER-1792436048294"</w:t>
       </w:r>
       <w:r>
         <w:br/>
@@ -26379,7 +26824,7 @@
           <w:color w:val="31453A"/>
           <w:sz w:val="16"/>
         </w:rPr>
-        <w:t>PS&gt; docker compose restart db task-app</w:t>
+        <w:t>--- TỰ ĐỘNG KHỞI ĐỘNG LẠI CONTAINER db VÀ task-app ---</w:t>
       </w:r>
       <w:r>
         <w:br/>
@@ -26390,7 +26835,7 @@
           <w:color w:val="31453A"/>
           <w:sz w:val="16"/>
         </w:rPr>
-        <w:t xml:space="preserve"> Container task-tracker-de24-db-1 Restarting</w:t>
+        <w:t xml:space="preserve"> Container task-tracker-de24-task-app-1 Restarting</w:t>
       </w:r>
       <w:r>
         <w:br/>
@@ -26401,7 +26846,7 @@
           <w:color w:val="31453A"/>
           <w:sz w:val="16"/>
         </w:rPr>
-        <w:t xml:space="preserve"> Container task-tracker-de24-task-app-1 Restarting</w:t>
+        <w:t xml:space="preserve"> Container task-tracker-de24-db-1 Restarting</w:t>
       </w:r>
       <w:r>
         <w:br/>
@@ -26434,7 +26879,7 @@
           <w:color w:val="31453A"/>
           <w:sz w:val="16"/>
         </w:rPr>
-        <w:t xml:space="preserve"> </w:t>
+        <w:t>=== BƯỚC 2: XÁC MINH MARKER TASK VÀ DỌN DẸP SAU KHI RESTART ===</w:t>
       </w:r>
       <w:r>
         <w:br/>
@@ -26445,7 +26890,7 @@
           <w:color w:val="31453A"/>
           <w:sz w:val="16"/>
         </w:rPr>
-        <w:t>PS&gt; node scripts/persistence_step2.js</w:t>
+        <w:t>Đang tìm kiếm marker task ID=18, title="PERSISTENCE-MARKER-1792436048294"...</w:t>
       </w:r>
       <w:r>
         <w:br/>
@@ -26456,7 +26901,7 @@
           <w:color w:val="31453A"/>
           <w:sz w:val="16"/>
         </w:rPr>
-        <w:t>=== BƯỚC 2: XÁC MINH MARKER TASK VÀ DỌN DẸP SAU KHI RESTART ===</w:t>
+        <w:t xml:space="preserve">   Hệ thống đã phục hồi healthy sau 1 giây.</w:t>
       </w:r>
       <w:r>
         <w:br/>
@@ -26467,7 +26912,7 @@
           <w:color w:val="31453A"/>
           <w:sz w:val="16"/>
         </w:rPr>
-        <w:t>Đang tìm kiếm marker task ID=16, title="PERSISTENCE-MARKER-1792434130505"...</w:t>
+        <w:t xml:space="preserve">   [XÁC NHẬN BỀN VỮNG] Marker task tồn tại nguyên vẹn: ID=18, title="PERSISTENCE-MARKER-1792436048294", status="in_progress"!</w:t>
       </w:r>
       <w:r>
         <w:br/>
@@ -26478,7 +26923,7 @@
           <w:color w:val="31453A"/>
           <w:sz w:val="16"/>
         </w:rPr>
-        <w:t xml:space="preserve">   Hệ thống đã phục hồi healthy sau 1 giây.</w:t>
+        <w:t>Đang dọn dẹp marker task 18...</w:t>
       </w:r>
       <w:r>
         <w:br/>
@@ -26489,7 +26934,7 @@
           <w:color w:val="31453A"/>
           <w:sz w:val="16"/>
         </w:rPr>
-        <w:t xml:space="preserve">   [XÁC NHẬN BỀN VỮNG] Marker task tồn tại nguyên vẹn: ID=16, title="PERSISTENCE-MARKER-1792434130505", status="in_progress"!</w:t>
+        <w:t xml:space="preserve">   Dọn dẹp marker task thành công (HTTP 204).</w:t>
       </w:r>
       <w:r>
         <w:br/>
@@ -26500,28 +26945,6 @@
           <w:color w:val="31453A"/>
           <w:sz w:val="16"/>
         </w:rPr>
-        <w:t>Đang dọn dẹp marker task 16...</w:t>
-      </w:r>
-      <w:r>
-        <w:br/>
-      </w:r>
-      <w:r>
-        <w:rPr>
-          <w:rFonts w:ascii="Consolas" w:hAnsi="Consolas" w:eastAsia="Consolas"/>
-          <w:color w:val="31453A"/>
-          <w:sz w:val="16"/>
-        </w:rPr>
-        <w:t xml:space="preserve">   Dọn dẹp marker task thành công (HTTP 204).</w:t>
-      </w:r>
-      <w:r>
-        <w:br/>
-      </w:r>
-      <w:r>
-        <w:rPr>
-          <w:rFonts w:ascii="Consolas" w:hAnsi="Consolas" w:eastAsia="Consolas"/>
-          <w:color w:val="31453A"/>
-          <w:sz w:val="16"/>
-        </w:rPr>
         <w:t>=== KIỂM TRA PERSISTENCE HOÀN TẤT VÀ ĐẠT PASS 100% ===</w:t>
       </w:r>
     </w:p>
@@ -26553,7 +26976,7 @@
           <w:color w:val="1B2922"/>
           <w:sz w:val="21"/>
         </w:rPr>
-        <w:t xml:space="preserve"> Chạy script </w:t>
+        <w:t xml:space="preserve"> Chạy kiểm thử tự động toàn trình bằng </w:t>
       </w:r>
       <w:r>
         <w:rPr>
@@ -26561,15 +26984,15 @@
           <w:color w:val="385A47"/>
           <w:sz w:val="19"/>
         </w:rPr>
-        <w:t>node scripts/persistence_step1.js</w:t>
-      </w:r>
-      <w:r>
-        <w:rPr>
-          <w:rFonts w:ascii="Arial" w:hAnsi="Arial" w:eastAsia="Arial"/>
-          <w:color w:val="1B2922"/>
-          <w:sz w:val="21"/>
-        </w:rPr>
-        <w:t xml:space="preserve">, thực hiện restart container bằng </w:t>
+        <w:t>node scripts/test_persistence.js</w:t>
+      </w:r>
+      <w:r>
+        <w:rPr>
+          <w:rFonts w:ascii="Arial" w:hAnsi="Arial" w:eastAsia="Arial"/>
+          <w:color w:val="1B2922"/>
+          <w:sz w:val="21"/>
+        </w:rPr>
+        <w:t xml:space="preserve"> (hoặc chạy tuần tự từng bước bằng </w:t>
       </w:r>
       <w:r>
         <w:rPr>
@@ -26577,15 +27000,15 @@
           <w:color w:val="385A47"/>
           <w:sz w:val="19"/>
         </w:rPr>
-        <w:t>docker compose restart db task-app</w:t>
-      </w:r>
-      <w:r>
-        <w:rPr>
-          <w:rFonts w:ascii="Arial" w:hAnsi="Arial" w:eastAsia="Arial"/>
-          <w:color w:val="1B2922"/>
-          <w:sz w:val="21"/>
-        </w:rPr>
-        <w:t xml:space="preserve">, sau đó chạy </w:t>
+        <w:t>node scripts/persistence_step1.js</w:t>
+      </w:r>
+      <w:r>
+        <w:rPr>
+          <w:rFonts w:ascii="Arial" w:hAnsi="Arial" w:eastAsia="Arial"/>
+          <w:color w:val="1B2922"/>
+          <w:sz w:val="21"/>
+        </w:rPr>
+        <w:t xml:space="preserve">, </w:t>
       </w:r>
       <w:r>
         <w:rPr>
@@ -26593,15 +27016,15 @@
           <w:color w:val="385A47"/>
           <w:sz w:val="19"/>
         </w:rPr>
-        <w:t>node scripts/persistence_step2.js</w:t>
-      </w:r>
-      <w:r>
-        <w:rPr>
-          <w:rFonts w:ascii="Arial" w:hAnsi="Arial" w:eastAsia="Arial"/>
-          <w:color w:val="1B2922"/>
-          <w:sz w:val="21"/>
-        </w:rPr>
-        <w:t xml:space="preserve"> (hoặc chạy kiểm thử tự động trọn gói bằng </w:t>
+        <w:t>docker compose restart db task-app</w:t>
+      </w:r>
+      <w:r>
+        <w:rPr>
+          <w:rFonts w:ascii="Arial" w:hAnsi="Arial" w:eastAsia="Arial"/>
+          <w:color w:val="1B2922"/>
+          <w:sz w:val="21"/>
+        </w:rPr>
+        <w:t xml:space="preserve">, và </w:t>
       </w:r>
       <w:r>
         <w:rPr>
@@ -26609,7 +27032,7 @@
           <w:color w:val="385A47"/>
           <w:sz w:val="19"/>
         </w:rPr>
-        <w:t>node scripts/test_persistence.js</w:t>
+        <w:t>node scripts/persistence_step2.js</w:t>
       </w:r>
       <w:r>
         <w:rPr>

</xml_diff>

<commit_message>
docs: finalize ten-page report with ICTU cover and matching PDF
</commit_message>
<xml_diff>
--- a/docs/bao-cao-de24.docx
+++ b/docs/bao-cao-de24.docx
@@ -4,50 +4,8 @@
   <w:body>
     <w:p>
       <w:pPr>
-        <w:spacing w:line="240" w:lineRule="auto" w:after="0" w:before="240"/>
-        <w:jc w:val="center"/>
-      </w:pPr>
-      <w:r>
-        <w:rPr>
-          <w:rFonts w:ascii="Times New Roman" w:hAnsi="Times New Roman" w:eastAsia="Times New Roman"/>
-          <w:color w:val="000000"/>
-          <w:sz w:val="23"/>
-        </w:rPr>
-        <w:t>TRƯỜNG ĐẠI HỌC CÔNG NGHỆ THÔNG TIN</w:t>
-      </w:r>
-    </w:p>
-    <w:p>
-      <w:pPr>
-        <w:spacing w:line="240" w:lineRule="auto" w:after="0"/>
-        <w:jc w:val="center"/>
-      </w:pPr>
-      <w:r>
-        <w:rPr>
-          <w:rFonts w:ascii="Times New Roman" w:hAnsi="Times New Roman" w:eastAsia="Times New Roman"/>
-          <w:color w:val="000000"/>
-          <w:sz w:val="23"/>
-        </w:rPr>
-        <w:t>VÀ TRUYỀN THÔNG THÁI NGUYÊN</w:t>
-      </w:r>
-    </w:p>
-    <w:p>
-      <w:pPr>
-        <w:spacing w:line="240" w:lineRule="auto" w:after="0"/>
-        <w:jc w:val="center"/>
-      </w:pPr>
-      <w:r>
-        <w:rPr>
-          <w:rFonts w:ascii="Times New Roman" w:hAnsi="Times New Roman" w:eastAsia="Times New Roman"/>
-          <w:color w:val="000000"/>
-          <w:sz w:val="23"/>
-        </w:rPr>
-        <w:t>NGÀNH KHOA HỌC MÁY TÍNH</w:t>
-      </w:r>
-    </w:p>
-    <w:p>
-      <w:pPr>
-        <w:pStyle w:val="Title"/>
-        <w:spacing w:before="680" w:after="160"/>
+        <w:keepLines/>
+        <w:spacing w:line="240" w:lineRule="auto" w:after="200" w:before="160"/>
         <w:jc w:val="center"/>
       </w:pPr>
       <w:r>
@@ -55,14 +13,15 @@
           <w:rFonts w:ascii="Times New Roman" w:hAnsi="Times New Roman" w:eastAsia="Times New Roman"/>
           <w:b/>
           <w:color w:val="000000"/>
-          <w:sz w:val="38"/>
+          <w:sz w:val="22"/>
         </w:rPr>
-        <w:t>BÁO CÁO HỌC PHẦN</w:t>
+        <w:t>TRƯỜNG ĐẠI HỌC CÔNG NGHỆ THÔNG TIN VÀ TRUYỀN THÔNG</w:t>
       </w:r>
     </w:p>
     <w:p>
       <w:pPr>
-        <w:spacing w:after="40"/>
+        <w:keepLines/>
+        <w:spacing w:line="240" w:lineRule="auto" w:after="0"/>
         <w:jc w:val="center"/>
       </w:pPr>
       <w:r>
@@ -70,29 +29,72 @@
           <w:rFonts w:ascii="Times New Roman" w:hAnsi="Times New Roman" w:eastAsia="Times New Roman"/>
           <w:b/>
           <w:color w:val="000000"/>
-          <w:sz w:val="34"/>
+          <w:sz w:val="22"/>
+          <w:u w:val="single"/>
         </w:rPr>
-        <w:t>TRIỂN KHAI VÀ QUẢN TRỊ</w:t>
+        <w:t>KHOA CÔNG NGHỆ THÔNG TIN</w:t>
       </w:r>
     </w:p>
     <w:p>
       <w:pPr>
-        <w:spacing w:after="40"/>
+        <w:keepNext/>
+        <w:spacing w:before="360" w:after="160"/>
+        <w:jc w:val="center"/>
+      </w:pPr>
+      <w:r>
+        <w:drawing>
+          <wp:inline xmlns:a="http://schemas.openxmlformats.org/drawingml/2006/main" xmlns:pic="http://schemas.openxmlformats.org/drawingml/2006/picture">
+            <wp:extent cx="1298448" cy="1298448"/>
+            <wp:docPr id="1" name="Picture 1" descr="Logo ICTU"/>
+            <wp:cNvGraphicFramePr>
+              <a:graphicFrameLocks noChangeAspect="1"/>
+            </wp:cNvGraphicFramePr>
+            <a:graphic>
+              <a:graphicData uri="http://schemas.openxmlformats.org/drawingml/2006/picture">
+                <pic:pic>
+                  <pic:nvPicPr>
+                    <pic:cNvPr id="0" name="ictu-logo.jpg"/>
+                    <pic:cNvPicPr/>
+                  </pic:nvPicPr>
+                  <pic:blipFill>
+                    <a:blip r:embed="rId11"/>
+                    <a:stretch>
+                      <a:fillRect/>
+                    </a:stretch>
+                  </pic:blipFill>
+                  <pic:spPr>
+                    <a:xfrm>
+                      <a:off x="0" y="0"/>
+                      <a:ext cx="1298448" cy="1298448"/>
+                    </a:xfrm>
+                    <a:prstGeom prst="rect"/>
+                  </pic:spPr>
+                </pic:pic>
+              </a:graphicData>
+            </a:graphic>
+          </wp:inline>
+        </w:drawing>
+      </w:r>
+    </w:p>
+    <w:p>
+      <w:pPr>
+        <w:pStyle w:val="Title"/>
+        <w:spacing w:before="160" w:after="240"/>
         <w:jc w:val="center"/>
       </w:pPr>
       <w:r>
         <w:rPr>
           <w:rFonts w:ascii="Times New Roman" w:hAnsi="Times New Roman" w:eastAsia="Times New Roman"/>
           <w:b/>
-          <w:color w:val="000000"/>
-          <w:sz w:val="34"/>
+          <w:color w:val="F02127"/>
+          <w:sz w:val="54"/>
         </w:rPr>
-        <w:t>HỆ THỐNG PHẦN MỀM</w:t>
+        <w:t>BÁO CÁO</w:t>
       </w:r>
     </w:p>
     <w:p>
       <w:pPr>
-        <w:spacing w:after="20"/>
+        <w:spacing w:after="120"/>
         <w:jc w:val="center"/>
       </w:pPr>
       <w:r>
@@ -102,12 +104,12 @@
           <w:color w:val="000000"/>
           <w:sz w:val="30"/>
         </w:rPr>
-        <w:t>ĐỀ 24</w:t>
+        <w:t>MÔN: TRIỂN KHAI VÀ QUẢN TRỊ</w:t>
       </w:r>
     </w:p>
     <w:p>
       <w:pPr>
-        <w:spacing w:after="20"/>
+        <w:spacing w:after="120"/>
         <w:jc w:val="center"/>
       </w:pPr>
       <w:r>
@@ -117,12 +119,12 @@
           <w:color w:val="000000"/>
           <w:sz w:val="30"/>
         </w:rPr>
-        <w:t>HỆ THỐNG QUẢN LÝ CÔNG VIỆC</w:t>
+        <w:t>HỆ THỐNG PHẦN MỀM</w:t>
       </w:r>
     </w:p>
     <w:p>
       <w:pPr>
-        <w:spacing w:after="20"/>
+        <w:spacing w:after="100"/>
         <w:jc w:val="center"/>
       </w:pPr>
       <w:r>
@@ -130,83 +132,29 @@
           <w:rFonts w:ascii="Times New Roman" w:hAnsi="Times New Roman" w:eastAsia="Times New Roman"/>
           <w:b/>
           <w:color w:val="000000"/>
-          <w:sz w:val="30"/>
+          <w:sz w:val="26"/>
+        </w:rPr>
+        <w:t>ĐỀ 24 HỆ THỐNG QUẢN LÝ CÔNG VIỆC</w:t>
+      </w:r>
+    </w:p>
+    <w:p>
+      <w:pPr>
+        <w:spacing w:after="100"/>
+        <w:jc w:val="center"/>
+      </w:pPr>
+      <w:r>
+        <w:rPr>
+          <w:rFonts w:ascii="Times New Roman" w:hAnsi="Times New Roman" w:eastAsia="Times New Roman"/>
+          <w:b/>
+          <w:color w:val="000000"/>
+          <w:sz w:val="26"/>
         </w:rPr>
         <w:t>TASK TRACKER</w:t>
       </w:r>
     </w:p>
     <w:p>
       <w:pPr>
-        <w:spacing w:line="240" w:lineRule="auto" w:after="0"/>
-        <w:jc w:val="center"/>
-      </w:pPr>
-      <w:r>
-        <w:rPr>
-          <w:rFonts w:ascii="Times New Roman" w:hAnsi="Times New Roman" w:eastAsia="Times New Roman"/>
-          <w:color w:val="000000"/>
-          <w:sz w:val="23"/>
-        </w:rPr>
-        <w:t>Sinh viên thực hiện: Đặng Quốc Doanh</w:t>
-      </w:r>
-    </w:p>
-    <w:p>
-      <w:pPr>
-        <w:spacing w:line="240" w:lineRule="auto" w:after="0"/>
-        <w:jc w:val="center"/>
-      </w:pPr>
-      <w:r>
-        <w:rPr>
-          <w:rFonts w:ascii="Times New Roman" w:hAnsi="Times New Roman" w:eastAsia="Times New Roman"/>
-          <w:color w:val="000000"/>
-          <w:sz w:val="23"/>
-        </w:rPr>
-        <w:t>Mã số sinh viên: DTC245200775</w:t>
-      </w:r>
-    </w:p>
-    <w:p>
-      <w:pPr>
-        <w:spacing w:line="240" w:lineRule="auto" w:after="0"/>
-        <w:jc w:val="center"/>
-      </w:pPr>
-      <w:r>
-        <w:rPr>
-          <w:rFonts w:ascii="Times New Roman" w:hAnsi="Times New Roman" w:eastAsia="Times New Roman"/>
-          <w:color w:val="000000"/>
-          <w:sz w:val="23"/>
-        </w:rPr>
-        <w:t>Lớp: KHMT K23A</w:t>
-      </w:r>
-    </w:p>
-    <w:p>
-      <w:pPr>
-        <w:spacing w:line="240" w:lineRule="auto" w:after="0"/>
-        <w:jc w:val="center"/>
-      </w:pPr>
-      <w:r>
-        <w:rPr>
-          <w:rFonts w:ascii="Times New Roman" w:hAnsi="Times New Roman" w:eastAsia="Times New Roman"/>
-          <w:color w:val="000000"/>
-          <w:sz w:val="23"/>
-        </w:rPr>
-        <w:t>Giảng viên hướng dẫn: Hoàng Văn Tâm</w:t>
-      </w:r>
-    </w:p>
-    <w:p>
-      <w:pPr>
-        <w:spacing w:line="240" w:lineRule="auto" w:after="0"/>
-        <w:jc w:val="center"/>
-      </w:pPr>
-      <w:r>
-        <w:rPr>
-          <w:rFonts w:ascii="Times New Roman" w:hAnsi="Times New Roman" w:eastAsia="Times New Roman"/>
-          <w:color w:val="000000"/>
-          <w:sz w:val="23"/>
-        </w:rPr>
-        <w:t>Năm học: 2026</w:t>
-      </w:r>
-    </w:p>
-    <w:p>
-      <w:pPr>
+        <w:keepLines/>
         <w:spacing w:line="240" w:lineRule="auto" w:after="0"/>
         <w:jc w:val="center"/>
       </w:pPr>
@@ -217,7 +165,89 @@
           <w:color w:val="000000"/>
           <w:sz w:val="23"/>
         </w:rPr>
-        <w:t>Thái Nguyên, tháng 10 năm 2026</w:t>
+        <w:t>GIẢNG VIÊN HƯỚNG DẪN: HOÀNG VĂN TÂM</w:t>
+      </w:r>
+    </w:p>
+    <w:p>
+      <w:pPr>
+        <w:keepLines/>
+        <w:tabs>
+          <w:tab w:pos="2592" w:val="left"/>
+        </w:tabs>
+        <w:spacing w:line="240" w:lineRule="auto" w:after="180"/>
+        <w:ind w:left="1800"/>
+        <w:jc w:val="left"/>
+      </w:pPr>
+      <w:r>
+        <w:rPr>
+          <w:rFonts w:ascii="Times New Roman" w:hAnsi="Times New Roman" w:eastAsia="Times New Roman"/>
+          <w:b/>
+          <w:color w:val="000000"/>
+          <w:sz w:val="24"/>
+        </w:rPr>
+        <w:t>Sinh viên thực hiện:</w:t>
+        <w:tab/>
+        <w:t>ĐẶNG QUỐC DOANH</w:t>
+      </w:r>
+    </w:p>
+    <w:p>
+      <w:pPr>
+        <w:keepLines/>
+        <w:tabs>
+          <w:tab w:pos="2592" w:val="left"/>
+        </w:tabs>
+        <w:spacing w:line="240" w:lineRule="auto" w:after="180"/>
+        <w:ind w:left="1800"/>
+        <w:jc w:val="left"/>
+      </w:pPr>
+      <w:r>
+        <w:rPr>
+          <w:rFonts w:ascii="Times New Roman" w:hAnsi="Times New Roman" w:eastAsia="Times New Roman"/>
+          <w:b/>
+          <w:color w:val="000000"/>
+          <w:sz w:val="24"/>
+        </w:rPr>
+        <w:t>MSSV:</w:t>
+        <w:tab/>
+        <w:t>DTC245200775</w:t>
+      </w:r>
+    </w:p>
+    <w:p>
+      <w:pPr>
+        <w:keepLines/>
+        <w:tabs>
+          <w:tab w:pos="2592" w:val="left"/>
+        </w:tabs>
+        <w:spacing w:line="240" w:lineRule="auto" w:after="180"/>
+        <w:ind w:left="1800"/>
+        <w:jc w:val="left"/>
+      </w:pPr>
+      <w:r>
+        <w:rPr>
+          <w:rFonts w:ascii="Times New Roman" w:hAnsi="Times New Roman" w:eastAsia="Times New Roman"/>
+          <w:b/>
+          <w:color w:val="000000"/>
+          <w:sz w:val="24"/>
+        </w:rPr>
+        <w:t>Lớp:</w:t>
+        <w:tab/>
+        <w:t>KHMT K23A</w:t>
+      </w:r>
+    </w:p>
+    <w:p>
+      <w:pPr>
+        <w:keepLines/>
+        <w:spacing w:line="240" w:lineRule="auto" w:after="0"/>
+        <w:jc w:val="center"/>
+      </w:pPr>
+      <w:r>
+        <w:rPr>
+          <w:rFonts w:ascii="Times New Roman" w:hAnsi="Times New Roman" w:eastAsia="Times New Roman"/>
+          <w:b/>
+          <w:color w:val="000000"/>
+          <w:sz w:val="23"/>
+        </w:rPr>
+        <w:t>THÁI NGUYÊN, NĂM 2026</w:t>
       </w:r>
     </w:p>
     <w:p>
@@ -263,7 +293,7 @@
         <w:drawing>
           <wp:inline xmlns:a="http://schemas.openxmlformats.org/drawingml/2006/main" xmlns:pic="http://schemas.openxmlformats.org/drawingml/2006/picture">
             <wp:extent cx="3986784" cy="2591410"/>
-            <wp:docPr id="1" name="Picture 1" descr="Sơ đồ kiến trúc Task Tracker"/>
+            <wp:docPr id="2" name="Picture 2" descr="Sơ đồ kiến trúc Task Tracker"/>
             <wp:cNvGraphicFramePr>
               <a:graphicFrameLocks noChangeAspect="1"/>
             </wp:cNvGraphicFramePr>
@@ -275,7 +305,7 @@
                     <pic:cNvPicPr/>
                   </pic:nvPicPr>
                   <pic:blipFill>
-                    <a:blip r:embed="rId11"/>
+                    <a:blip r:embed="rId12"/>
                     <a:stretch>
                       <a:fillRect/>
                     </a:stretch>
@@ -830,7 +860,7 @@
         </w:rPr>
         <w:t xml:space="preserve">Repository: </w:t>
       </w:r>
-      <w:hyperlink r:id="rId12">
+      <w:hyperlink r:id="rId13">
         <w:r>
           <w:rPr>
             <w:rFonts w:ascii="Times New Roman" w:hAnsi="Times New Roman" w:eastAsia="Times New Roman"/>
@@ -1254,7 +1284,7 @@
         <w:drawing>
           <wp:inline xmlns:a="http://schemas.openxmlformats.org/drawingml/2006/main" xmlns:pic="http://schemas.openxmlformats.org/drawingml/2006/picture">
             <wp:extent cx="4736592" cy="2520252"/>
-            <wp:docPr id="2" name="Picture 2" descr="Kết quả build và khởi chạy Compose"/>
+            <wp:docPr id="3" name="Picture 3" descr="Kết quả build và khởi chạy Compose"/>
             <wp:cNvGraphicFramePr>
               <a:graphicFrameLocks noChangeAspect="1"/>
             </wp:cNvGraphicFramePr>
@@ -1266,7 +1296,7 @@
                     <pic:cNvPicPr/>
                   </pic:nvPicPr>
                   <pic:blipFill>
-                    <a:blip r:embed="rId13"/>
+                    <a:blip r:embed="rId14"/>
                     <a:stretch>
                       <a:fillRect/>
                     </a:stretch>
@@ -1311,7 +1341,7 @@
         <w:drawing>
           <wp:inline xmlns:a="http://schemas.openxmlformats.org/drawingml/2006/main" xmlns:pic="http://schemas.openxmlformats.org/drawingml/2006/picture">
             <wp:extent cx="4553712" cy="2411068"/>
-            <wp:docPr id="3" name="Picture 3" descr="Danh sách container và port bindings"/>
+            <wp:docPr id="4" name="Picture 4" descr="Danh sách container và port bindings"/>
             <wp:cNvGraphicFramePr>
               <a:graphicFrameLocks noChangeAspect="1"/>
             </wp:cNvGraphicFramePr>
@@ -1323,7 +1353,7 @@
                     <pic:cNvPicPr/>
                   </pic:nvPicPr>
                   <pic:blipFill>
-                    <a:blip r:embed="rId14"/>
+                    <a:blip r:embed="rId15"/>
                     <a:stretch>
                       <a:fillRect/>
                     </a:stretch>
@@ -1463,7 +1493,7 @@
         <w:drawing>
           <wp:inline xmlns:a="http://schemas.openxmlformats.org/drawingml/2006/main" xmlns:pic="http://schemas.openxmlformats.org/drawingml/2006/picture">
             <wp:extent cx="3721608" cy="2377694"/>
-            <wp:docPr id="4" name="Picture 4" descr="Giao diện Task Tracker"/>
+            <wp:docPr id="5" name="Picture 5" descr="Giao diện Task Tracker"/>
             <wp:cNvGraphicFramePr>
               <a:graphicFrameLocks noChangeAspect="1"/>
             </wp:cNvGraphicFramePr>
@@ -1475,7 +1505,7 @@
                     <pic:cNvPicPr/>
                   </pic:nvPicPr>
                   <pic:blipFill>
-                    <a:blip r:embed="rId15"/>
+                    <a:blip r:embed="rId16"/>
                     <a:stretch>
                       <a:fillRect/>
                     </a:stretch>
@@ -1598,7 +1628,7 @@
         <w:drawing>
           <wp:inline xmlns:a="http://schemas.openxmlformats.org/drawingml/2006/main" xmlns:pic="http://schemas.openxmlformats.org/drawingml/2006/picture">
             <wp:extent cx="3968496" cy="2267712"/>
-            <wp:docPr id="5" name="Picture 5" descr="Biểu mẫu tạo task"/>
+            <wp:docPr id="6" name="Picture 6" descr="Biểu mẫu tạo task"/>
             <wp:cNvGraphicFramePr>
               <a:graphicFrameLocks noChangeAspect="1"/>
             </wp:cNvGraphicFramePr>
@@ -1610,7 +1640,7 @@
                     <pic:cNvPicPr/>
                   </pic:nvPicPr>
                   <pic:blipFill>
-                    <a:blip r:embed="rId16"/>
+                    <a:blip r:embed="rId17"/>
                     <a:stretch>
                       <a:fillRect/>
                     </a:stretch>
@@ -1685,7 +1715,7 @@
         <w:drawing>
           <wp:inline xmlns:a="http://schemas.openxmlformats.org/drawingml/2006/main" xmlns:pic="http://schemas.openxmlformats.org/drawingml/2006/picture">
             <wp:extent cx="3840480" cy="2194560"/>
-            <wp:docPr id="6" name="Picture 6" descr="Lọc task theo trạng thái"/>
+            <wp:docPr id="7" name="Picture 7" descr="Lọc task theo trạng thái"/>
             <wp:cNvGraphicFramePr>
               <a:graphicFrameLocks noChangeAspect="1"/>
             </wp:cNvGraphicFramePr>
@@ -1697,7 +1727,7 @@
                     <pic:cNvPicPr/>
                   </pic:nvPicPr>
                   <pic:blipFill>
-                    <a:blip r:embed="rId17"/>
+                    <a:blip r:embed="rId18"/>
                     <a:stretch>
                       <a:fillRect/>
                     </a:stretch>
@@ -2069,7 +2099,7 @@
         <w:drawing>
           <wp:inline xmlns:a="http://schemas.openxmlformats.org/drawingml/2006/main" xmlns:pic="http://schemas.openxmlformats.org/drawingml/2006/picture">
             <wp:extent cx="5294376" cy="2518764"/>
-            <wp:docPr id="7" name="Picture 7" descr="pgAdmin hiển thị public.tasks"/>
+            <wp:docPr id="8" name="Picture 8" descr="pgAdmin hiển thị public.tasks"/>
             <wp:cNvGraphicFramePr>
               <a:graphicFrameLocks noChangeAspect="1"/>
             </wp:cNvGraphicFramePr>
@@ -2081,7 +2111,7 @@
                     <pic:cNvPicPr/>
                   </pic:nvPicPr>
                   <pic:blipFill>
-                    <a:blip r:embed="rId18"/>
+                    <a:blip r:embed="rId19"/>
                     <a:stretch>
                       <a:fillRect/>
                     </a:stretch>
@@ -2264,7 +2294,7 @@
         <w:drawing>
           <wp:inline xmlns:a="http://schemas.openxmlformats.org/drawingml/2006/main" xmlns:pic="http://schemas.openxmlformats.org/drawingml/2006/picture">
             <wp:extent cx="5010912" cy="2666213"/>
-            <wp:docPr id="8" name="Picture 8" descr="Kết quả E2E qua Nginx"/>
+            <wp:docPr id="9" name="Picture 9" descr="Kết quả E2E qua Nginx"/>
             <wp:cNvGraphicFramePr>
               <a:graphicFrameLocks noChangeAspect="1"/>
             </wp:cNvGraphicFramePr>
@@ -2276,7 +2306,7 @@
                     <pic:cNvPicPr/>
                   </pic:nvPicPr>
                   <pic:blipFill>
-                    <a:blip r:embed="rId19"/>
+                    <a:blip r:embed="rId20"/>
                     <a:stretch>
                       <a:fillRect/>
                     </a:stretch>
@@ -2850,7 +2880,7 @@
         <w:drawing>
           <wp:inline xmlns:a="http://schemas.openxmlformats.org/drawingml/2006/main" xmlns:pic="http://schemas.openxmlformats.org/drawingml/2006/picture">
             <wp:extent cx="5724144" cy="3021822"/>
-            <wp:docPr id="9" name="Picture 9" descr="Security headers từ Nginx"/>
+            <wp:docPr id="10" name="Picture 10" descr="Security headers từ Nginx"/>
             <wp:cNvGraphicFramePr>
               <a:graphicFrameLocks noChangeAspect="1"/>
             </wp:cNvGraphicFramePr>
@@ -2862,7 +2892,7 @@
                     <pic:cNvPicPr/>
                   </pic:nvPicPr>
                   <pic:blipFill>
-                    <a:blip r:embed="rId20"/>
+                    <a:blip r:embed="rId21"/>
                     <a:stretch>
                       <a:fillRect/>
                     </a:stretch>
@@ -3158,7 +3188,7 @@
         <w:drawing>
           <wp:inline xmlns:a="http://schemas.openxmlformats.org/drawingml/2006/main" xmlns:pic="http://schemas.openxmlformats.org/drawingml/2006/picture">
             <wp:extent cx="2688336" cy="2016252"/>
-            <wp:docPr id="10" name="Picture 10" descr="Prometheus targets"/>
+            <wp:docPr id="11" name="Picture 11" descr="Prometheus targets"/>
             <wp:cNvGraphicFramePr>
               <a:graphicFrameLocks noChangeAspect="1"/>
             </wp:cNvGraphicFramePr>
@@ -3170,7 +3200,7 @@
                     <pic:cNvPicPr/>
                   </pic:nvPicPr>
                   <pic:blipFill>
-                    <a:blip r:embed="rId21"/>
+                    <a:blip r:embed="rId22"/>
                     <a:stretch>
                       <a:fillRect/>
                     </a:stretch>
@@ -3261,7 +3291,7 @@
         <w:drawing>
           <wp:inline xmlns:a="http://schemas.openxmlformats.org/drawingml/2006/main" xmlns:pic="http://schemas.openxmlformats.org/drawingml/2006/picture">
             <wp:extent cx="2935224" cy="1834515"/>
-            <wp:docPr id="11" name="Picture 11" descr="Truy vấn metric ứng dụng"/>
+            <wp:docPr id="12" name="Picture 12" descr="Truy vấn metric ứng dụng"/>
             <wp:cNvGraphicFramePr>
               <a:graphicFrameLocks noChangeAspect="1"/>
             </wp:cNvGraphicFramePr>
@@ -3273,7 +3303,7 @@
                     <pic:cNvPicPr/>
                   </pic:nvPicPr>
                   <pic:blipFill>
-                    <a:blip r:embed="rId22"/>
+                    <a:blip r:embed="rId23"/>
                     <a:stretch>
                       <a:fillRect/>
                     </a:stretch>
@@ -3348,7 +3378,7 @@
         <w:drawing>
           <wp:inline xmlns:a="http://schemas.openxmlformats.org/drawingml/2006/main" xmlns:pic="http://schemas.openxmlformats.org/drawingml/2006/picture">
             <wp:extent cx="3090672" cy="2266493"/>
-            <wp:docPr id="12" name="Picture 12" descr="Dashboard Grafana"/>
+            <wp:docPr id="13" name="Picture 13" descr="Dashboard Grafana"/>
             <wp:cNvGraphicFramePr>
               <a:graphicFrameLocks noChangeAspect="1"/>
             </wp:cNvGraphicFramePr>
@@ -3360,7 +3390,7 @@
                     <pic:cNvPicPr/>
                   </pic:nvPicPr>
                   <pic:blipFill>
-                    <a:blip r:embed="rId23"/>
+                    <a:blip r:embed="rId24"/>
                     <a:stretch>
                       <a:fillRect/>
                     </a:stretch>
@@ -3646,7 +3676,7 @@
         <w:drawing>
           <wp:inline xmlns:a="http://schemas.openxmlformats.org/drawingml/2006/main" xmlns:pic="http://schemas.openxmlformats.org/drawingml/2006/picture">
             <wp:extent cx="3630168" cy="2662123"/>
-            <wp:docPr id="13" name="Picture 13" descr="Grafana Explore"/>
+            <wp:docPr id="14" name="Picture 14" descr="Grafana Explore"/>
             <wp:cNvGraphicFramePr>
               <a:graphicFrameLocks noChangeAspect="1"/>
             </wp:cNvGraphicFramePr>
@@ -3658,7 +3688,7 @@
                     <pic:cNvPicPr/>
                   </pic:nvPicPr>
                   <pic:blipFill>
-                    <a:blip r:embed="rId24"/>
+                    <a:blip r:embed="rId25"/>
                     <a:stretch>
                       <a:fillRect/>
                     </a:stretch>
@@ -3733,7 +3763,7 @@
         <w:drawing>
           <wp:inline xmlns:a="http://schemas.openxmlformats.org/drawingml/2006/main" xmlns:pic="http://schemas.openxmlformats.org/drawingml/2006/picture">
             <wp:extent cx="4416552" cy="2338446"/>
-            <wp:docPr id="14" name="Picture 14" descr="Kiểm chứng ba truy vấn LogQL"/>
+            <wp:docPr id="15" name="Picture 15" descr="Kiểm chứng ba truy vấn LogQL"/>
             <wp:cNvGraphicFramePr>
               <a:graphicFrameLocks noChangeAspect="1"/>
             </wp:cNvGraphicFramePr>
@@ -3745,7 +3775,7 @@
                     <pic:cNvPicPr/>
                   </pic:nvPicPr>
                   <pic:blipFill>
-                    <a:blip r:embed="rId25"/>
+                    <a:blip r:embed="rId26"/>
                     <a:stretch>
                       <a:fillRect/>
                     </a:stretch>
@@ -3883,7 +3913,7 @@
         <w:drawing>
           <wp:inline xmlns:a="http://schemas.openxmlformats.org/drawingml/2006/main" xmlns:pic="http://schemas.openxmlformats.org/drawingml/2006/picture">
             <wp:extent cx="4562856" cy="2411149"/>
-            <wp:docPr id="15" name="Picture 15" descr="UID và thuộc tính hardening app/Nginx"/>
+            <wp:docPr id="16" name="Picture 16" descr="UID và thuộc tính hardening app/Nginx"/>
             <wp:cNvGraphicFramePr>
               <a:graphicFrameLocks noChangeAspect="1"/>
             </wp:cNvGraphicFramePr>
@@ -3895,7 +3925,7 @@
                     <pic:cNvPicPr/>
                   </pic:nvPicPr>
                   <pic:blipFill>
-                    <a:blip r:embed="rId26"/>
+                    <a:blip r:embed="rId27"/>
                     <a:stretch>
                       <a:fillRect/>
                     </a:stretch>
@@ -4447,7 +4477,7 @@
         <w:drawing>
           <wp:inline xmlns:a="http://schemas.openxmlformats.org/drawingml/2006/main" xmlns:pic="http://schemas.openxmlformats.org/drawingml/2006/picture">
             <wp:extent cx="4535424" cy="2413215"/>
-            <wp:docPr id="16" name="Picture 16" descr="Network, role database và cổng host"/>
+            <wp:docPr id="17" name="Picture 17" descr="Network, role database và cổng host"/>
             <wp:cNvGraphicFramePr>
               <a:graphicFrameLocks noChangeAspect="1"/>
             </wp:cNvGraphicFramePr>
@@ -4459,7 +4489,7 @@
                     <pic:cNvPicPr/>
                   </pic:nvPicPr>
                   <pic:blipFill>
-                    <a:blip r:embed="rId27"/>
+                    <a:blip r:embed="rId28"/>
                     <a:stretch>
                       <a:fillRect/>
                     </a:stretch>
@@ -4634,7 +4664,7 @@
           <w:color w:val="000000"/>
           <w:sz w:val="23"/>
         </w:rPr>
-        <w:t>Bộ Unit/API hiện tại có 13 ca dùng database giả lập; bộ test 13/13 và QA harness 20/20 đã đạt trong phiên kiểm tra code trước. Hình 17 là ảnh chụp của phiên cũ có 12 ca; giữ nguyên ảnh làm minh chứng lịch sử, không dùng nó để khẳng định kết quả 13 ca.</w:t>
+        <w:t>Ảnh Hình 17 ghi kết quả phiên cũ: 12 ca Unit/API dùng database giả lập. Code hiện tại đạt 13/13 Unit/API và QA harness 20/20 trong phiên kiểm tra trước; E2E trang 5 là kiểm tra riêng với PostgreSQL thật.</w:t>
       </w:r>
     </w:p>
     <w:p>
@@ -4647,7 +4677,7 @@
         <w:drawing>
           <wp:inline xmlns:a="http://schemas.openxmlformats.org/drawingml/2006/main" xmlns:pic="http://schemas.openxmlformats.org/drawingml/2006/picture">
             <wp:extent cx="4334256" cy="2301655"/>
-            <wp:docPr id="17" name="Picture 17" descr="Kết quả 12 ca Unit/API ở phiên trước"/>
+            <wp:docPr id="18" name="Picture 18" descr="Kết quả 12 ca Unit/API ở phiên trước"/>
             <wp:cNvGraphicFramePr>
               <a:graphicFrameLocks noChangeAspect="1"/>
             </wp:cNvGraphicFramePr>
@@ -4659,7 +4689,7 @@
                     <pic:cNvPicPr/>
                   </pic:nvPicPr>
                   <pic:blipFill>
-                    <a:blip r:embed="rId28"/>
+                    <a:blip r:embed="rId29"/>
                     <a:stretch>
                       <a:fillRect/>
                     </a:stretch>
@@ -4766,7 +4796,7 @@
         <w:drawing>
           <wp:inline xmlns:a="http://schemas.openxmlformats.org/drawingml/2006/main" xmlns:pic="http://schemas.openxmlformats.org/drawingml/2006/picture">
             <wp:extent cx="3950208" cy="2087408"/>
-            <wp:docPr id="18" name="Picture 18" descr="Kiểm tra persistence qua restart"/>
+            <wp:docPr id="19" name="Picture 19" descr="Kiểm tra persistence qua restart"/>
             <wp:cNvGraphicFramePr>
               <a:graphicFrameLocks noChangeAspect="1"/>
             </wp:cNvGraphicFramePr>
@@ -4778,7 +4808,7 @@
                     <pic:cNvPicPr/>
                   </pic:nvPicPr>
                   <pic:blipFill>
-                    <a:blip r:embed="rId29"/>
+                    <a:blip r:embed="rId30"/>
                     <a:stretch>
                       <a:fillRect/>
                     </a:stretch>
@@ -4824,7 +4854,7 @@
           <w:color w:val="000000"/>
           <w:sz w:val="23"/>
         </w:rPr>
-        <w:t xml:space="preserve">Kết quả runtime Windows mới nhất do người dùng cung cấp: 11 service vận hành, </w:t>
+        <w:t xml:space="preserve">Runtime Windows do người dùng cung cấp: Compose 11 service, </w:t>
       </w:r>
       <w:r>
         <w:rPr>
@@ -4840,7 +4870,7 @@
           <w:color w:val="000000"/>
           <w:sz w:val="23"/>
         </w:rPr>
-        <w:t xml:space="preserve"> exit 0; E2E 8/8 và task ID 28 đã dọn; Loki 3/3 query có dữ liệu; marker persistence ID 29 còn nguyên sau restart rồi được dọn. Cả năm Prometheus jobs UP, </w:t>
+        <w:t xml:space="preserve"> exit 0; E2E 8/8; Loki 3/3; persistence marker ID 29 còn qua restart rồi được dọn; Prometheus 5/5 UP, </w:t>
       </w:r>
       <w:r>
         <w:rPr>
@@ -4872,7 +4902,7 @@
           <w:color w:val="000000"/>
           <w:sz w:val="23"/>
         </w:rPr>
-        <w:t>; Grafana có dữ liệu ở năm panel. Đây là thông tin người dùng báo cáo; ảnh 2–18 vẫn là minh chứng các phiên cũ.</w:t>
+        <w:t>; Grafana có dữ liệu ở 5 panel.</w:t>
       </w:r>
     </w:p>
     <w:p>
@@ -4992,7 +5022,7 @@
         </w:rPr>
         <w:t xml:space="preserve">Tài liệu: </w:t>
       </w:r>
-      <w:hyperlink r:id="rId30">
+      <w:hyperlink r:id="rId31">
         <w:r>
           <w:rPr>
             <w:rFonts w:ascii="Times New Roman" w:hAnsi="Times New Roman" w:eastAsia="Times New Roman"/>
@@ -5009,7 +5039,7 @@
         </w:rPr>
         <w:t xml:space="preserve">; </w:t>
       </w:r>
-      <w:hyperlink r:id="rId31">
+      <w:hyperlink r:id="rId32">
         <w:r>
           <w:rPr>
             <w:rFonts w:ascii="Times New Roman" w:hAnsi="Times New Roman" w:eastAsia="Times New Roman"/>
@@ -5026,7 +5056,7 @@
         </w:rPr>
         <w:t xml:space="preserve">; </w:t>
       </w:r>
-      <w:hyperlink r:id="rId32">
+      <w:hyperlink r:id="rId33">
         <w:r>
           <w:rPr>
             <w:rFonts w:ascii="Times New Roman" w:hAnsi="Times New Roman" w:eastAsia="Times New Roman"/>
@@ -5043,7 +5073,7 @@
         </w:rPr>
         <w:t xml:space="preserve">; </w:t>
       </w:r>
-      <w:hyperlink r:id="rId33">
+      <w:hyperlink r:id="rId34">
         <w:r>
           <w:rPr>
             <w:rFonts w:ascii="Times New Roman" w:hAnsi="Times New Roman" w:eastAsia="Times New Roman"/>
@@ -5060,7 +5090,7 @@
         </w:rPr>
         <w:t xml:space="preserve">; </w:t>
       </w:r>
-      <w:hyperlink r:id="rId34">
+      <w:hyperlink r:id="rId35">
         <w:r>
           <w:rPr>
             <w:rFonts w:ascii="Times New Roman" w:hAnsi="Times New Roman" w:eastAsia="Times New Roman"/>
@@ -5077,7 +5107,7 @@
         </w:rPr>
         <w:t xml:space="preserve">; </w:t>
       </w:r>
-      <w:hyperlink r:id="rId35">
+      <w:hyperlink r:id="rId36">
         <w:r>
           <w:rPr>
             <w:rFonts w:ascii="Times New Roman" w:hAnsi="Times New Roman" w:eastAsia="Times New Roman"/>
@@ -5094,7 +5124,7 @@
         </w:rPr>
         <w:t xml:space="preserve">; </w:t>
       </w:r>
-      <w:hyperlink r:id="rId36">
+      <w:hyperlink r:id="rId37">
         <w:r>
           <w:rPr>
             <w:rFonts w:ascii="Times New Roman" w:hAnsi="Times New Roman" w:eastAsia="Times New Roman"/>
@@ -5120,6 +5150,12 @@
       <w:cols w:space="720"/>
       <w:titlePg/>
       <w:docGrid w:linePitch="360"/>
+      <w:pgBorders w:offsetFrom="page" w:display="firstPage">
+        <w:top w:val="single" w:sz="12" w:space="26" w:color="000000"/>
+        <w:left w:val="single" w:sz="12" w:space="26" w:color="000000"/>
+        <w:bottom w:val="single" w:sz="12" w:space="26" w:color="000000"/>
+        <w:right w:val="single" w:sz="12" w:space="26" w:color="000000"/>
+      </w:pgBorders>
     </w:sectPr>
   </w:body>
 </w:document>

</xml_diff>